<commit_message>
Work on sampling plan
</commit_message>
<xml_diff>
--- a/Projects/Chapter2/solman-sample-regime.docx
+++ b/Projects/Chapter2/solman-sample-regime.docx
@@ -76,10 +76,7 @@
         </w:numPr>
       </w:pPr>
       <w:r>
-        <w:t xml:space="preserve">The distance-decay relationship </w:t>
-      </w:r>
-      <w:r>
-        <w:t>is significantly different between snow and ice microbial communities (active/bulk, abundant/rare).</w:t>
+        <w:t>The distance-decay relationship is significantly different between snow and ice microbial communities (active/bulk, abundant/rare).</w:t>
       </w:r>
     </w:p>
     <w:p>
@@ -91,13 +88,7 @@
         </w:numPr>
       </w:pPr>
       <w:r>
-        <w:t xml:space="preserve">Community </w:t>
-      </w:r>
-      <w:r>
-        <w:t xml:space="preserve">assembly mechanisms are </w:t>
-      </w:r>
-      <w:r>
-        <w:t>significantly different between snow and ice microbial communities (active/bulk, abundant/rare).</w:t>
+        <w:t>Community assembly mechanisms are significantly different between snow and ice microbial communities (active/bulk, abundant/rare).</w:t>
       </w:r>
     </w:p>
     <w:p>
@@ -1413,9 +1404,10 @@
         <w:tblLook w:val="04A0" w:firstRow="1" w:lastRow="0" w:firstColumn="1" w:lastColumn="0" w:noHBand="0" w:noVBand="1"/>
       </w:tblPr>
       <w:tblGrid>
-        <w:gridCol w:w="1843"/>
-        <w:gridCol w:w="6096"/>
-        <w:gridCol w:w="2189"/>
+        <w:gridCol w:w="1741"/>
+        <w:gridCol w:w="3216"/>
+        <w:gridCol w:w="7207"/>
+        <w:gridCol w:w="1786"/>
       </w:tblGrid>
       <w:tr>
         <w:trPr>
@@ -1435,20 +1427,33 @@
         </w:tc>
         <w:tc>
           <w:tcPr>
-            <w:tcW w:w="6096" w:type="dxa"/>
+            <w:tcW w:w="3216" w:type="dxa"/>
           </w:tcPr>
           <w:p>
             <w:pPr>
               <w:cnfStyle w:val="100000000000" w:firstRow="1" w:lastRow="0" w:firstColumn="0" w:lastColumn="0" w:oddVBand="0" w:evenVBand="0" w:oddHBand="0" w:evenHBand="0" w:firstRowFirstColumn="0" w:firstRowLastColumn="0" w:lastRowFirstColumn="0" w:lastRowLastColumn="0"/>
             </w:pPr>
             <w:r>
+              <w:t>Rationale</w:t>
+            </w:r>
+          </w:p>
+        </w:tc>
+        <w:tc>
+          <w:tcPr>
+            <w:tcW w:w="7207" w:type="dxa"/>
+          </w:tcPr>
+          <w:p>
+            <w:pPr>
+              <w:cnfStyle w:val="100000000000" w:firstRow="1" w:lastRow="0" w:firstColumn="0" w:lastColumn="0" w:oddVBand="0" w:evenVBand="0" w:oddHBand="0" w:evenHBand="0" w:firstRowFirstColumn="0" w:firstRowLastColumn="0" w:lastRowFirstColumn="0" w:lastRowLastColumn="0"/>
+            </w:pPr>
+            <w:r>
               <w:t>Levels</w:t>
             </w:r>
           </w:p>
         </w:tc>
         <w:tc>
           <w:tcPr>
-            <w:tcW w:w="2189" w:type="dxa"/>
+            <w:tcW w:w="0" w:type="auto"/>
           </w:tcPr>
           <w:p>
             <w:pPr>
@@ -1478,7 +1483,17 @@
         </w:tc>
         <w:tc>
           <w:tcPr>
-            <w:tcW w:w="6096" w:type="dxa"/>
+            <w:tcW w:w="3216" w:type="dxa"/>
+          </w:tcPr>
+          <w:p>
+            <w:pPr>
+              <w:cnfStyle w:val="000000100000" w:firstRow="0" w:lastRow="0" w:firstColumn="0" w:lastColumn="0" w:oddVBand="0" w:evenVBand="0" w:oddHBand="1" w:evenHBand="0" w:firstRowFirstColumn="0" w:firstRowLastColumn="0" w:lastRowFirstColumn="0" w:lastRowLastColumn="0"/>
+            </w:pPr>
+          </w:p>
+        </w:tc>
+        <w:tc>
+          <w:tcPr>
+            <w:tcW w:w="7207" w:type="dxa"/>
           </w:tcPr>
           <w:p>
             <w:pPr>
@@ -1491,7 +1506,7 @@
         </w:tc>
         <w:tc>
           <w:tcPr>
-            <w:tcW w:w="2189" w:type="dxa"/>
+            <w:tcW w:w="0" w:type="auto"/>
           </w:tcPr>
           <w:p>
             <w:pPr>
@@ -1517,20 +1532,57 @@
         </w:tc>
         <w:tc>
           <w:tcPr>
-            <w:tcW w:w="6096" w:type="dxa"/>
+            <w:tcW w:w="3216" w:type="dxa"/>
           </w:tcPr>
           <w:p>
             <w:pPr>
               <w:cnfStyle w:val="000000000000" w:firstRow="0" w:lastRow="0" w:firstColumn="0" w:lastColumn="0" w:oddVBand="0" w:evenVBand="0" w:oddHBand="0" w:evenHBand="0" w:firstRowFirstColumn="0" w:firstRowLastColumn="0" w:lastRowFirstColumn="0" w:lastRowLastColumn="0"/>
             </w:pPr>
             <w:r>
+              <w:t>Elevation may impact temperature or snow cover</w:t>
+            </w:r>
+            <w:r>
+              <w:t xml:space="preserve">, and thus impact community assembly </w:t>
+            </w:r>
+            <w:r>
+              <w:fldChar w:fldCharType="begin" w:fldLock="1"/>
+            </w:r>
+            <w:r>
+              <w:instrText>ADDIN CSL_CITATION {"citationItems":[{"id":"ITEM-1","itemData":{"DOI":"10.1007/s00300-003-0580-2","ISSN":"07224060","abstract":"The cylindrical meltholes present in the ablation zones of many glaciers (termed cryoconite holes) contain complex microbial communities. A canonical correspondence analysis (CCA) of community structure and environmental gradients for cryoconite holes on two glaciers was undertaken. The Canada Glacier (77°37′S, 162°55′E) is located in the McMurdo Dry Valleys of Antarctica. The White Glacier (79°27′N, 90°40′W) is located on Axel Heiberg Island, Nunavut Territory, Canada. These glaciers are at similar, yet antipodal latitudes, are roughly the same size and endure approximately the same mean annual temperature. The Canada Glacier cryoconite communities were found to be significantly (P = 0-001) associated with six environmental variables, which together explained 55% of the biological variation. The White Glacier cryoconite communities were not significantly associated with environmental variables. The differences in CCA results were attributed to the relative amount of disturbance and isolation between each glacier's cryoconite holes. Canada Glacier cryoconite holes were mostly ice-covered and undisturbed by meltwater flow, whereas high meltwater production and open cryoconite holes on the White Glacier may continually reset the community structure and habitat variability due to inter-hole mixing.","author":[{"dropping-particle":"","family":"Mueller","given":"D. R.","non-dropping-particle":"","parse-names":false,"suffix":""},{"dropping-particle":"","family":"Pollard","given":"W. H.","non-dropping-particle":"","parse-names":false,"suffix":""}],"container-title":"Polar Biology","id":"ITEM-1","issue":"2","issued":{"date-parts":[["2004"]]},"page":"66-74","title":"Gradient analysis of cryoconite ecosystems from two polar glaciers","type":"article-journal","volume":"27"},"uris":["http://www.mendeley.com/documents/?uuid=37e49be0-fc5c-4590-bcef-c909fa1f95eb"]}],"mendeley":{"formattedCitation":"(Mueller and Pollard, 2004)","plainTextFormattedCitation":"(Mueller and Pollard, 2004)","previouslyFormattedCitation":"(Mueller and Pollard, 2004)"},"properties":{"noteIndex":0},"schema":"https://github.com/citation-style-language/schema/raw/master/csl-citation.json"}</w:instrText>
+            </w:r>
+            <w:r>
+              <w:fldChar w:fldCharType="separate"/>
+            </w:r>
+            <w:r>
+              <w:rPr>
+                <w:noProof/>
+              </w:rPr>
+              <w:t>(Mueller and Pollard, 2004)</w:t>
+            </w:r>
+            <w:r>
+              <w:fldChar w:fldCharType="end"/>
+            </w:r>
+            <w:r>
+              <w:t>.</w:t>
+            </w:r>
+          </w:p>
+        </w:tc>
+        <w:tc>
+          <w:tcPr>
+            <w:tcW w:w="7207" w:type="dxa"/>
+          </w:tcPr>
+          <w:p>
+            <w:pPr>
+              <w:cnfStyle w:val="000000000000" w:firstRow="0" w:lastRow="0" w:firstColumn="0" w:lastColumn="0" w:oddVBand="0" w:evenVBand="0" w:oddHBand="0" w:evenHBand="0" w:firstRowFirstColumn="0" w:firstRowLastColumn="0" w:lastRowFirstColumn="0" w:lastRowLastColumn="0"/>
+            </w:pPr>
+            <w:r>
               <w:t>NA</w:t>
             </w:r>
           </w:p>
         </w:tc>
         <w:tc>
           <w:tcPr>
-            <w:tcW w:w="2189" w:type="dxa"/>
+            <w:tcW w:w="0" w:type="auto"/>
           </w:tcPr>
           <w:p>
             <w:pPr>
@@ -1557,7 +1609,44 @@
         </w:tc>
         <w:tc>
           <w:tcPr>
-            <w:tcW w:w="6096" w:type="dxa"/>
+            <w:tcW w:w="3216" w:type="dxa"/>
+          </w:tcPr>
+          <w:p>
+            <w:pPr>
+              <w:cnfStyle w:val="000000100000" w:firstRow="0" w:lastRow="0" w:firstColumn="0" w:lastColumn="0" w:oddVBand="0" w:evenVBand="0" w:oddHBand="1" w:evenHBand="0" w:firstRowFirstColumn="0" w:firstRowLastColumn="0" w:lastRowFirstColumn="0" w:lastRowLastColumn="0"/>
+            </w:pPr>
+            <w:r>
+              <w:t>Temperature regulate</w:t>
+            </w:r>
+            <w:r>
+              <w:t xml:space="preserve">s microorganismal development </w:t>
+            </w:r>
+            <w:r>
+              <w:fldChar w:fldCharType="begin" w:fldLock="1"/>
+            </w:r>
+            <w:r>
+              <w:instrText>ADDIN CSL_CITATION {"citationItems":[{"id":"ITEM-1","itemData":{"DOI":"10.1016/j.scitotenv.2020.143178","ISSN":"18791026","abstract":"Community assembly processes are important in structuring aquatic microbial communities; however, the influence of these processes on the dynamics of bacterial communities in glacial streams and lakes remains largely unstudied. To investigate the assembly processes underlying the temporal variation of the bacterial community, we collected 50 water samples over five months in an ephemeral glacial stream and its downstream lake at the terminus of the Qiangyong glacier on the Tibetan Plateau. Using the V4 hypervariable region of the bacterial 16S rRNA gene combined with environmental measurements, such as water temperature, pH, total nitrogen (TN), dissolved organic carbon (DOC) and water conductivity, we found that temporal variation in the environmental factors promoted the shift in the proglacial stream and the lake bacterial communities. The quantification of ecological processes showed that the stream microbial communities were influenced by the ecological drift (40%) in June, then changed to homogeneous selection (40%) in July and variable selection (60%) in September, while the dynamic pattern of proglacial lake bacterioplankton was governed by homogeneous selection (≥ 50%) over the time. Overall, the dynamic of bacterial community in the proglacial stream and lake water is influenced by environmental factors, and the community composition assembly of the Qiangyong glacial stream and lake could be dynamic and primarily governed by deterministic processes.","author":[{"dropping-particle":"","family":"Gu","given":"Zhengquan","non-dropping-particle":"","parse-names":false,"suffix":""},{"dropping-particle":"","family":"Liu","given":"Keshao","non-dropping-particle":"","parse-names":false,"suffix":""},{"dropping-particle":"","family":"Pedersen","given":"Mikkel Winther","non-dropping-particle":"","parse-names":false,"suffix":""},{"dropping-particle":"","family":"Wang","given":"Feng","non-dropping-particle":"","parse-names":false,"suffix":""},{"dropping-particle":"","family":"Chen","given":"Yuying","non-dropping-particle":"","parse-names":false,"suffix":""},{"dropping-particle":"","family":"Zeng","given":"Chen","non-dropping-particle":"","parse-names":false,"suffix":""},{"dropping-particle":"","family":"Liu","given":"Yongqin","non-dropping-particle":"","parse-names":false,"suffix":""}],"container-title":"Science of the Total Environment","id":"ITEM-1","issue":"xxxx","issued":{"date-parts":[["2020"]]},"page":"143178","publisher":"Elsevier B.V.","title":"Community assembly processes underlying the temporal dynamics of glacial stream and lake bacterial communities","type":"article-journal"},"uris":["http://www.mendeley.com/documents/?uuid=a89113b5-2f54-45ab-b54f-f344b2789520"]}],"mendeley":{"formattedCitation":"(Gu et al., 2020)","plainTextFormattedCitation":"(Gu et al., 2020)","previouslyFormattedCitation":"(Gu et al., 2020)"},"properties":{"noteIndex":0},"schema":"https://github.com/citation-style-language/schema/raw/master/csl-citation.json"}</w:instrText>
+            </w:r>
+            <w:r>
+              <w:fldChar w:fldCharType="separate"/>
+            </w:r>
+            <w:r>
+              <w:rPr>
+                <w:noProof/>
+              </w:rPr>
+              <w:t>(Gu et al., 2020)</w:t>
+            </w:r>
+            <w:r>
+              <w:fldChar w:fldCharType="end"/>
+            </w:r>
+            <w:r>
+              <w:t>.</w:t>
+            </w:r>
+          </w:p>
+        </w:tc>
+        <w:tc>
+          <w:tcPr>
+            <w:tcW w:w="7207" w:type="dxa"/>
           </w:tcPr>
           <w:p>
             <w:pPr>
@@ -1594,7 +1683,7 @@
         </w:tc>
         <w:tc>
           <w:tcPr>
-            <w:tcW w:w="2189" w:type="dxa"/>
+            <w:tcW w:w="0" w:type="auto"/>
           </w:tcPr>
           <w:p>
             <w:pPr>
@@ -1620,12 +1709,22 @@
         </w:tc>
         <w:tc>
           <w:tcPr>
-            <w:tcW w:w="6096" w:type="dxa"/>
+            <w:tcW w:w="3216" w:type="dxa"/>
           </w:tcPr>
           <w:p>
             <w:pPr>
               <w:cnfStyle w:val="000000000000" w:firstRow="0" w:lastRow="0" w:firstColumn="0" w:lastColumn="0" w:oddVBand="0" w:evenVBand="0" w:oddHBand="0" w:evenHBand="0" w:firstRowFirstColumn="0" w:firstRowLastColumn="0" w:lastRowFirstColumn="0" w:lastRowLastColumn="0"/>
             </w:pPr>
+          </w:p>
+        </w:tc>
+        <w:tc>
+          <w:tcPr>
+            <w:tcW w:w="7207" w:type="dxa"/>
+          </w:tcPr>
+          <w:p>
+            <w:pPr>
+              <w:cnfStyle w:val="000000000000" w:firstRow="0" w:lastRow="0" w:firstColumn="0" w:lastColumn="0" w:oddVBand="0" w:evenVBand="0" w:oddHBand="0" w:evenHBand="0" w:firstRowFirstColumn="0" w:firstRowLastColumn="0" w:lastRowFirstColumn="0" w:lastRowLastColumn="0"/>
+            </w:pPr>
             <w:r>
               <w:t xml:space="preserve">Snow: 5.68-8.07 </w:t>
             </w:r>
@@ -1720,6 +1819,7 @@
               <w:cnfStyle w:val="000000000000" w:firstRow="0" w:lastRow="0" w:firstColumn="0" w:lastColumn="0" w:oddVBand="0" w:evenVBand="0" w:oddHBand="0" w:evenHBand="0" w:firstRowFirstColumn="0" w:firstRowLastColumn="0" w:lastRowFirstColumn="0" w:lastRowLastColumn="0"/>
             </w:pPr>
             <w:r>
+              <w:lastRenderedPageBreak/>
               <w:t xml:space="preserve">Snow: 7.64 </w:t>
             </w:r>
             <w:r>
@@ -1764,7 +1864,7 @@
               <w:rPr>
                 <w:vertAlign w:val="superscript"/>
               </w:rPr>
-              <w:instrText>ADDIN CSL_CITATION {"citationItems":[{"id":"ITEM-1","itemData":{"DOI":"10.1038/s41467-020-20627-w","ISSN":"20411723","abstract":"Melting of the Greenland Ice Sheet is a leading cause of land-ice mass loss and cryosphere-attributed sea level rise. Blooms of pigmented glacier ice algae lower ice albedo and accelerate surface melting in the ice sheet’s southwest sector. Although glacier ice algae cause up to 13% of the surface melting in this region, the controls on bloom development remain poorly understood. Here we show a direct link between mineral phosphorus in surface ice and glacier ice algae biomass through the quantification of solid and fluid phase phosphorus reservoirs in surface habitats across the southwest ablation zone of the ice sheet. We demonstrate that nutrients from mineral dust likely drive glacier ice algal growth, and thereby identify mineral dust as a secondary control on ice sheet melting.","author":[{"dropping-particle":"","family":"McCutcheon","given":"Jenine","non-dropping-particle":"","parse-names":false,"suffix":""},{"dropping-particle":"","family":"Lutz","given":"Stefanie","non-dropping-particle":"","parse-names":false,"suffix":""},{"dropping-particle":"","family":"Williamson","given":"Christopher","non-dropping-particle":"","parse-names":false,"suffix":""},{"dropping-particle":"","family":"Cook","given":"Joseph M.","non-dropping-particle":"","parse-names":false,"suffix":""},{"dropping-particle":"","family":"Tedstone","given":"Andrew J.","non-dropping-particle":"","parse-names":false,"suffix":""},{"dropping-particle":"","family":"Vanderstraeten","given":"Aubry","non-dropping-particle":"","parse-names":false,"suffix":""},{"dropping-particle":"","family":"Wilson","given":"Siobhan A.","non-dropping-particle":"","parse-names":false,"suffix":""},{"dropping-particle":"","family":"Stockdale","given":"Anthony","non-dropping-particle":"","parse-names":false,"suffix":""},{"dropping-particle":"","family":"Bonneville","given":"Steeve","non-dropping-particle":"","parse-names":false,"suffix":""},{"dropping-particle":"","family":"Anesio","given":"Alexandre M.","non-dropping-particle":"","parse-names":false,"suffix":""},{"dropping-particle":"","family":"Yallop","given":"Marian L.","non-dropping-particle":"","parse-names":false,"suffix":""},{"dropping-particle":"","family":"McQuaid","given":"James B.","non-dropping-particle":"","parse-names":false,"suffix":""},{"dropping-particle":"","family":"Tranter","given":"Martyn","non-dropping-particle":"","parse-names":false,"suffix":""},{"dropping-particle":"","family":"Benning","given":"Liane G.","non-dropping-particle":"","parse-names":false,"suffix":""}],"container-title":"Nature Communications","id":"ITEM-1","issue":"1","issued":{"date-parts":[["2021"]]},"page":"1-11","publisher":"Springer US","title":"Mineral phosphorus drives glacier algal blooms on the Greenland Ice Sheet","type":"article-journal","volume":"12"},"uris":["http://www.mendeley.com/documents/?uuid=48651b01-3d31-491b-b6cf-d3e21f9151d9"]}],"mendeley":{"formattedCitation":"(McCutcheon et al., 2021)","plainTextFormattedCitation":"(McCutcheon et al., 2021)"},"properties":{"noteIndex":0},"schema":"https://github.com/citation-style-language/schema/raw/master/csl-citation.json"}</w:instrText>
+              <w:instrText>ADDIN CSL_CITATION {"citationItems":[{"id":"ITEM-1","itemData":{"DOI":"10.1038/s41467-020-20627-w","ISSN":"20411723","abstract":"Melting of the Greenland Ice Sheet is a leading cause of land-ice mass loss and cryosphere-attributed sea level rise. Blooms of pigmented glacier ice algae lower ice albedo and accelerate surface melting in the ice sheet’s southwest sector. Although glacier ice algae cause up to 13% of the surface melting in this region, the controls on bloom development remain poorly understood. Here we show a direct link between mineral phosphorus in surface ice and glacier ice algae biomass through the quantification of solid and fluid phase phosphorus reservoirs in surface habitats across the southwest ablation zone of the ice sheet. We demonstrate that nutrients from mineral dust likely drive glacier ice algal growth, and thereby identify mineral dust as a secondary control on ice sheet melting.","author":[{"dropping-particle":"","family":"McCutcheon","given":"Jenine","non-dropping-particle":"","parse-names":false,"suffix":""},{"dropping-particle":"","family":"Lutz","given":"Stefanie","non-dropping-particle":"","parse-names":false,"suffix":""},{"dropping-particle":"","family":"Williamson","given":"Christopher","non-dropping-particle":"","parse-names":false,"suffix":""},{"dropping-particle":"","family":"Cook","given":"Joseph M.","non-dropping-particle":"","parse-names":false,"suffix":""},{"dropping-particle":"","family":"Tedstone","given":"Andrew J.","non-dropping-particle":"","parse-names":false,"suffix":""},{"dropping-particle":"","family":"Vanderstraeten","given":"Aubry","non-dropping-particle":"","parse-names":false,"suffix":""},{"dropping-particle":"","family":"Wilson","given":"Siobhan A.","non-dropping-particle":"","parse-names":false,"suffix":""},{"dropping-particle":"","family":"Stockdale","given":"Anthony","non-dropping-particle":"","parse-names":false,"suffix":""},{"dropping-particle":"","family":"Bonneville","given":"Steeve","non-dropping-particle":"","parse-names":false,"suffix":""},{"dropping-particle":"","family":"Anesio","given":"Alexandre M.","non-dropping-particle":"","parse-names":false,"suffix":""},{"dropping-particle":"","family":"Yallop","given":"Marian L.","non-dropping-particle":"","parse-names":false,"suffix":""},{"dropping-particle":"","family":"McQuaid","given":"James B.","non-dropping-particle":"","parse-names":false,"suffix":""},{"dropping-particle":"","family":"Tranter","given":"Martyn","non-dropping-particle":"","parse-names":false,"suffix":""},{"dropping-particle":"","family":"Benning","given":"Liane G.","non-dropping-particle":"","parse-names":false,"suffix":""}],"container-title":"Nature Communications","id":"ITEM-1","issue":"1","issued":{"date-parts":[["2021"]]},"page":"1-11","publisher":"Springer US","title":"Mineral phosphorus drives glacier algal blooms on the Greenland Ice Sheet","type":"article-journal","volume":"12"},"uris":["http://www.mendeley.com/documents/?uuid=48651b01-3d31-491b-b6cf-d3e21f9151d9"]}],"mendeley":{"formattedCitation":"(McCutcheon et al., 2021)","plainTextFormattedCitation":"(McCutcheon et al., 2021)","previouslyFormattedCitation":"(McCutcheon et al., 2021)"},"properties":{"noteIndex":0},"schema":"https://github.com/citation-style-language/schema/raw/master/csl-citation.json"}</w:instrText>
             </w:r>
             <w:r>
               <w:rPr>
@@ -1793,13 +1893,14 @@
         </w:tc>
         <w:tc>
           <w:tcPr>
-            <w:tcW w:w="2189" w:type="dxa"/>
+            <w:tcW w:w="0" w:type="auto"/>
           </w:tcPr>
           <w:p>
             <w:pPr>
               <w:cnfStyle w:val="000000000000" w:firstRow="0" w:lastRow="0" w:firstColumn="0" w:lastColumn="0" w:oddVBand="0" w:evenVBand="0" w:oddHBand="0" w:evenHBand="0" w:firstRowFirstColumn="0" w:firstRowLastColumn="0" w:lastRowFirstColumn="0" w:lastRowLastColumn="0"/>
             </w:pPr>
             <w:r>
+              <w:lastRenderedPageBreak/>
               <w:t>pH meter</w:t>
             </w:r>
           </w:p>
@@ -1823,7 +1924,38 @@
         </w:tc>
         <w:tc>
           <w:tcPr>
-            <w:tcW w:w="6096" w:type="dxa"/>
+            <w:tcW w:w="3216" w:type="dxa"/>
+          </w:tcPr>
+          <w:p>
+            <w:pPr>
+              <w:cnfStyle w:val="000000100000" w:firstRow="0" w:lastRow="0" w:firstColumn="0" w:lastColumn="0" w:oddVBand="0" w:evenVBand="0" w:oddHBand="1" w:evenHBand="0" w:firstRowFirstColumn="0" w:firstRowLastColumn="0" w:lastRowFirstColumn="0" w:lastRowLastColumn="0"/>
+            </w:pPr>
+            <w:r>
+              <w:t xml:space="preserve">Total dissolved salts may limit microbial survival </w:t>
+            </w:r>
+            <w:r>
+              <w:fldChar w:fldCharType="begin" w:fldLock="1"/>
+            </w:r>
+            <w:r>
+              <w:instrText>ADDIN CSL_CITATION {"citationItems":[{"id":"ITEM-1","itemData":{"DOI":"10.1016/j.scitotenv.2020.143178","ISSN":"18791026","abstract":"Community assembly processes are important in structuring aquatic microbial communities; however, the influence of these processes on the dynamics of bacterial communities in glacial streams and lakes remains largely unstudied. To investigate the assembly processes underlying the temporal variation of the bacterial community, we collected 50 water samples over five months in an ephemeral glacial stream and its downstream lake at the terminus of the Qiangyong glacier on the Tibetan Plateau. Using the V4 hypervariable region of the bacterial 16S rRNA gene combined with environmental measurements, such as water temperature, pH, total nitrogen (TN), dissolved organic carbon (DOC) and water conductivity, we found that temporal variation in the environmental factors promoted the shift in the proglacial stream and the lake bacterial communities. The quantification of ecological processes showed that the stream microbial communities were influenced by the ecological drift (40%) in June, then changed to homogeneous selection (40%) in July and variable selection (60%) in September, while the dynamic pattern of proglacial lake bacterioplankton was governed by homogeneous selection (≥ 50%) over the time. Overall, the dynamic of bacterial community in the proglacial stream and lake water is influenced by environmental factors, and the community composition assembly of the Qiangyong glacial stream and lake could be dynamic and primarily governed by deterministic processes.","author":[{"dropping-particle":"","family":"Gu","given":"Zhengquan","non-dropping-particle":"","parse-names":false,"suffix":""},{"dropping-particle":"","family":"Liu","given":"Keshao","non-dropping-particle":"","parse-names":false,"suffix":""},{"dropping-particle":"","family":"Pedersen","given":"Mikkel Winther","non-dropping-particle":"","parse-names":false,"suffix":""},{"dropping-particle":"","family":"Wang","given":"Feng","non-dropping-particle":"","parse-names":false,"suffix":""},{"dropping-particle":"","family":"Chen","given":"Yuying","non-dropping-particle":"","parse-names":false,"suffix":""},{"dropping-particle":"","family":"Zeng","given":"Chen","non-dropping-particle":"","parse-names":false,"suffix":""},{"dropping-particle":"","family":"Liu","given":"Yongqin","non-dropping-particle":"","parse-names":false,"suffix":""}],"container-title":"Science of the Total Environment","id":"ITEM-1","issue":"xxxx","issued":{"date-parts":[["2020"]]},"page":"143178","publisher":"Elsevier B.V.","title":"Community assembly processes underlying the temporal dynamics of glacial stream and lake bacterial communities","type":"article-journal"},"uris":["http://www.mendeley.com/documents/?uuid=a89113b5-2f54-45ab-b54f-f344b2789520"]}],"mendeley":{"formattedCitation":"(Gu et al., 2020)","plainTextFormattedCitation":"(Gu et al., 2020)","previouslyFormattedCitation":"(Gu et al., 2020)"},"properties":{"noteIndex":0},"schema":"https://github.com/citation-style-language/schema/raw/master/csl-citation.json"}</w:instrText>
+            </w:r>
+            <w:r>
+              <w:fldChar w:fldCharType="separate"/>
+            </w:r>
+            <w:r>
+              <w:rPr>
+                <w:noProof/>
+              </w:rPr>
+              <w:t>(Gu et al., 2020)</w:t>
+            </w:r>
+            <w:r>
+              <w:fldChar w:fldCharType="end"/>
+            </w:r>
+          </w:p>
+        </w:tc>
+        <w:tc>
+          <w:tcPr>
+            <w:tcW w:w="7207" w:type="dxa"/>
           </w:tcPr>
           <w:p>
             <w:pPr>
@@ -1989,7 +2121,7 @@
               <w:rPr>
                 <w:vertAlign w:val="superscript"/>
               </w:rPr>
-              <w:instrText>ADDIN CSL_CITATION {"citationItems":[{"id":"ITEM-1","itemData":{"DOI":"10.1038/s41467-020-20627-w","ISSN":"20411723","abstract":"Melting of the Greenland Ice Sheet is a leading cause of land-ice mass loss and cryosphere-attributed sea level rise. Blooms of pigmented glacier ice algae lower ice albedo and accelerate surface melting in the ice sheet’s southwest sector. Although glacier ice algae cause up to 13% of the surface melting in this region, the controls on bloom development remain poorly understood. Here we show a direct link between mineral phosphorus in surface ice and glacier ice algae biomass through the quantification of solid and fluid phase phosphorus reservoirs in surface habitats across the southwest ablation zone of the ice sheet. We demonstrate that nutrients from mineral dust likely drive glacier ice algal growth, and thereby identify mineral dust as a secondary control on ice sheet melting.","author":[{"dropping-particle":"","family":"McCutcheon","given":"Jenine","non-dropping-particle":"","parse-names":false,"suffix":""},{"dropping-particle":"","family":"Lutz","given":"Stefanie","non-dropping-particle":"","parse-names":false,"suffix":""},{"dropping-particle":"","family":"Williamson","given":"Christopher","non-dropping-particle":"","parse-names":false,"suffix":""},{"dropping-particle":"","family":"Cook","given":"Joseph M.","non-dropping-particle":"","parse-names":false,"suffix":""},{"dropping-particle":"","family":"Tedstone","given":"Andrew J.","non-dropping-particle":"","parse-names":false,"suffix":""},{"dropping-particle":"","family":"Vanderstraeten","given":"Aubry","non-dropping-particle":"","parse-names":false,"suffix":""},{"dropping-particle":"","family":"Wilson","given":"Siobhan A.","non-dropping-particle":"","parse-names":false,"suffix":""},{"dropping-particle":"","family":"Stockdale","given":"Anthony","non-dropping-particle":"","parse-names":false,"suffix":""},{"dropping-particle":"","family":"Bonneville","given":"Steeve","non-dropping-particle":"","parse-names":false,"suffix":""},{"dropping-particle":"","family":"Anesio","given":"Alexandre M.","non-dropping-particle":"","parse-names":false,"suffix":""},{"dropping-particle":"","family":"Yallop","given":"Marian L.","non-dropping-particle":"","parse-names":false,"suffix":""},{"dropping-particle":"","family":"McQuaid","given":"James B.","non-dropping-particle":"","parse-names":false,"suffix":""},{"dropping-particle":"","family":"Tranter","given":"Martyn","non-dropping-particle":"","parse-names":false,"suffix":""},{"dropping-particle":"","family":"Benning","given":"Liane G.","non-dropping-particle":"","parse-names":false,"suffix":""}],"container-title":"Nature Communications","id":"ITEM-1","issue":"1","issued":{"date-parts":[["2021"]]},"page":"1-11","publisher":"Springer US","title":"Mineral phosphorus drives glacier algal blooms on the Greenland Ice Sheet","type":"article-journal","volume":"12"},"uris":["http://www.mendeley.com/documents/?uuid=48651b01-3d31-491b-b6cf-d3e21f9151d9"]}],"mendeley":{"formattedCitation":"(McCutcheon et al., 2021)","plainTextFormattedCitation":"(McCutcheon et al., 2021)"},"properties":{"noteIndex":0},"schema":"https://github.com/citation-style-language/schema/raw/master/csl-citation.json"}</w:instrText>
+              <w:instrText>ADDIN CSL_CITATION {"citationItems":[{"id":"ITEM-1","itemData":{"DOI":"10.1038/s41467-020-20627-w","ISSN":"20411723","abstract":"Melting of the Greenland Ice Sheet is a leading cause of land-ice mass loss and cryosphere-attributed sea level rise. Blooms of pigmented glacier ice algae lower ice albedo and accelerate surface melting in the ice sheet’s southwest sector. Although glacier ice algae cause up to 13% of the surface melting in this region, the controls on bloom development remain poorly understood. Here we show a direct link between mineral phosphorus in surface ice and glacier ice algae biomass through the quantification of solid and fluid phase phosphorus reservoirs in surface habitats across the southwest ablation zone of the ice sheet. We demonstrate that nutrients from mineral dust likely drive glacier ice algal growth, and thereby identify mineral dust as a secondary control on ice sheet melting.","author":[{"dropping-particle":"","family":"McCutcheon","given":"Jenine","non-dropping-particle":"","parse-names":false,"suffix":""},{"dropping-particle":"","family":"Lutz","given":"Stefanie","non-dropping-particle":"","parse-names":false,"suffix":""},{"dropping-particle":"","family":"Williamson","given":"Christopher","non-dropping-particle":"","parse-names":false,"suffix":""},{"dropping-particle":"","family":"Cook","given":"Joseph M.","non-dropping-particle":"","parse-names":false,"suffix":""},{"dropping-particle":"","family":"Tedstone","given":"Andrew J.","non-dropping-particle":"","parse-names":false,"suffix":""},{"dropping-particle":"","family":"Vanderstraeten","given":"Aubry","non-dropping-particle":"","parse-names":false,"suffix":""},{"dropping-particle":"","family":"Wilson","given":"Siobhan A.","non-dropping-particle":"","parse-names":false,"suffix":""},{"dropping-particle":"","family":"Stockdale","given":"Anthony","non-dropping-particle":"","parse-names":false,"suffix":""},{"dropping-particle":"","family":"Bonneville","given":"Steeve","non-dropping-particle":"","parse-names":false,"suffix":""},{"dropping-particle":"","family":"Anesio","given":"Alexandre M.","non-dropping-particle":"","parse-names":false,"suffix":""},{"dropping-particle":"","family":"Yallop","given":"Marian L.","non-dropping-particle":"","parse-names":false,"suffix":""},{"dropping-particle":"","family":"McQuaid","given":"James B.","non-dropping-particle":"","parse-names":false,"suffix":""},{"dropping-particle":"","family":"Tranter","given":"Martyn","non-dropping-particle":"","parse-names":false,"suffix":""},{"dropping-particle":"","family":"Benning","given":"Liane G.","non-dropping-particle":"","parse-names":false,"suffix":""}],"container-title":"Nature Communications","id":"ITEM-1","issue":"1","issued":{"date-parts":[["2021"]]},"page":"1-11","publisher":"Springer US","title":"Mineral phosphorus drives glacier algal blooms on the Greenland Ice Sheet","type":"article-journal","volume":"12"},"uris":["http://www.mendeley.com/documents/?uuid=48651b01-3d31-491b-b6cf-d3e21f9151d9"]}],"mendeley":{"formattedCitation":"(McCutcheon et al., 2021)","plainTextFormattedCitation":"(McCutcheon et al., 2021)","previouslyFormattedCitation":"(McCutcheon et al., 2021)"},"properties":{"noteIndex":0},"schema":"https://github.com/citation-style-language/schema/raw/master/csl-citation.json"}</w:instrText>
             </w:r>
             <w:r>
               <w:rPr>
@@ -2009,13 +2141,11 @@
               </w:rPr>
               <w:fldChar w:fldCharType="end"/>
             </w:r>
-            <w:bookmarkStart w:id="0" w:name="_GoBack"/>
-            <w:bookmarkEnd w:id="0"/>
-          </w:p>
-        </w:tc>
-        <w:tc>
-          <w:tcPr>
-            <w:tcW w:w="2189" w:type="dxa"/>
+          </w:p>
+        </w:tc>
+        <w:tc>
+          <w:tcPr>
+            <w:tcW w:w="0" w:type="auto"/>
           </w:tcPr>
           <w:p>
             <w:pPr>
@@ -2031,6 +2161,258 @@
     <w:p/>
     <w:p>
       <w:pPr>
+        <w:rPr>
+          <w:rFonts w:ascii="Calibri" w:eastAsia="Times New Roman" w:hAnsi="Calibri" w:cs="Calibri"/>
+          <w:color w:val="000000"/>
+        </w:rPr>
+      </w:pPr>
+      <w:r>
+        <w:rPr>
+          <w:rFonts w:ascii="Calibri" w:eastAsia="Times New Roman" w:hAnsi="Calibri" w:cs="Calibri"/>
+          <w:color w:val="000000"/>
+        </w:rPr>
+        <w:t>From the literature I've ascertained that important things to measure include: DOC, PO</w:t>
+      </w:r>
+      <w:r>
+        <w:rPr>
+          <w:rFonts w:ascii="Calibri" w:eastAsia="Times New Roman" w:hAnsi="Calibri" w:cs="Calibri"/>
+          <w:color w:val="000000"/>
+          <w:vertAlign w:val="subscript"/>
+        </w:rPr>
+        <w:t>4</w:t>
+      </w:r>
+      <w:r>
+        <w:rPr>
+          <w:rFonts w:ascii="Calibri" w:eastAsia="Times New Roman" w:hAnsi="Calibri" w:cs="Calibri"/>
+          <w:color w:val="000000"/>
+          <w:vertAlign w:val="superscript"/>
+        </w:rPr>
+        <w:t>3-</w:t>
+      </w:r>
+      <w:r>
+        <w:rPr>
+          <w:rFonts w:ascii="Calibri" w:eastAsia="Times New Roman" w:hAnsi="Calibri" w:cs="Calibri"/>
+          <w:color w:val="000000"/>
+        </w:rPr>
+        <w:t>, NO</w:t>
+      </w:r>
+      <w:r>
+        <w:rPr>
+          <w:rFonts w:ascii="Calibri" w:eastAsia="Times New Roman" w:hAnsi="Calibri" w:cs="Calibri"/>
+          <w:color w:val="000000"/>
+          <w:vertAlign w:val="subscript"/>
+        </w:rPr>
+        <w:t>3</w:t>
+      </w:r>
+      <w:r>
+        <w:rPr>
+          <w:rFonts w:ascii="Calibri" w:eastAsia="Times New Roman" w:hAnsi="Calibri" w:cs="Calibri"/>
+          <w:color w:val="000000"/>
+        </w:rPr>
+        <w:t>-, NO</w:t>
+      </w:r>
+      <w:r>
+        <w:rPr>
+          <w:rFonts w:ascii="Calibri" w:eastAsia="Times New Roman" w:hAnsi="Calibri" w:cs="Calibri"/>
+          <w:color w:val="000000"/>
+          <w:vertAlign w:val="subscript"/>
+        </w:rPr>
+        <w:t>2</w:t>
+      </w:r>
+      <w:r>
+        <w:rPr>
+          <w:rFonts w:ascii="Calibri" w:eastAsia="Times New Roman" w:hAnsi="Calibri" w:cs="Calibri"/>
+          <w:color w:val="000000"/>
+        </w:rPr>
+        <w:t>-, NH</w:t>
+      </w:r>
+      <w:r>
+        <w:rPr>
+          <w:rFonts w:ascii="Calibri" w:eastAsia="Times New Roman" w:hAnsi="Calibri" w:cs="Calibri"/>
+          <w:color w:val="000000"/>
+          <w:vertAlign w:val="subscript"/>
+        </w:rPr>
+        <w:t>4</w:t>
+      </w:r>
+      <w:r>
+        <w:rPr>
+          <w:rFonts w:ascii="Calibri" w:eastAsia="Times New Roman" w:hAnsi="Calibri" w:cs="Calibri"/>
+          <w:color w:val="000000"/>
+          <w:vertAlign w:val="superscript"/>
+        </w:rPr>
+        <w:t>+</w:t>
+      </w:r>
+      <w:r>
+        <w:rPr>
+          <w:rFonts w:ascii="Calibri" w:eastAsia="Times New Roman" w:hAnsi="Calibri" w:cs="Calibri"/>
+          <w:color w:val="000000"/>
+        </w:rPr>
+        <w:t>, SO</w:t>
+      </w:r>
+      <w:r>
+        <w:rPr>
+          <w:rFonts w:ascii="Calibri" w:eastAsia="Times New Roman" w:hAnsi="Calibri" w:cs="Calibri"/>
+          <w:color w:val="000000"/>
+          <w:vertAlign w:val="subscript"/>
+        </w:rPr>
+        <w:t>4</w:t>
+      </w:r>
+      <w:r>
+        <w:rPr>
+          <w:rFonts w:ascii="Calibri" w:eastAsia="Times New Roman" w:hAnsi="Calibri" w:cs="Calibri"/>
+          <w:color w:val="000000"/>
+          <w:vertAlign w:val="superscript"/>
+        </w:rPr>
+        <w:t>2-</w:t>
+      </w:r>
+      <w:r>
+        <w:rPr>
+          <w:rFonts w:ascii="Calibri" w:eastAsia="Times New Roman" w:hAnsi="Calibri" w:cs="Calibri"/>
+          <w:color w:val="000000"/>
+        </w:rPr>
+        <w:t>, Ca</w:t>
+      </w:r>
+      <w:r>
+        <w:rPr>
+          <w:rFonts w:ascii="Calibri" w:eastAsia="Times New Roman" w:hAnsi="Calibri" w:cs="Calibri"/>
+          <w:color w:val="000000"/>
+          <w:vertAlign w:val="superscript"/>
+        </w:rPr>
+        <w:t>2+</w:t>
+      </w:r>
+      <w:r>
+        <w:rPr>
+          <w:rFonts w:ascii="Calibri" w:eastAsia="Times New Roman" w:hAnsi="Calibri" w:cs="Calibri"/>
+          <w:color w:val="000000"/>
+        </w:rPr>
+        <w:t>, Cl</w:t>
+      </w:r>
+      <w:r>
+        <w:rPr>
+          <w:rFonts w:ascii="Calibri" w:eastAsia="Times New Roman" w:hAnsi="Calibri" w:cs="Calibri"/>
+          <w:color w:val="000000"/>
+          <w:vertAlign w:val="superscript"/>
+        </w:rPr>
+        <w:t>-</w:t>
+      </w:r>
+      <w:r>
+        <w:rPr>
+          <w:rFonts w:ascii="Calibri" w:eastAsia="Times New Roman" w:hAnsi="Calibri" w:cs="Calibri"/>
+          <w:color w:val="000000"/>
+        </w:rPr>
+        <w:t>, Fe, K</w:t>
+      </w:r>
+      <w:r>
+        <w:rPr>
+          <w:rFonts w:ascii="Calibri" w:eastAsia="Times New Roman" w:hAnsi="Calibri" w:cs="Calibri"/>
+          <w:color w:val="000000"/>
+          <w:vertAlign w:val="superscript"/>
+        </w:rPr>
+        <w:t>+</w:t>
+      </w:r>
+      <w:r>
+        <w:rPr>
+          <w:rFonts w:ascii="Calibri" w:eastAsia="Times New Roman" w:hAnsi="Calibri" w:cs="Calibri"/>
+          <w:color w:val="000000"/>
+        </w:rPr>
+        <w:t>, Mg</w:t>
+      </w:r>
+      <w:r>
+        <w:rPr>
+          <w:rFonts w:ascii="Calibri" w:eastAsia="Times New Roman" w:hAnsi="Calibri" w:cs="Calibri"/>
+          <w:color w:val="000000"/>
+          <w:vertAlign w:val="superscript"/>
+        </w:rPr>
+        <w:t>2+</w:t>
+      </w:r>
+      <w:r>
+        <w:rPr>
+          <w:rFonts w:ascii="Calibri" w:eastAsia="Times New Roman" w:hAnsi="Calibri" w:cs="Calibri"/>
+          <w:color w:val="000000"/>
+        </w:rPr>
+        <w:t xml:space="preserve"> and Na</w:t>
+      </w:r>
+      <w:r>
+        <w:rPr>
+          <w:rFonts w:ascii="Calibri" w:eastAsia="Times New Roman" w:hAnsi="Calibri" w:cs="Calibri"/>
+          <w:color w:val="000000"/>
+          <w:vertAlign w:val="superscript"/>
+        </w:rPr>
+        <w:t>+</w:t>
+      </w:r>
+      <w:r>
+        <w:rPr>
+          <w:rFonts w:ascii="Calibri" w:eastAsia="Times New Roman" w:hAnsi="Calibri" w:cs="Calibri"/>
+          <w:color w:val="000000"/>
+        </w:rPr>
+        <w:t xml:space="preserve"> (possibly including DON and DOP). I understand how these nutrients play crucial roles in various metabolic processes. </w:t>
+      </w:r>
+    </w:p>
+    <w:p>
+      <w:pPr>
+        <w:rPr>
+          <w:rFonts w:ascii="Calibri" w:eastAsia="Times New Roman" w:hAnsi="Calibri" w:cs="Calibri"/>
+          <w:color w:val="000000"/>
+        </w:rPr>
+      </w:pPr>
+    </w:p>
+    <w:p>
+      <w:pPr>
+        <w:rPr>
+          <w:rFonts w:ascii="Calibri" w:eastAsia="Times New Roman" w:hAnsi="Calibri" w:cs="Calibri"/>
+          <w:color w:val="000000"/>
+        </w:rPr>
+      </w:pPr>
+      <w:r>
+        <w:rPr>
+          <w:rFonts w:ascii="Calibri" w:eastAsia="Times New Roman" w:hAnsi="Calibri" w:cs="Calibri"/>
+          <w:color w:val="000000"/>
+        </w:rPr>
+        <w:t xml:space="preserve">What I'm trying to get my head around is how to interpret potential results. From the papers I've read they often say there is a relationship between community structure and/or diversity and various nutrients but don't tend to elaborate on what that really means. </w:t>
+      </w:r>
+    </w:p>
+    <w:p>
+      <w:pPr>
+        <w:rPr>
+          <w:rFonts w:ascii="Calibri" w:eastAsia="Times New Roman" w:hAnsi="Calibri" w:cs="Calibri"/>
+          <w:color w:val="000000"/>
+        </w:rPr>
+      </w:pPr>
+    </w:p>
+    <w:p>
+      <w:pPr>
+        <w:rPr>
+          <w:rFonts w:ascii="Calibri" w:eastAsia="Times New Roman" w:hAnsi="Calibri" w:cs="Calibri"/>
+          <w:color w:val="000000"/>
+        </w:rPr>
+      </w:pPr>
+      <w:r>
+        <w:rPr>
+          <w:rFonts w:ascii="Calibri" w:eastAsia="Times New Roman" w:hAnsi="Calibri" w:cs="Calibri"/>
+          <w:color w:val="000000"/>
+        </w:rPr>
+        <w:t>Dissolved nutrients act as environ</w:t>
+      </w:r>
+      <w:bookmarkStart w:id="0" w:name="_GoBack"/>
+      <w:bookmarkEnd w:id="0"/>
+      <w:r>
+        <w:rPr>
+          <w:rFonts w:ascii="Calibri" w:eastAsia="Times New Roman" w:hAnsi="Calibri" w:cs="Calibri"/>
+          <w:color w:val="000000"/>
+        </w:rPr>
+        <w:t xml:space="preserve">mental filters on microbial communities, selecting for species with appropriate functional traits to propagate in those conditions. But then the microbial community will also impact the level of nutrients detected. </w:t>
+      </w:r>
+    </w:p>
+    <w:p>
+      <w:pPr>
+        <w:jc w:val="center"/>
+        <w:rPr>
+          <w:b/>
+        </w:rPr>
+      </w:pPr>
+    </w:p>
+    <w:p>
+      <w:pPr>
         <w:jc w:val="center"/>
       </w:pPr>
       <w:r>
@@ -2096,24 +2478,23 @@
     <w:tbl>
       <w:tblPr>
         <w:tblStyle w:val="GridTable4-Accent1"/>
-        <w:tblW w:w="14186" w:type="dxa"/>
-        <w:jc w:val="center"/>
+        <w:tblW w:w="5000" w:type="pct"/>
         <w:tblLook w:val="04A0" w:firstRow="1" w:lastRow="0" w:firstColumn="1" w:lastColumn="0" w:noHBand="0" w:noVBand="1"/>
       </w:tblPr>
       <w:tblGrid>
-        <w:gridCol w:w="2547"/>
-        <w:gridCol w:w="5953"/>
-        <w:gridCol w:w="5686"/>
+        <w:gridCol w:w="1900"/>
+        <w:gridCol w:w="5945"/>
+        <w:gridCol w:w="2313"/>
+        <w:gridCol w:w="3792"/>
       </w:tblGrid>
       <w:tr>
         <w:trPr>
           <w:cnfStyle w:val="100000000000" w:firstRow="1" w:lastRow="0" w:firstColumn="0" w:lastColumn="0" w:oddVBand="0" w:evenVBand="0" w:oddHBand="0" w:evenHBand="0" w:firstRowFirstColumn="0" w:firstRowLastColumn="0" w:lastRowFirstColumn="0" w:lastRowLastColumn="0"/>
-          <w:jc w:val="center"/>
         </w:trPr>
         <w:tc>
           <w:tcPr>
             <w:cnfStyle w:val="001000000000" w:firstRow="0" w:lastRow="0" w:firstColumn="1" w:lastColumn="0" w:oddVBand="0" w:evenVBand="0" w:oddHBand="0" w:evenHBand="0" w:firstRowFirstColumn="0" w:firstRowLastColumn="0" w:lastRowFirstColumn="0" w:lastRowLastColumn="0"/>
-            <w:tcW w:w="0" w:type="auto"/>
+            <w:tcW w:w="681" w:type="pct"/>
           </w:tcPr>
           <w:p>
             <w:r>
@@ -2123,20 +2504,33 @@
         </w:tc>
         <w:tc>
           <w:tcPr>
-            <w:tcW w:w="5953" w:type="dxa"/>
+            <w:tcW w:w="2131" w:type="pct"/>
           </w:tcPr>
           <w:p>
             <w:pPr>
               <w:cnfStyle w:val="100000000000" w:firstRow="1" w:lastRow="0" w:firstColumn="0" w:lastColumn="0" w:oddVBand="0" w:evenVBand="0" w:oddHBand="0" w:evenHBand="0" w:firstRowFirstColumn="0" w:firstRowLastColumn="0" w:lastRowFirstColumn="0" w:lastRowLastColumn="0"/>
             </w:pPr>
             <w:r>
+              <w:t xml:space="preserve">Rationale </w:t>
+            </w:r>
+          </w:p>
+        </w:tc>
+        <w:tc>
+          <w:tcPr>
+            <w:tcW w:w="829" w:type="pct"/>
+          </w:tcPr>
+          <w:p>
+            <w:pPr>
+              <w:cnfStyle w:val="100000000000" w:firstRow="1" w:lastRow="0" w:firstColumn="0" w:lastColumn="0" w:oddVBand="0" w:evenVBand="0" w:oddHBand="0" w:evenHBand="0" w:firstRowFirstColumn="0" w:firstRowLastColumn="0" w:lastRowFirstColumn="0" w:lastRowLastColumn="0"/>
+            </w:pPr>
+            <w:r>
               <w:t>Concentrations</w:t>
             </w:r>
           </w:p>
         </w:tc>
         <w:tc>
           <w:tcPr>
-            <w:tcW w:w="5686" w:type="dxa"/>
+            <w:tcW w:w="1359" w:type="pct"/>
           </w:tcPr>
           <w:p>
             <w:pPr>
@@ -2151,12 +2545,11 @@
       <w:tr>
         <w:trPr>
           <w:cnfStyle w:val="000000100000" w:firstRow="0" w:lastRow="0" w:firstColumn="0" w:lastColumn="0" w:oddVBand="0" w:evenVBand="0" w:oddHBand="1" w:evenHBand="0" w:firstRowFirstColumn="0" w:firstRowLastColumn="0" w:lastRowFirstColumn="0" w:lastRowLastColumn="0"/>
-          <w:jc w:val="center"/>
         </w:trPr>
         <w:tc>
           <w:tcPr>
             <w:cnfStyle w:val="001000000000" w:firstRow="0" w:lastRow="0" w:firstColumn="1" w:lastColumn="0" w:oddVBand="0" w:evenVBand="0" w:oddHBand="0" w:evenHBand="0" w:firstRowFirstColumn="0" w:firstRowLastColumn="0" w:lastRowFirstColumn="0" w:lastRowLastColumn="0"/>
-            <w:tcW w:w="0" w:type="auto"/>
+            <w:tcW w:w="681" w:type="pct"/>
           </w:tcPr>
           <w:p>
             <w:r>
@@ -2166,13 +2559,156 @@
         </w:tc>
         <w:tc>
           <w:tcPr>
-            <w:tcW w:w="5953" w:type="dxa"/>
-          </w:tcPr>
-          <w:p>
-            <w:pPr>
-              <w:cnfStyle w:val="000000100000" w:firstRow="0" w:lastRow="0" w:firstColumn="0" w:lastColumn="0" w:oddVBand="0" w:evenVBand="0" w:oddHBand="1" w:evenHBand="0" w:firstRowFirstColumn="0" w:firstRowLastColumn="0" w:lastRowFirstColumn="0" w:lastRowLastColumn="0"/>
-            </w:pPr>
-            <w:r>
+            <w:tcW w:w="2131" w:type="pct"/>
+          </w:tcPr>
+          <w:p>
+            <w:pPr>
+              <w:cnfStyle w:val="000000100000" w:firstRow="0" w:lastRow="0" w:firstColumn="0" w:lastColumn="0" w:oddVBand="0" w:evenVBand="0" w:oddHBand="1" w:evenHBand="0" w:firstRowFirstColumn="0" w:firstRowLastColumn="0" w:lastRowFirstColumn="0" w:lastRowLastColumn="0"/>
+            </w:pPr>
+            <w:r>
+              <w:t xml:space="preserve">Ratios between </w:t>
+            </w:r>
+            <w:proofErr w:type="gramStart"/>
+            <w:r>
+              <w:t>DOC:DON</w:t>
+            </w:r>
+            <w:proofErr w:type="gramEnd"/>
+            <w:r>
+              <w:t xml:space="preserve">:DOP can be used to investigate the presence of a limiting nutrient. If </w:t>
+            </w:r>
+            <w:proofErr w:type="gramStart"/>
+            <w:r>
+              <w:t>DON:DOP</w:t>
+            </w:r>
+            <w:proofErr w:type="gramEnd"/>
+            <w:r>
+              <w:t xml:space="preserve"> and DOC:DOP ratios increase with biomass, whereas DOC:DON ratios remain the same, it suggests that P is the limiting nutrient. </w:t>
+            </w:r>
+          </w:p>
+          <w:p>
+            <w:pPr>
+              <w:cnfStyle w:val="000000100000" w:firstRow="0" w:lastRow="0" w:firstColumn="0" w:lastColumn="0" w:oddVBand="0" w:evenVBand="0" w:oddHBand="1" w:evenHBand="0" w:firstRowFirstColumn="0" w:firstRowLastColumn="0" w:lastRowFirstColumn="0" w:lastRowLastColumn="0"/>
+            </w:pPr>
+          </w:p>
+          <w:p>
+            <w:pPr>
+              <w:cnfStyle w:val="000000100000" w:firstRow="0" w:lastRow="0" w:firstColumn="0" w:lastColumn="0" w:oddVBand="0" w:evenVBand="0" w:oddHBand="1" w:evenHBand="0" w:firstRowFirstColumn="0" w:firstRowLastColumn="0" w:lastRowFirstColumn="0" w:lastRowLastColumn="0"/>
+            </w:pPr>
+            <w:r>
+              <w:t xml:space="preserve">If DOC decreases with alpha diversity we might suggest this is because increased diversity = increased DOC uptake </w:t>
+            </w:r>
+            <w:r>
+              <w:fldChar w:fldCharType="begin" w:fldLock="1"/>
+            </w:r>
+            <w:r>
+              <w:instrText>ADDIN CSL_CITATION {"citationItems":[{"id":"ITEM-1","itemData":{"DOI":"10.1016/j.scitotenv.2020.143178","ISSN":"18791026","abstract":"Community assembly processes are important in structuring aquatic microbial communities; however, the influence of these processes on the dynamics of bacterial communities in glacial streams and lakes remains largely unstudied. To investigate the assembly processes underlying the temporal variation of the bacterial community, we collected 50 water samples over five months in an ephemeral glacial stream and its downstream lake at the terminus of the Qiangyong glacier on the Tibetan Plateau. Using the V4 hypervariable region of the bacterial 16S rRNA gene combined with environmental measurements, such as water temperature, pH, total nitrogen (TN), dissolved organic carbon (DOC) and water conductivity, we found that temporal variation in the environmental factors promoted the shift in the proglacial stream and the lake bacterial communities. The quantification of ecological processes showed that the stream microbial communities were influenced by the ecological drift (40%) in June, then changed to homogeneous selection (40%) in July and variable selection (60%) in September, while the dynamic pattern of proglacial lake bacterioplankton was governed by homogeneous selection (≥ 50%) over the time. Overall, the dynamic of bacterial community in the proglacial stream and lake water is influenced by environmental factors, and the community composition assembly of the Qiangyong glacial stream and lake could be dynamic and primarily governed by deterministic processes.","author":[{"dropping-particle":"","family":"Gu","given":"Zhengquan","non-dropping-particle":"","parse-names":false,"suffix":""},{"dropping-particle":"","family":"Liu","given":"Keshao","non-dropping-particle":"","parse-names":false,"suffix":""},{"dropping-particle":"","family":"Pedersen","given":"Mikkel Winther","non-dropping-particle":"","parse-names":false,"suffix":""},{"dropping-particle":"","family":"Wang","given":"Feng","non-dropping-particle":"","parse-names":false,"suffix":""},{"dropping-particle":"","family":"Chen","given":"Yuying","non-dropping-particle":"","parse-names":false,"suffix":""},{"dropping-particle":"","family":"Zeng","given":"Chen","non-dropping-particle":"","parse-names":false,"suffix":""},{"dropping-particle":"","family":"Liu","given":"Yongqin","non-dropping-particle":"","parse-names":false,"suffix":""}],"container-title":"Science of the Total Environment","id":"ITEM-1","issue":"xxxx","issued":{"date-parts":[["2020"]]},"page":"143178","publisher":"Elsevier B.V.","title":"Community assembly processes underlying the temporal dynamics of glacial stream and lake bacterial communities","type":"article-journal"},"uris":["http://www.mendeley.com/documents/?uuid=a89113b5-2f54-45ab-b54f-f344b2789520"]}],"mendeley":{"formattedCitation":"(Gu et al., 2020)","plainTextFormattedCitation":"(Gu et al., 2020)","previouslyFormattedCitation":"(Gu et al., 2020)"},"properties":{"noteIndex":0},"schema":"https://github.com/citation-style-language/schema/raw/master/csl-citation.json"}</w:instrText>
+            </w:r>
+            <w:r>
+              <w:fldChar w:fldCharType="separate"/>
+            </w:r>
+            <w:r>
+              <w:rPr>
+                <w:noProof/>
+              </w:rPr>
+              <w:t>(Gu et al., 2020)</w:t>
+            </w:r>
+            <w:r>
+              <w:fldChar w:fldCharType="end"/>
+            </w:r>
+            <w:r>
+              <w:t>.</w:t>
+            </w:r>
+          </w:p>
+          <w:p>
+            <w:pPr>
+              <w:cnfStyle w:val="000000100000" w:firstRow="0" w:lastRow="0" w:firstColumn="0" w:lastColumn="0" w:oddVBand="0" w:evenVBand="0" w:oddHBand="1" w:evenHBand="0" w:firstRowFirstColumn="0" w:firstRowLastColumn="0" w:lastRowFirstColumn="0" w:lastRowLastColumn="0"/>
+            </w:pPr>
+            <w:r>
+              <w:lastRenderedPageBreak/>
+              <w:t xml:space="preserve"> </w:t>
+            </w:r>
+          </w:p>
+          <w:p>
+            <w:pPr>
+              <w:cnfStyle w:val="000000100000" w:firstRow="0" w:lastRow="0" w:firstColumn="0" w:lastColumn="0" w:oddVBand="0" w:evenVBand="0" w:oddHBand="1" w:evenHBand="0" w:firstRowFirstColumn="0" w:firstRowLastColumn="0" w:lastRowFirstColumn="0" w:lastRowLastColumn="0"/>
+            </w:pPr>
+            <w:r>
+              <w:t xml:space="preserve">If environmental variables do not correlate with alpha diversity there may be some other variable driving alpha diversity (e.g. something physical like the transport of organisms from allochthonous sources) </w:t>
+            </w:r>
+            <w:r>
+              <w:fldChar w:fldCharType="begin" w:fldLock="1"/>
+            </w:r>
+            <w:r>
+              <w:instrText>ADDIN CSL_CITATION {"citationItems":[{"id":"ITEM-1","itemData":{"DOI":"10.1016/j.scitotenv.2020.143178","ISSN":"18791026","abstract":"Community assembly processes are important in structuring aquatic microbial communities; however, the influence of these processes on the dynamics of bacterial communities in glacial streams and lakes remains largely unstudied. To investigate the assembly processes underlying the temporal variation of the bacterial community, we collected 50 water samples over five months in an ephemeral glacial stream and its downstream lake at the terminus of the Qiangyong glacier on the Tibetan Plateau. Using the V4 hypervariable region of the bacterial 16S rRNA gene combined with environmental measurements, such as water temperature, pH, total nitrogen (TN), dissolved organic carbon (DOC) and water conductivity, we found that temporal variation in the environmental factors promoted the shift in the proglacial stream and the lake bacterial communities. The quantification of ecological processes showed that the stream microbial communities were influenced by the ecological drift (40%) in June, then changed to homogeneous selection (40%) in July and variable selection (60%) in September, while the dynamic pattern of proglacial lake bacterioplankton was governed by homogeneous selection (≥ 50%) over the time. Overall, the dynamic of bacterial community in the proglacial stream and lake water is influenced by environmental factors, and the community composition assembly of the Qiangyong glacial stream and lake could be dynamic and primarily governed by deterministic processes.","author":[{"dropping-particle":"","family":"Gu","given":"Zhengquan","non-dropping-particle":"","parse-names":false,"suffix":""},{"dropping-particle":"","family":"Liu","given":"Keshao","non-dropping-particle":"","parse-names":false,"suffix":""},{"dropping-particle":"","family":"Pedersen","given":"Mikkel Winther","non-dropping-particle":"","parse-names":false,"suffix":""},{"dropping-particle":"","family":"Wang","given":"Feng","non-dropping-particle":"","parse-names":false,"suffix":""},{"dropping-particle":"","family":"Chen","given":"Yuying","non-dropping-particle":"","parse-names":false,"suffix":""},{"dropping-particle":"","family":"Zeng","given":"Chen","non-dropping-particle":"","parse-names":false,"suffix":""},{"dropping-particle":"","family":"Liu","given":"Yongqin","non-dropping-particle":"","parse-names":false,"suffix":""}],"container-title":"Science of the Total Environment","id":"ITEM-1","issue":"xxxx","issued":{"date-parts":[["2020"]]},"page":"143178","publisher":"Elsevier B.V.","title":"Community assembly processes underlying the temporal dynamics of glacial stream and lake bacterial communities","type":"article-journal"},"uris":["http://www.mendeley.com/documents/?uuid=a89113b5-2f54-45ab-b54f-f344b2789520"]}],"mendeley":{"formattedCitation":"(Gu et al., 2020)","plainTextFormattedCitation":"(Gu et al., 2020)","previouslyFormattedCitation":"(Gu et al., 2020)"},"properties":{"noteIndex":0},"schema":"https://github.com/citation-style-language/schema/raw/master/csl-citation.json"}</w:instrText>
+            </w:r>
+            <w:r>
+              <w:fldChar w:fldCharType="separate"/>
+            </w:r>
+            <w:r>
+              <w:rPr>
+                <w:noProof/>
+              </w:rPr>
+              <w:t>(Gu et al., 2020)</w:t>
+            </w:r>
+            <w:r>
+              <w:fldChar w:fldCharType="end"/>
+            </w:r>
+            <w:r>
+              <w:t>.</w:t>
+            </w:r>
+          </w:p>
+          <w:p>
+            <w:pPr>
+              <w:cnfStyle w:val="000000100000" w:firstRow="0" w:lastRow="0" w:firstColumn="0" w:lastColumn="0" w:oddVBand="0" w:evenVBand="0" w:oddHBand="1" w:evenHBand="0" w:firstRowFirstColumn="0" w:firstRowLastColumn="0" w:lastRowFirstColumn="0" w:lastRowLastColumn="0"/>
+            </w:pPr>
+          </w:p>
+          <w:p>
+            <w:pPr>
+              <w:cnfStyle w:val="000000100000" w:firstRow="0" w:lastRow="0" w:firstColumn="0" w:lastColumn="0" w:oddVBand="0" w:evenVBand="0" w:oddHBand="1" w:evenHBand="0" w:firstRowFirstColumn="0" w:firstRowLastColumn="0" w:lastRowFirstColumn="0" w:lastRowLastColumn="0"/>
+            </w:pPr>
+            <w:r>
+              <w:t xml:space="preserve">The low explanatory power of environmental variables suggests that the primary forcing variable was not measured (for example, glacier slope, allochthonous immigration sources) </w:t>
+            </w:r>
+            <w:r>
+              <w:fldChar w:fldCharType="begin" w:fldLock="1"/>
+            </w:r>
+            <w:r>
+              <w:instrText>ADDIN CSL_CITATION {"citationItems":[{"id":"ITEM-1","itemData":{"DOI":"10.1007/s00300-003-0580-2","ISSN":"07224060","abstract":"The cylindrical meltholes present in the ablation zones of many glaciers (termed cryoconite holes) contain complex microbial communities. A canonical correspondence analysis (CCA) of community structure and environmental gradients for cryoconite holes on two glaciers was undertaken. The Canada Glacier (77°37′S, 162°55′E) is located in the McMurdo Dry Valleys of Antarctica. The White Glacier (79°27′N, 90°40′W) is located on Axel Heiberg Island, Nunavut Territory, Canada. These glaciers are at similar, yet antipodal latitudes, are roughly the same size and endure approximately the same mean annual temperature. The Canada Glacier cryoconite communities were found to be significantly (P = 0-001) associated with six environmental variables, which together explained 55% of the biological variation. The White Glacier cryoconite communities were not significantly associated with environmental variables. The differences in CCA results were attributed to the relative amount of disturbance and isolation between each glacier's cryoconite holes. Canada Glacier cryoconite holes were mostly ice-covered and undisturbed by meltwater flow, whereas high meltwater production and open cryoconite holes on the White Glacier may continually reset the community structure and habitat variability due to inter-hole mixing.","author":[{"dropping-particle":"","family":"Mueller","given":"D. R.","non-dropping-particle":"","parse-names":false,"suffix":""},{"dropping-particle":"","family":"Pollard","given":"W. H.","non-dropping-particle":"","parse-names":false,"suffix":""}],"container-title":"Polar Biology","id":"ITEM-1","issue":"2","issued":{"date-parts":[["2004"]]},"page":"66-74","title":"Gradient analysis of cryoconite ecosystems from two polar glaciers","type":"article-journal","volume":"27"},"uris":["http://www.mendeley.com/documents/?uuid=37e49be0-fc5c-4590-bcef-c909fa1f95eb"]}],"mendeley":{"formattedCitation":"(Mueller and Pollard, 2004)","plainTextFormattedCitation":"(Mueller and Pollard, 2004)","previouslyFormattedCitation":"(Mueller and Pollard, 2004)"},"properties":{"noteIndex":0},"schema":"https://github.com/citation-style-language/schema/raw/master/csl-citation.json"}</w:instrText>
+            </w:r>
+            <w:r>
+              <w:fldChar w:fldCharType="separate"/>
+            </w:r>
+            <w:r>
+              <w:rPr>
+                <w:noProof/>
+              </w:rPr>
+              <w:t>(Mueller and Pollard, 2004)</w:t>
+            </w:r>
+            <w:r>
+              <w:fldChar w:fldCharType="end"/>
+            </w:r>
+          </w:p>
+          <w:p>
+            <w:pPr>
+              <w:cnfStyle w:val="000000100000" w:firstRow="0" w:lastRow="0" w:firstColumn="0" w:lastColumn="0" w:oddVBand="0" w:evenVBand="0" w:oddHBand="1" w:evenHBand="0" w:firstRowFirstColumn="0" w:firstRowLastColumn="0" w:lastRowFirstColumn="0" w:lastRowLastColumn="0"/>
+            </w:pPr>
+          </w:p>
+          <w:p>
+            <w:pPr>
+              <w:cnfStyle w:val="000000100000" w:firstRow="0" w:lastRow="0" w:firstColumn="0" w:lastColumn="0" w:oddVBand="0" w:evenVBand="0" w:oddHBand="1" w:evenHBand="0" w:firstRowFirstColumn="0" w:firstRowLastColumn="0" w:lastRowFirstColumn="0" w:lastRowLastColumn="0"/>
+            </w:pPr>
+          </w:p>
+        </w:tc>
+        <w:tc>
+          <w:tcPr>
+            <w:tcW w:w="829" w:type="pct"/>
+          </w:tcPr>
+          <w:p>
+            <w:pPr>
+              <w:cnfStyle w:val="000000100000" w:firstRow="0" w:lastRow="0" w:firstColumn="0" w:lastColumn="0" w:oddVBand="0" w:evenVBand="0" w:oddHBand="1" w:evenHBand="0" w:firstRowFirstColumn="0" w:firstRowLastColumn="0" w:lastRowFirstColumn="0" w:lastRowLastColumn="0"/>
+            </w:pPr>
+            <w:r>
+              <w:lastRenderedPageBreak/>
               <w:t xml:space="preserve">Snow: 36 </w:t>
             </w:r>
             <m:oMath>
@@ -2325,6 +2861,7 @@
               </w:rPr>
             </w:pPr>
             <w:r>
+              <w:lastRenderedPageBreak/>
               <w:t>GIS glacial meltwater:</w:t>
             </w:r>
             <w:r>
@@ -2521,13 +3058,14 @@
         </w:tc>
         <w:tc>
           <w:tcPr>
-            <w:tcW w:w="5686" w:type="dxa"/>
-          </w:tcPr>
-          <w:p>
-            <w:pPr>
-              <w:cnfStyle w:val="000000100000" w:firstRow="0" w:lastRow="0" w:firstColumn="0" w:lastColumn="0" w:oddVBand="0" w:evenVBand="0" w:oddHBand="1" w:evenHBand="0" w:firstRowFirstColumn="0" w:firstRowLastColumn="0" w:lastRowFirstColumn="0" w:lastRowLastColumn="0"/>
-            </w:pPr>
-            <w:r>
+            <w:tcW w:w="1359" w:type="pct"/>
+          </w:tcPr>
+          <w:p>
+            <w:pPr>
+              <w:cnfStyle w:val="000000100000" w:firstRow="0" w:lastRow="0" w:firstColumn="0" w:lastColumn="0" w:oddVBand="0" w:evenVBand="0" w:oddHBand="1" w:evenHBand="0" w:firstRowFirstColumn="0" w:firstRowLastColumn="0" w:lastRowFirstColumn="0" w:lastRowLastColumn="0"/>
+            </w:pPr>
+            <w:r>
+              <w:lastRenderedPageBreak/>
               <w:t xml:space="preserve">ICP-MS </w:t>
             </w:r>
             <w:r>
@@ -2623,17 +3161,125 @@
             <w:r>
               <w:fldChar w:fldCharType="end"/>
             </w:r>
+          </w:p>
+        </w:tc>
+      </w:tr>
+      <w:tr>
+        <w:tc>
+          <w:tcPr>
+            <w:cnfStyle w:val="001000000000" w:firstRow="0" w:lastRow="0" w:firstColumn="1" w:lastColumn="0" w:oddVBand="0" w:evenVBand="0" w:oddHBand="0" w:evenHBand="0" w:firstRowFirstColumn="0" w:firstRowLastColumn="0" w:lastRowFirstColumn="0" w:lastRowLastColumn="0"/>
+            <w:tcW w:w="681" w:type="pct"/>
+          </w:tcPr>
+          <w:p>
+            <w:r>
+              <w:t>DON</w:t>
+            </w:r>
+          </w:p>
+        </w:tc>
+        <w:tc>
+          <w:tcPr>
+            <w:tcW w:w="2131" w:type="pct"/>
+          </w:tcPr>
+          <w:p>
+            <w:pPr>
+              <w:cnfStyle w:val="000000000000" w:firstRow="0" w:lastRow="0" w:firstColumn="0" w:lastColumn="0" w:oddVBand="0" w:evenVBand="0" w:oddHBand="0" w:evenHBand="0" w:firstRowFirstColumn="0" w:firstRowLastColumn="0" w:lastRowFirstColumn="0" w:lastRowLastColumn="0"/>
+            </w:pPr>
+            <w:r>
+              <w:t xml:space="preserve">Can be used to investigate presence of </w:t>
+            </w:r>
+            <w:proofErr w:type="spellStart"/>
+            <w:r>
+              <w:t>biolimiting</w:t>
+            </w:r>
+            <w:proofErr w:type="spellEnd"/>
+            <w:r>
+              <w:t xml:space="preserve"> nutrient.</w:t>
+            </w:r>
+          </w:p>
+        </w:tc>
+        <w:tc>
+          <w:tcPr>
+            <w:tcW w:w="829" w:type="pct"/>
+          </w:tcPr>
+          <w:p>
+            <w:pPr>
+              <w:cnfStyle w:val="000000000000" w:firstRow="0" w:lastRow="0" w:firstColumn="0" w:lastColumn="0" w:oddVBand="0" w:evenVBand="0" w:oddHBand="0" w:evenHBand="0" w:firstRowFirstColumn="0" w:firstRowLastColumn="0" w:lastRowFirstColumn="0" w:lastRowLastColumn="0"/>
+            </w:pPr>
+          </w:p>
+        </w:tc>
+        <w:tc>
+          <w:tcPr>
+            <w:tcW w:w="1359" w:type="pct"/>
+          </w:tcPr>
+          <w:p>
+            <w:pPr>
+              <w:cnfStyle w:val="000000000000" w:firstRow="0" w:lastRow="0" w:firstColumn="0" w:lastColumn="0" w:oddVBand="0" w:evenVBand="0" w:oddHBand="0" w:evenHBand="0" w:firstRowFirstColumn="0" w:firstRowLastColumn="0" w:lastRowFirstColumn="0" w:lastRowLastColumn="0"/>
+            </w:pPr>
           </w:p>
         </w:tc>
       </w:tr>
       <w:tr>
         <w:trPr>
-          <w:jc w:val="center"/>
+          <w:cnfStyle w:val="000000100000" w:firstRow="0" w:lastRow="0" w:firstColumn="0" w:lastColumn="0" w:oddVBand="0" w:evenVBand="0" w:oddHBand="1" w:evenHBand="0" w:firstRowFirstColumn="0" w:firstRowLastColumn="0" w:lastRowFirstColumn="0" w:lastRowLastColumn="0"/>
         </w:trPr>
         <w:tc>
           <w:tcPr>
             <w:cnfStyle w:val="001000000000" w:firstRow="0" w:lastRow="0" w:firstColumn="1" w:lastColumn="0" w:oddVBand="0" w:evenVBand="0" w:oddHBand="0" w:evenHBand="0" w:firstRowFirstColumn="0" w:firstRowLastColumn="0" w:lastRowFirstColumn="0" w:lastRowLastColumn="0"/>
-            <w:tcW w:w="0" w:type="auto"/>
+            <w:tcW w:w="681" w:type="pct"/>
+          </w:tcPr>
+          <w:p>
+            <w:r>
+              <w:t>DOP</w:t>
+            </w:r>
+          </w:p>
+        </w:tc>
+        <w:tc>
+          <w:tcPr>
+            <w:tcW w:w="2131" w:type="pct"/>
+          </w:tcPr>
+          <w:p>
+            <w:pPr>
+              <w:cnfStyle w:val="000000100000" w:firstRow="0" w:lastRow="0" w:firstColumn="0" w:lastColumn="0" w:oddVBand="0" w:evenVBand="0" w:oddHBand="1" w:evenHBand="0" w:firstRowFirstColumn="0" w:firstRowLastColumn="0" w:lastRowFirstColumn="0" w:lastRowLastColumn="0"/>
+            </w:pPr>
+            <w:r>
+              <w:t xml:space="preserve">Can be used to investigate presence of </w:t>
+            </w:r>
+            <w:proofErr w:type="spellStart"/>
+            <w:r>
+              <w:t>biolimiting</w:t>
+            </w:r>
+            <w:proofErr w:type="spellEnd"/>
+            <w:r>
+              <w:t xml:space="preserve"> nutrient.</w:t>
+            </w:r>
+          </w:p>
+        </w:tc>
+        <w:tc>
+          <w:tcPr>
+            <w:tcW w:w="829" w:type="pct"/>
+          </w:tcPr>
+          <w:p>
+            <w:pPr>
+              <w:cnfStyle w:val="000000100000" w:firstRow="0" w:lastRow="0" w:firstColumn="0" w:lastColumn="0" w:oddVBand="0" w:evenVBand="0" w:oddHBand="1" w:evenHBand="0" w:firstRowFirstColumn="0" w:firstRowLastColumn="0" w:lastRowFirstColumn="0" w:lastRowLastColumn="0"/>
+            </w:pPr>
+          </w:p>
+        </w:tc>
+        <w:tc>
+          <w:tcPr>
+            <w:tcW w:w="1359" w:type="pct"/>
+          </w:tcPr>
+          <w:p>
+            <w:pPr>
+              <w:cnfStyle w:val="000000100000" w:firstRow="0" w:lastRow="0" w:firstColumn="0" w:lastColumn="0" w:oddVBand="0" w:evenVBand="0" w:oddHBand="1" w:evenHBand="0" w:firstRowFirstColumn="0" w:firstRowLastColumn="0" w:lastRowFirstColumn="0" w:lastRowLastColumn="0"/>
+            </w:pPr>
+          </w:p>
+        </w:tc>
+      </w:tr>
+      <w:tr>
+        <w:tc>
+          <w:tcPr>
+            <w:cnfStyle w:val="001000000000" w:firstRow="0" w:lastRow="0" w:firstColumn="1" w:lastColumn="0" w:oddVBand="0" w:evenVBand="0" w:oddHBand="0" w:evenHBand="0" w:firstRowFirstColumn="0" w:firstRowLastColumn="0" w:lastRowFirstColumn="0" w:lastRowLastColumn="0"/>
+            <w:tcW w:w="681" w:type="pct"/>
           </w:tcPr>
           <w:p>
             <w:r>
@@ -2655,19 +3301,132 @@
               <w:t>- anion</w:t>
             </w:r>
             <w:r>
-              <w:t>)</w:t>
-            </w:r>
-          </w:p>
-        </w:tc>
-        <w:tc>
-          <w:tcPr>
-            <w:tcW w:w="5953" w:type="dxa"/>
+              <w:t>) (DIP)</w:t>
+            </w:r>
+          </w:p>
+        </w:tc>
+        <w:tc>
+          <w:tcPr>
+            <w:tcW w:w="2131" w:type="pct"/>
           </w:tcPr>
           <w:p>
             <w:pPr>
               <w:cnfStyle w:val="000000000000" w:firstRow="0" w:lastRow="0" w:firstColumn="0" w:lastColumn="0" w:oddVBand="0" w:evenVBand="0" w:oddHBand="0" w:evenHBand="0" w:firstRowFirstColumn="0" w:firstRowLastColumn="0" w:lastRowFirstColumn="0" w:lastRowLastColumn="0"/>
             </w:pPr>
             <w:r>
+              <w:t xml:space="preserve">If there is more DOP in the samples than DIP then we might suggest P is being taken up by microbes and turned into its organic form </w:t>
+            </w:r>
+            <w:r>
+              <w:fldChar w:fldCharType="begin" w:fldLock="1"/>
+            </w:r>
+            <w:r>
+              <w:instrText>ADDIN CSL_CITATION {"citationItems":[{"id":"ITEM-1","itemData":{"DOI":"10.5194/bg-16-3283-2019","ISSN":"17264189","abstract":"Glaciers and ice sheets host abundant and dynamic communities of microorganisms on the ice surface (supraglacial environments). Recently, it has been shown that Streptophyte glacier algae blooming on the surface ice of the south-western coast of the Greenland Ice Sheet are a significant contributor to the 15-year marked decrease in albedo. Currently, little is known about the constraints, such as nutrient availability, on this large-scale algal bloom. In this study, we investigate the relative abundances of dissolved inorganic and dissolved organic macronutrients (N and P) in these darkening surface ice environments. Three distinct ice surfaces, with low, medium and high visible impurity loadings, supraglacial stream water and cryoconite hole water, were sampled. Our results show a clear dominance of the organic phase in all ice surface samples containing low, medium and high visible impurity loadings, with 93% of the total dissolved nitrogen and 67% of the total dissolved phosphorus in the organic phase. Mean concentrations in low, medium and high visible impurity surface ice environments are 0.91, 0.62 and 1.0μM for dissolved inorganic nitrogen (DIN), 5.1, 11 and 14μM for dissolved organic nitrogen (DON), 0.03, 0.07 and 0.05μM for dissolved inorganic phosphorus (DIP) and 0.10, 0.15 and 0.12μM for dissolved organic phosphorus (DOP), respectively. DON concentrations in all three surface ice samples are significantly higher than DON concentrations in supraglacial streams and cryoconite hole water (0 and 0.7 μM, respectively). DOP concentrations are higher in all three surface ice samples compared to supraglacial streams and cryoconite hole water (0.07μM for both). Dissolved organic carbon (DOC) concentrations increase with the amount of visible impurities present (low: 83 μM, medium: 173μM and high: 242 μM) and are elevated compared to supraglacial streams and cryoconite hole water (30 and 50 μM, respectively). We speculate that the architecture of the weathering crust, which impacts on water flow paths and storage in the melting surface ice and/or the production of extracellular polymeric substances (EPS), containing both N and P in conjunction with C, is responsible for the temporary retention of DON and DOP in the melting surface ice. The unusual presence of measurable DIP and DIN, principally as NHC 4 , in the melting surface ice environments suggests that factors other than macronutrient limitation are controlling the extent and magnitude of the gla…","author":[{"dropping-particle":"","family":"Holland","given":"Alexandra T.","non-dropping-particle":"","parse-names":false,"suffix":""},{"dropping-particle":"","family":"Williamson","given":"Christopher J.","non-dropping-particle":"","parse-names":false,"suffix":""},{"dropping-particle":"","family":"Sgouridis","given":"Fotis","non-dropping-particle":"","parse-names":false,"suffix":""},{"dropping-particle":"","family":"Tedstone","given":"Andrew J.","non-dropping-particle":"","parse-names":false,"suffix":""},{"dropping-particle":"","family":"McCutcheon","given":"Jenine","non-dropping-particle":"","parse-names":false,"suffix":""},{"dropping-particle":"","family":"Cook","given":"Joseph M.","non-dropping-particle":"","parse-names":false,"suffix":""},{"dropping-particle":"","family":"Poniecka","given":"Ewa","non-dropping-particle":"","parse-names":false,"suffix":""},{"dropping-particle":"","family":"Yallop","given":"Marian L.","non-dropping-particle":"","parse-names":false,"suffix":""},{"dropping-particle":"","family":"Tranter","given":"Martyn","non-dropping-particle":"","parse-names":false,"suffix":""},{"dropping-particle":"","family":"Anesio","given":"Alexandre M.","non-dropping-particle":"","parse-names":false,"suffix":""}],"container-title":"Biogeosciences","id":"ITEM-1","issue":"16","issued":{"date-parts":[["2019"]]},"page":"3283-3296","title":"Dissolved organic nutrients dominate melting surface ice of the Dark Zone (Greenland Ice Sheet)","type":"article-journal","volume":"16"},"uris":["http://www.mendeley.com/documents/?uuid=89f48ff2-e944-4141-b569-bfde842c5ee9"]}],"mendeley":{"formattedCitation":"(Holland et al., 2019)","plainTextFormattedCitation":"(Holland et al., 2019)","previouslyFormattedCitation":"(Holland et al., 2019)"},"properties":{"noteIndex":0},"schema":"https://github.com/citation-style-language/schema/raw/master/csl-citation.json"}</w:instrText>
+            </w:r>
+            <w:r>
+              <w:fldChar w:fldCharType="separate"/>
+            </w:r>
+            <w:r>
+              <w:rPr>
+                <w:noProof/>
+              </w:rPr>
+              <w:t>(Holland et al., 2019)</w:t>
+            </w:r>
+            <w:r>
+              <w:fldChar w:fldCharType="end"/>
+            </w:r>
+            <w:r>
+              <w:t xml:space="preserve">. If DIP is found in areas with more particulate this may suggest particulate is the source of DIP. </w:t>
+            </w:r>
+          </w:p>
+          <w:p>
+            <w:pPr>
+              <w:cnfStyle w:val="000000000000" w:firstRow="0" w:lastRow="0" w:firstColumn="0" w:lastColumn="0" w:oddVBand="0" w:evenVBand="0" w:oddHBand="0" w:evenHBand="0" w:firstRowFirstColumn="0" w:firstRowLastColumn="0" w:lastRowFirstColumn="0" w:lastRowLastColumn="0"/>
+            </w:pPr>
+          </w:p>
+          <w:p>
+            <w:pPr>
+              <w:cnfStyle w:val="000000000000" w:firstRow="0" w:lastRow="0" w:firstColumn="0" w:lastColumn="0" w:oddVBand="0" w:evenVBand="0" w:oddHBand="0" w:evenHBand="0" w:firstRowFirstColumn="0" w:firstRowLastColumn="0" w:lastRowFirstColumn="0" w:lastRowLastColumn="0"/>
+            </w:pPr>
+            <w:r>
+              <w:t xml:space="preserve">If there is more DOP than DIP it would suggest mineralization of DIP to DOP is happening or DOP is being leached from allochthonous organic material </w:t>
+            </w:r>
+            <w:r>
+              <w:fldChar w:fldCharType="begin" w:fldLock="1"/>
+            </w:r>
+            <w:r>
+              <w:instrText>ADDIN CSL_CITATION {"citationItems":[{"id":"ITEM-1","itemData":{"DOI":"10.5194/bg-16-3283-2019","ISSN":"17264189","abstract":"Glaciers and ice sheets host abundant and dynamic communities of microorganisms on the ice surface (supraglacial environments). Recently, it has been shown that Streptophyte glacier algae blooming on the surface ice of the south-western coast of the Greenland Ice Sheet are a significant contributor to the 15-year marked decrease in albedo. Currently, little is known about the constraints, such as nutrient availability, on this large-scale algal bloom. In this study, we investigate the relative abundances of dissolved inorganic and dissolved organic macronutrients (N and P) in these darkening surface ice environments. Three distinct ice surfaces, with low, medium and high visible impurity loadings, supraglacial stream water and cryoconite hole water, were sampled. Our results show a clear dominance of the organic phase in all ice surface samples containing low, medium and high visible impurity loadings, with 93% of the total dissolved nitrogen and 67% of the total dissolved phosphorus in the organic phase. Mean concentrations in low, medium and high visible impurity surface ice environments are 0.91, 0.62 and 1.0μM for dissolved inorganic nitrogen (DIN), 5.1, 11 and 14μM for dissolved organic nitrogen (DON), 0.03, 0.07 and 0.05μM for dissolved inorganic phosphorus (DIP) and 0.10, 0.15 and 0.12μM for dissolved organic phosphorus (DOP), respectively. DON concentrations in all three surface ice samples are significantly higher than DON concentrations in supraglacial streams and cryoconite hole water (0 and 0.7 μM, respectively). DOP concentrations are higher in all three surface ice samples compared to supraglacial streams and cryoconite hole water (0.07μM for both). Dissolved organic carbon (DOC) concentrations increase with the amount of visible impurities present (low: 83 μM, medium: 173μM and high: 242 μM) and are elevated compared to supraglacial streams and cryoconite hole water (30 and 50 μM, respectively). We speculate that the architecture of the weathering crust, which impacts on water flow paths and storage in the melting surface ice and/or the production of extracellular polymeric substances (EPS), containing both N and P in conjunction with C, is responsible for the temporary retention of DON and DOP in the melting surface ice. The unusual presence of measurable DIP and DIN, principally as NHC 4 , in the melting surface ice environments suggests that factors other than macronutrient limitation are controlling the extent and magnitude of the gla…","author":[{"dropping-particle":"","family":"Holland","given":"Alexandra T.","non-dropping-particle":"","parse-names":false,"suffix":""},{"dropping-particle":"","family":"Williamson","given":"Christopher J.","non-dropping-particle":"","parse-names":false,"suffix":""},{"dropping-particle":"","family":"Sgouridis","given":"Fotis","non-dropping-particle":"","parse-names":false,"suffix":""},{"dropping-particle":"","family":"Tedstone","given":"Andrew J.","non-dropping-particle":"","parse-names":false,"suffix":""},{"dropping-particle":"","family":"McCutcheon","given":"Jenine","non-dropping-particle":"","parse-names":false,"suffix":""},{"dropping-particle":"","family":"Cook","given":"Joseph M.","non-dropping-particle":"","parse-names":false,"suffix":""},{"dropping-particle":"","family":"Poniecka","given":"Ewa","non-dropping-particle":"","parse-names":false,"suffix":""},{"dropping-particle":"","family":"Yallop","given":"Marian L.","non-dropping-particle":"","parse-names":false,"suffix":""},{"dropping-particle":"","family":"Tranter","given":"Martyn","non-dropping-particle":"","parse-names":false,"suffix":""},{"dropping-particle":"","family":"Anesio","given":"Alexandre M.","non-dropping-particle":"","parse-names":false,"suffix":""}],"container-title":"Biogeosciences","id":"ITEM-1","issue":"16","issued":{"date-parts":[["2019"]]},"page":"3283-3296","title":"Dissolved organic nutrients dominate melting surface ice of the Dark Zone (Greenland Ice Sheet)","type":"article-journal","volume":"16"},"uris":["http://www.mendeley.com/documents/?uuid=89f48ff2-e944-4141-b569-bfde842c5ee9"]}],"mendeley":{"formattedCitation":"(Holland et al., 2019)","plainTextFormattedCitation":"(Holland et al., 2019)","previouslyFormattedCitation":"(Holland et al., 2019)"},"properties":{"noteIndex":0},"schema":"https://github.com/citation-style-language/schema/raw/master/csl-citation.json"}</w:instrText>
+            </w:r>
+            <w:r>
+              <w:fldChar w:fldCharType="separate"/>
+            </w:r>
+            <w:r>
+              <w:rPr>
+                <w:noProof/>
+              </w:rPr>
+              <w:t>(Holland et al., 2019)</w:t>
+            </w:r>
+            <w:r>
+              <w:fldChar w:fldCharType="end"/>
+            </w:r>
+            <w:r>
+              <w:t xml:space="preserve">.  </w:t>
+            </w:r>
+          </w:p>
+          <w:p>
+            <w:pPr>
+              <w:cnfStyle w:val="000000000000" w:firstRow="0" w:lastRow="0" w:firstColumn="0" w:lastColumn="0" w:oddVBand="0" w:evenVBand="0" w:oddHBand="0" w:evenHBand="0" w:firstRowFirstColumn="0" w:firstRowLastColumn="0" w:lastRowFirstColumn="0" w:lastRowLastColumn="0"/>
+            </w:pPr>
+          </w:p>
+          <w:p>
+            <w:pPr>
+              <w:cnfStyle w:val="000000000000" w:firstRow="0" w:lastRow="0" w:firstColumn="0" w:lastColumn="0" w:oddVBand="0" w:evenVBand="0" w:oddHBand="0" w:evenHBand="0" w:firstRowFirstColumn="0" w:firstRowLastColumn="0" w:lastRowFirstColumn="0" w:lastRowLastColumn="0"/>
+            </w:pPr>
+            <w:r>
+              <w:t xml:space="preserve">If we find less dissolved nutrients in meltwaters relative to melting ice we may suggest the nutrients are being retained in these environments. They may be retained within the weathering crust or within extracellular polymeric substances </w:t>
+            </w:r>
+            <w:r>
+              <w:fldChar w:fldCharType="begin" w:fldLock="1"/>
+            </w:r>
+            <w:r>
+              <w:instrText>ADDIN CSL_CITATION {"citationItems":[{"id":"ITEM-1","itemData":{"DOI":"10.5194/bg-16-3283-2019","ISSN":"17264189","abstract":"Glaciers and ice sheets host abundant and dynamic communities of microorganisms on the ice surface (supraglacial environments). Recently, it has been shown that Streptophyte glacier algae blooming on the surface ice of the south-western coast of the Greenland Ice Sheet are a significant contributor to the 15-year marked decrease in albedo. Currently, little is known about the constraints, such as nutrient availability, on this large-scale algal bloom. In this study, we investigate the relative abundances of dissolved inorganic and dissolved organic macronutrients (N and P) in these darkening surface ice environments. Three distinct ice surfaces, with low, medium and high visible impurity loadings, supraglacial stream water and cryoconite hole water, were sampled. Our results show a clear dominance of the organic phase in all ice surface samples containing low, medium and high visible impurity loadings, with 93% of the total dissolved nitrogen and 67% of the total dissolved phosphorus in the organic phase. Mean concentrations in low, medium and high visible impurity surface ice environments are 0.91, 0.62 and 1.0μM for dissolved inorganic nitrogen (DIN), 5.1, 11 and 14μM for dissolved organic nitrogen (DON), 0.03, 0.07 and 0.05μM for dissolved inorganic phosphorus (DIP) and 0.10, 0.15 and 0.12μM for dissolved organic phosphorus (DOP), respectively. DON concentrations in all three surface ice samples are significantly higher than DON concentrations in supraglacial streams and cryoconite hole water (0 and 0.7 μM, respectively). DOP concentrations are higher in all three surface ice samples compared to supraglacial streams and cryoconite hole water (0.07μM for both). Dissolved organic carbon (DOC) concentrations increase with the amount of visible impurities present (low: 83 μM, medium: 173μM and high: 242 μM) and are elevated compared to supraglacial streams and cryoconite hole water (30 and 50 μM, respectively). We speculate that the architecture of the weathering crust, which impacts on water flow paths and storage in the melting surface ice and/or the production of extracellular polymeric substances (EPS), containing both N and P in conjunction with C, is responsible for the temporary retention of DON and DOP in the melting surface ice. The unusual presence of measurable DIP and DIN, principally as NHC 4 , in the melting surface ice environments suggests that factors other than macronutrient limitation are controlling the extent and magnitude of the gla…","author":[{"dropping-particle":"","family":"Holland","given":"Alexandra T.","non-dropping-particle":"","parse-names":false,"suffix":""},{"dropping-particle":"","family":"Williamson","given":"Christopher J.","non-dropping-particle":"","parse-names":false,"suffix":""},{"dropping-particle":"","family":"Sgouridis","given":"Fotis","non-dropping-particle":"","parse-names":false,"suffix":""},{"dropping-particle":"","family":"Tedstone","given":"Andrew J.","non-dropping-particle":"","parse-names":false,"suffix":""},{"dropping-particle":"","family":"McCutcheon","given":"Jenine","non-dropping-particle":"","parse-names":false,"suffix":""},{"dropping-particle":"","family":"Cook","given":"Joseph M.","non-dropping-particle":"","parse-names":false,"suffix":""},{"dropping-particle":"","family":"Poniecka","given":"Ewa","non-dropping-particle":"","parse-names":false,"suffix":""},{"dropping-particle":"","family":"Yallop","given":"Marian L.","non-dropping-particle":"","parse-names":false,"suffix":""},{"dropping-particle":"","family":"Tranter","given":"Martyn","non-dropping-particle":"","parse-names":false,"suffix":""},{"dropping-particle":"","family":"Anesio","given":"Alexandre M.","non-dropping-particle":"","parse-names":false,"suffix":""}],"container-title":"Biogeosciences","id":"ITEM-1","issue":"16","issued":{"date-parts":[["2019"]]},"page":"3283-3296","title":"Dissolved organic nutrients dominate melting surface ice of the Dark Zone (Greenland Ice Sheet)","type":"article-journal","volume":"16"},"uris":["http://www.mendeley.com/documents/?uuid=89f48ff2-e944-4141-b569-bfde842c5ee9"]}],"mendeley":{"formattedCitation":"(Holland et al., 2019)","plainTextFormattedCitation":"(Holland et al., 2019)","previouslyFormattedCitation":"(Holland et al., 2019)"},"properties":{"noteIndex":0},"schema":"https://github.com/citation-style-language/schema/raw/master/csl-citation.json"}</w:instrText>
+            </w:r>
+            <w:r>
+              <w:fldChar w:fldCharType="separate"/>
+            </w:r>
+            <w:r>
+              <w:rPr>
+                <w:noProof/>
+              </w:rPr>
+              <w:t>(Holland et al., 2019)</w:t>
+            </w:r>
+            <w:r>
+              <w:fldChar w:fldCharType="end"/>
+            </w:r>
+          </w:p>
+          <w:p>
+            <w:pPr>
+              <w:cnfStyle w:val="000000000000" w:firstRow="0" w:lastRow="0" w:firstColumn="0" w:lastColumn="0" w:oddVBand="0" w:evenVBand="0" w:oddHBand="0" w:evenHBand="0" w:firstRowFirstColumn="0" w:firstRowLastColumn="0" w:lastRowFirstColumn="0" w:lastRowLastColumn="0"/>
+            </w:pPr>
+          </w:p>
+          <w:p>
+            <w:pPr>
+              <w:cnfStyle w:val="000000000000" w:firstRow="0" w:lastRow="0" w:firstColumn="0" w:lastColumn="0" w:oddVBand="0" w:evenVBand="0" w:oddHBand="0" w:evenHBand="0" w:firstRowFirstColumn="0" w:firstRowLastColumn="0" w:lastRowFirstColumn="0" w:lastRowLastColumn="0"/>
+            </w:pPr>
+            <w:r>
+              <w:t>Basically, if there is PO4 present, we might suggest there is something else limiting the communities (otherwise it would all be used up as soon as it was available).</w:t>
+            </w:r>
+          </w:p>
+        </w:tc>
+        <w:tc>
+          <w:tcPr>
+            <w:tcW w:w="829" w:type="pct"/>
+          </w:tcPr>
+          <w:p>
+            <w:pPr>
+              <w:cnfStyle w:val="000000000000" w:firstRow="0" w:lastRow="0" w:firstColumn="0" w:lastColumn="0" w:oddVBand="0" w:evenVBand="0" w:oddHBand="0" w:evenHBand="0" w:firstRowFirstColumn="0" w:firstRowLastColumn="0" w:lastRowFirstColumn="0" w:lastRowLastColumn="0"/>
+            </w:pPr>
+            <w:r>
+              <w:lastRenderedPageBreak/>
               <w:t xml:space="preserve">Snow: 0.77  </w:t>
             </w:r>
             <m:oMath>
@@ -2800,7 +3559,7 @@
         </w:tc>
         <w:tc>
           <w:tcPr>
-            <w:tcW w:w="5686" w:type="dxa"/>
+            <w:tcW w:w="1359" w:type="pct"/>
           </w:tcPr>
           <w:p>
             <w:pPr>
@@ -2859,22 +3618,175 @@
       <w:tr>
         <w:trPr>
           <w:cnfStyle w:val="000000100000" w:firstRow="0" w:lastRow="0" w:firstColumn="0" w:lastColumn="0" w:oddVBand="0" w:evenVBand="0" w:oddHBand="1" w:evenHBand="0" w:firstRowFirstColumn="0" w:firstRowLastColumn="0" w:lastRowFirstColumn="0" w:lastRowLastColumn="0"/>
-          <w:jc w:val="center"/>
         </w:trPr>
         <w:tc>
           <w:tcPr>
             <w:cnfStyle w:val="001000000000" w:firstRow="0" w:lastRow="0" w:firstColumn="1" w:lastColumn="0" w:oddVBand="0" w:evenVBand="0" w:oddHBand="0" w:evenHBand="0" w:firstRowFirstColumn="0" w:firstRowLastColumn="0" w:lastRowFirstColumn="0" w:lastRowLastColumn="0"/>
-            <w:tcW w:w="0" w:type="auto"/>
-          </w:tcPr>
-          <w:p>
-            <w:r>
-              <w:t>Nitrate (NO3 - anion)</w:t>
-            </w:r>
-          </w:p>
-        </w:tc>
-        <w:tc>
-          <w:tcPr>
-            <w:tcW w:w="5953" w:type="dxa"/>
+            <w:tcW w:w="681" w:type="pct"/>
+          </w:tcPr>
+          <w:p>
+            <w:r>
+              <w:t>Nitrate (NO3 - anion) (DIN)</w:t>
+            </w:r>
+          </w:p>
+        </w:tc>
+        <w:tc>
+          <w:tcPr>
+            <w:tcW w:w="2131" w:type="pct"/>
+          </w:tcPr>
+          <w:p>
+            <w:pPr>
+              <w:cnfStyle w:val="000000100000" w:firstRow="0" w:lastRow="0" w:firstColumn="0" w:lastColumn="0" w:oddVBand="0" w:evenVBand="0" w:oddHBand="1" w:evenHBand="0" w:firstRowFirstColumn="0" w:firstRowLastColumn="0" w:lastRowFirstColumn="0" w:lastRowLastColumn="0"/>
+            </w:pPr>
+            <w:r>
+              <w:t xml:space="preserve">Absence of NO3 (a dissolved inorganic nitrogen species) may suggest uptake by glacier microbes </w:t>
+            </w:r>
+            <w:r>
+              <w:fldChar w:fldCharType="begin" w:fldLock="1"/>
+            </w:r>
+            <w:r>
+              <w:instrText>ADDIN CSL_CITATION {"citationItems":[{"id":"ITEM-1","itemData":{"DOI":"10.5194/bg-16-3283-2019","ISSN":"17264189","abstract":"Glaciers and ice sheets host abundant and dynamic communities of microorganisms on the ice surface (supraglacial environments). Recently, it has been shown that Streptophyte glacier algae blooming on the surface ice of the south-western coast of the Greenland Ice Sheet are a significant contributor to the 15-year marked decrease in albedo. Currently, little is known about the constraints, such as nutrient availability, on this large-scale algal bloom. In this study, we investigate the relative abundances of dissolved inorganic and dissolved organic macronutrients (N and P) in these darkening surface ice environments. Three distinct ice surfaces, with low, medium and high visible impurity loadings, supraglacial stream water and cryoconite hole water, were sampled. Our results show a clear dominance of the organic phase in all ice surface samples containing low, medium and high visible impurity loadings, with 93% of the total dissolved nitrogen and 67% of the total dissolved phosphorus in the organic phase. Mean concentrations in low, medium and high visible impurity surface ice environments are 0.91, 0.62 and 1.0μM for dissolved inorganic nitrogen (DIN), 5.1, 11 and 14μM for dissolved organic nitrogen (DON), 0.03, 0.07 and 0.05μM for dissolved inorganic phosphorus (DIP) and 0.10, 0.15 and 0.12μM for dissolved organic phosphorus (DOP), respectively. DON concentrations in all three surface ice samples are significantly higher than DON concentrations in supraglacial streams and cryoconite hole water (0 and 0.7 μM, respectively). DOP concentrations are higher in all three surface ice samples compared to supraglacial streams and cryoconite hole water (0.07μM for both). Dissolved organic carbon (DOC) concentrations increase with the amount of visible impurities present (low: 83 μM, medium: 173μM and high: 242 μM) and are elevated compared to supraglacial streams and cryoconite hole water (30 and 50 μM, respectively). We speculate that the architecture of the weathering crust, which impacts on water flow paths and storage in the melting surface ice and/or the production of extracellular polymeric substances (EPS), containing both N and P in conjunction with C, is responsible for the temporary retention of DON and DOP in the melting surface ice. The unusual presence of measurable DIP and DIN, principally as NHC 4 , in the melting surface ice environments suggests that factors other than macronutrient limitation are controlling the extent and magnitude of the gla…","author":[{"dropping-particle":"","family":"Holland","given":"Alexandra T.","non-dropping-particle":"","parse-names":false,"suffix":""},{"dropping-particle":"","family":"Williamson","given":"Christopher J.","non-dropping-particle":"","parse-names":false,"suffix":""},{"dropping-particle":"","family":"Sgouridis","given":"Fotis","non-dropping-particle":"","parse-names":false,"suffix":""},{"dropping-particle":"","family":"Tedstone","given":"Andrew J.","non-dropping-particle":"","parse-names":false,"suffix":""},{"dropping-particle":"","family":"McCutcheon","given":"Jenine","non-dropping-particle":"","parse-names":false,"suffix":""},{"dropping-particle":"","family":"Cook","given":"Joseph M.","non-dropping-particle":"","parse-names":false,"suffix":""},{"dropping-particle":"","family":"Poniecka","given":"Ewa","non-dropping-particle":"","parse-names":false,"suffix":""},{"dropping-particle":"","family":"Yallop","given":"Marian L.","non-dropping-particle":"","parse-names":false,"suffix":""},{"dropping-particle":"","family":"Tranter","given":"Martyn","non-dropping-particle":"","parse-names":false,"suffix":""},{"dropping-particle":"","family":"Anesio","given":"Alexandre M.","non-dropping-particle":"","parse-names":false,"suffix":""}],"container-title":"Biogeosciences","id":"ITEM-1","issue":"16","issued":{"date-parts":[["2019"]]},"page":"3283-3296","title":"Dissolved organic nutrients dominate melting surface ice of the Dark Zone (Greenland Ice Sheet)","type":"article-journal","volume":"16"},"uris":["http://www.mendeley.com/documents/?uuid=89f48ff2-e944-4141-b569-bfde842c5ee9"]}],"mendeley":{"formattedCitation":"(Holland et al., 2019)","plainTextFormattedCitation":"(Holland et al., 2019)","previouslyFormattedCitation":"(Holland et al., 2019)"},"properties":{"noteIndex":0},"schema":"https://github.com/citation-style-language/schema/raw/master/csl-citation.json"}</w:instrText>
+            </w:r>
+            <w:r>
+              <w:fldChar w:fldCharType="separate"/>
+            </w:r>
+            <w:r>
+              <w:rPr>
+                <w:noProof/>
+              </w:rPr>
+              <w:t>(Holland et al., 2019)</w:t>
+            </w:r>
+            <w:r>
+              <w:fldChar w:fldCharType="end"/>
+            </w:r>
+            <w:r>
+              <w:t xml:space="preserve">.  If DIN + DON in samples is less than the DIN of melting ice then we can suggest nitrogen is being held within microbial biomass </w:t>
+            </w:r>
+            <w:r>
+              <w:fldChar w:fldCharType="begin" w:fldLock="1"/>
+            </w:r>
+            <w:r>
+              <w:instrText>ADDIN CSL_CITATION {"citationItems":[{"id":"ITEM-1","itemData":{"DOI":"10.5194/bg-16-3283-2019","ISSN":"17264189","abstract":"Glaciers and ice sheets host abundant and dynamic communities of microorganisms on the ice surface (supraglacial environments). Recently, it has been shown that Streptophyte glacier algae blooming on the surface ice of the south-western coast of the Greenland Ice Sheet are a significant contributor to the 15-year marked decrease in albedo. Currently, little is known about the constraints, such as nutrient availability, on this large-scale algal bloom. In this study, we investigate the relative abundances of dissolved inorganic and dissolved organic macronutrients (N and P) in these darkening surface ice environments. Three distinct ice surfaces, with low, medium and high visible impurity loadings, supraglacial stream water and cryoconite hole water, were sampled. Our results show a clear dominance of the organic phase in all ice surface samples containing low, medium and high visible impurity loadings, with 93% of the total dissolved nitrogen and 67% of the total dissolved phosphorus in the organic phase. Mean concentrations in low, medium and high visible impurity surface ice environments are 0.91, 0.62 and 1.0μM for dissolved inorganic nitrogen (DIN), 5.1, 11 and 14μM for dissolved organic nitrogen (DON), 0.03, 0.07 and 0.05μM for dissolved inorganic phosphorus (DIP) and 0.10, 0.15 and 0.12μM for dissolved organic phosphorus (DOP), respectively. DON concentrations in all three surface ice samples are significantly higher than DON concentrations in supraglacial streams and cryoconite hole water (0 and 0.7 μM, respectively). DOP concentrations are higher in all three surface ice samples compared to supraglacial streams and cryoconite hole water (0.07μM for both). Dissolved organic carbon (DOC) concentrations increase with the amount of visible impurities present (low: 83 μM, medium: 173μM and high: 242 μM) and are elevated compared to supraglacial streams and cryoconite hole water (30 and 50 μM, respectively). We speculate that the architecture of the weathering crust, which impacts on water flow paths and storage in the melting surface ice and/or the production of extracellular polymeric substances (EPS), containing both N and P in conjunction with C, is responsible for the temporary retention of DON and DOP in the melting surface ice. The unusual presence of measurable DIP and DIN, principally as NHC 4 , in the melting surface ice environments suggests that factors other than macronutrient limitation are controlling the extent and magnitude of the gla…","author":[{"dropping-particle":"","family":"Holland","given":"Alexandra T.","non-dropping-particle":"","parse-names":false,"suffix":""},{"dropping-particle":"","family":"Williamson","given":"Christopher J.","non-dropping-particle":"","parse-names":false,"suffix":""},{"dropping-particle":"","family":"Sgouridis","given":"Fotis","non-dropping-particle":"","parse-names":false,"suffix":""},{"dropping-particle":"","family":"Tedstone","given":"Andrew J.","non-dropping-particle":"","parse-names":false,"suffix":""},{"dropping-particle":"","family":"McCutcheon","given":"Jenine","non-dropping-particle":"","parse-names":false,"suffix":""},{"dropping-particle":"","family":"Cook","given":"Joseph M.","non-dropping-particle":"","parse-names":false,"suffix":""},{"dropping-particle":"","family":"Poniecka","given":"Ewa","non-dropping-particle":"","parse-names":false,"suffix":""},{"dropping-particle":"","family":"Yallop","given":"Marian L.","non-dropping-particle":"","parse-names":false,"suffix":""},{"dropping-particle":"","family":"Tranter","given":"Martyn","non-dropping-particle":"","parse-names":false,"suffix":""},{"dropping-particle":"","family":"Anesio","given":"Alexandre M.","non-dropping-particle":"","parse-names":false,"suffix":""}],"container-title":"Biogeosciences","id":"ITEM-1","issue":"16","issued":{"date-parts":[["2019"]]},"page":"3283-3296","title":"Dissolved organic nutrients dominate melting surface ice of the Dark Zone (Greenland Ice Sheet)","type":"article-journal","volume":"16"},"uris":["http://www.mendeley.com/documents/?uuid=89f48ff2-e944-4141-b569-bfde842c5ee9"]}],"mendeley":{"formattedCitation":"(Holland et al., 2019)","plainTextFormattedCitation":"(Holland et al., 2019)","previouslyFormattedCitation":"(Holland et al., 2019)"},"properties":{"noteIndex":0},"schema":"https://github.com/citation-style-language/schema/raw/master/csl-citation.json"}</w:instrText>
+            </w:r>
+            <w:r>
+              <w:fldChar w:fldCharType="separate"/>
+            </w:r>
+            <w:r>
+              <w:rPr>
+                <w:noProof/>
+              </w:rPr>
+              <w:t>(Holland et al., 2019)</w:t>
+            </w:r>
+            <w:r>
+              <w:fldChar w:fldCharType="end"/>
+            </w:r>
+            <w:r>
+              <w:t>.</w:t>
+            </w:r>
+          </w:p>
+          <w:p>
+            <w:pPr>
+              <w:cnfStyle w:val="000000100000" w:firstRow="0" w:lastRow="0" w:firstColumn="0" w:lastColumn="0" w:oddVBand="0" w:evenVBand="0" w:oddHBand="1" w:evenHBand="0" w:firstRowFirstColumn="0" w:firstRowLastColumn="0" w:lastRowFirstColumn="0" w:lastRowLastColumn="0"/>
+            </w:pPr>
+          </w:p>
+          <w:p>
+            <w:pPr>
+              <w:cnfStyle w:val="000000100000" w:firstRow="0" w:lastRow="0" w:firstColumn="0" w:lastColumn="0" w:oddVBand="0" w:evenVBand="0" w:oddHBand="1" w:evenHBand="0" w:firstRowFirstColumn="0" w:firstRowLastColumn="0" w:lastRowFirstColumn="0" w:lastRowLastColumn="0"/>
+            </w:pPr>
+            <w:r>
+              <w:t xml:space="preserve">If there is more DON than DIN it would suggest mineralization of DIN to DON is happening  or DON is being leached from allochthonous organic material  </w:t>
+            </w:r>
+            <w:r>
+              <w:fldChar w:fldCharType="begin" w:fldLock="1"/>
+            </w:r>
+            <w:r>
+              <w:instrText>ADDIN CSL_CITATION {"citationItems":[{"id":"ITEM-1","itemData":{"DOI":"10.5194/bg-16-3283-2019","ISSN":"17264189","abstract":"Glaciers and ice sheets host abundant and dynamic communities of microorganisms on the ice surface (supraglacial environments). Recently, it has been shown that Streptophyte glacier algae blooming on the surface ice of the south-western coast of the Greenland Ice Sheet are a significant contributor to the 15-year marked decrease in albedo. Currently, little is known about the constraints, such as nutrient availability, on this large-scale algal bloom. In this study, we investigate the relative abundances of dissolved inorganic and dissolved organic macronutrients (N and P) in these darkening surface ice environments. Three distinct ice surfaces, with low, medium and high visible impurity loadings, supraglacial stream water and cryoconite hole water, were sampled. Our results show a clear dominance of the organic phase in all ice surface samples containing low, medium and high visible impurity loadings, with 93% of the total dissolved nitrogen and 67% of the total dissolved phosphorus in the organic phase. Mean concentrations in low, medium and high visible impurity surface ice environments are 0.91, 0.62 and 1.0μM for dissolved inorganic nitrogen (DIN), 5.1, 11 and 14μM for dissolved organic nitrogen (DON), 0.03, 0.07 and 0.05μM for dissolved inorganic phosphorus (DIP) and 0.10, 0.15 and 0.12μM for dissolved organic phosphorus (DOP), respectively. DON concentrations in all three surface ice samples are significantly higher than DON concentrations in supraglacial streams and cryoconite hole water (0 and 0.7 μM, respectively). DOP concentrations are higher in all three surface ice samples compared to supraglacial streams and cryoconite hole water (0.07μM for both). Dissolved organic carbon (DOC) concentrations increase with the amount of visible impurities present (low: 83 μM, medium: 173μM and high: 242 μM) and are elevated compared to supraglacial streams and cryoconite hole water (30 and 50 μM, respectively). We speculate that the architecture of the weathering crust, which impacts on water flow paths and storage in the melting surface ice and/or the production of extracellular polymeric substances (EPS), containing both N and P in conjunction with C, is responsible for the temporary retention of DON and DOP in the melting surface ice. The unusual presence of measurable DIP and DIN, principally as NHC 4 , in the melting surface ice environments suggests that factors other than macronutrient limitation are controlling the extent and magnitude of the gla…","author":[{"dropping-particle":"","family":"Holland","given":"Alexandra T.","non-dropping-particle":"","parse-names":false,"suffix":""},{"dropping-particle":"","family":"Williamson","given":"Christopher J.","non-dropping-particle":"","parse-names":false,"suffix":""},{"dropping-particle":"","family":"Sgouridis","given":"Fotis","non-dropping-particle":"","parse-names":false,"suffix":""},{"dropping-particle":"","family":"Tedstone","given":"Andrew J.","non-dropping-particle":"","parse-names":false,"suffix":""},{"dropping-particle":"","family":"McCutcheon","given":"Jenine","non-dropping-particle":"","parse-names":false,"suffix":""},{"dropping-particle":"","family":"Cook","given":"Joseph M.","non-dropping-particle":"","parse-names":false,"suffix":""},{"dropping-particle":"","family":"Poniecka","given":"Ewa","non-dropping-particle":"","parse-names":false,"suffix":""},{"dropping-particle":"","family":"Yallop","given":"Marian L.","non-dropping-particle":"","parse-names":false,"suffix":""},{"dropping-particle":"","family":"Tranter","given":"Martyn","non-dropping-particle":"","parse-names":false,"suffix":""},{"dropping-particle":"","family":"Anesio","given":"Alexandre M.","non-dropping-particle":"","parse-names":false,"suffix":""}],"container-title":"Biogeosciences","id":"ITEM-1","issue":"16","issued":{"date-parts":[["2019"]]},"page":"3283-3296","title":"Dissolved organic nutrients dominate melting surface ice of the Dark Zone (Greenland Ice Sheet)","type":"article-journal","volume":"16"},"uris":["http://www.mendeley.com/documents/?uuid=89f48ff2-e944-4141-b569-bfde842c5ee9"]}],"mendeley":{"formattedCitation":"(Holland et al., 2019)","plainTextFormattedCitation":"(Holland et al., 2019)","previouslyFormattedCitation":"(Holland et al., 2019)"},"properties":{"noteIndex":0},"schema":"https://github.com/citation-style-language/schema/raw/master/csl-citation.json"}</w:instrText>
+            </w:r>
+            <w:r>
+              <w:fldChar w:fldCharType="separate"/>
+            </w:r>
+            <w:r>
+              <w:rPr>
+                <w:noProof/>
+              </w:rPr>
+              <w:t>(Holland et al., 2019)</w:t>
+            </w:r>
+            <w:r>
+              <w:fldChar w:fldCharType="end"/>
+            </w:r>
+            <w:r>
+              <w:t xml:space="preserve">.  </w:t>
+            </w:r>
+          </w:p>
+          <w:p>
+            <w:pPr>
+              <w:cnfStyle w:val="000000100000" w:firstRow="0" w:lastRow="0" w:firstColumn="0" w:lastColumn="0" w:oddVBand="0" w:evenVBand="0" w:oddHBand="1" w:evenHBand="0" w:firstRowFirstColumn="0" w:firstRowLastColumn="0" w:lastRowFirstColumn="0" w:lastRowLastColumn="0"/>
+            </w:pPr>
+          </w:p>
+          <w:p>
+            <w:pPr>
+              <w:cnfStyle w:val="000000100000" w:firstRow="0" w:lastRow="0" w:firstColumn="0" w:lastColumn="0" w:oddVBand="0" w:evenVBand="0" w:oddHBand="1" w:evenHBand="0" w:firstRowFirstColumn="0" w:firstRowLastColumn="0" w:lastRowFirstColumn="0" w:lastRowLastColumn="0"/>
+            </w:pPr>
+            <w:r>
+              <w:t xml:space="preserve">If we find less dissolved nutrients in meltwaters relative to melting ice we may suggest the nutrients are being retained in these environments </w:t>
+            </w:r>
+            <w:r>
+              <w:fldChar w:fldCharType="begin" w:fldLock="1"/>
+            </w:r>
+            <w:r>
+              <w:instrText>ADDIN CSL_CITATION {"citationItems":[{"id":"ITEM-1","itemData":{"DOI":"10.5194/bg-16-3283-2019","ISSN":"17264189","abstract":"Glaciers and ice sheets host abundant and dynamic communities of microorganisms on the ice surface (supraglacial environments). Recently, it has been shown that Streptophyte glacier algae blooming on the surface ice of the south-western coast of the Greenland Ice Sheet are a significant contributor to the 15-year marked decrease in albedo. Currently, little is known about the constraints, such as nutrient availability, on this large-scale algal bloom. In this study, we investigate the relative abundances of dissolved inorganic and dissolved organic macronutrients (N and P) in these darkening surface ice environments. Three distinct ice surfaces, with low, medium and high visible impurity loadings, supraglacial stream water and cryoconite hole water, were sampled. Our results show a clear dominance of the organic phase in all ice surface samples containing low, medium and high visible impurity loadings, with 93% of the total dissolved nitrogen and 67% of the total dissolved phosphorus in the organic phase. Mean concentrations in low, medium and high visible impurity surface ice environments are 0.91, 0.62 and 1.0μM for dissolved inorganic nitrogen (DIN), 5.1, 11 and 14μM for dissolved organic nitrogen (DON), 0.03, 0.07 and 0.05μM for dissolved inorganic phosphorus (DIP) and 0.10, 0.15 and 0.12μM for dissolved organic phosphorus (DOP), respectively. DON concentrations in all three surface ice samples are significantly higher than DON concentrations in supraglacial streams and cryoconite hole water (0 and 0.7 μM, respectively). DOP concentrations are higher in all three surface ice samples compared to supraglacial streams and cryoconite hole water (0.07μM for both). Dissolved organic carbon (DOC) concentrations increase with the amount of visible impurities present (low: 83 μM, medium: 173μM and high: 242 μM) and are elevated compared to supraglacial streams and cryoconite hole water (30 and 50 μM, respectively). We speculate that the architecture of the weathering crust, which impacts on water flow paths and storage in the melting surface ice and/or the production of extracellular polymeric substances (EPS), containing both N and P in conjunction with C, is responsible for the temporary retention of DON and DOP in the melting surface ice. The unusual presence of measurable DIP and DIN, principally as NHC 4 , in the melting surface ice environments suggests that factors other than macronutrient limitation are controlling the extent and magnitude of the gla…","author":[{"dropping-particle":"","family":"Holland","given":"Alexandra T.","non-dropping-particle":"","parse-names":false,"suffix":""},{"dropping-particle":"","family":"Williamson","given":"Christopher J.","non-dropping-particle":"","parse-names":false,"suffix":""},{"dropping-particle":"","family":"Sgouridis","given":"Fotis","non-dropping-particle":"","parse-names":false,"suffix":""},{"dropping-particle":"","family":"Tedstone","given":"Andrew J.","non-dropping-particle":"","parse-names":false,"suffix":""},{"dropping-particle":"","family":"McCutcheon","given":"Jenine","non-dropping-particle":"","parse-names":false,"suffix":""},{"dropping-particle":"","family":"Cook","given":"Joseph M.","non-dropping-particle":"","parse-names":false,"suffix":""},{"dropping-particle":"","family":"Poniecka","given":"Ewa","non-dropping-particle":"","parse-names":false,"suffix":""},{"dropping-particle":"","family":"Yallop","given":"Marian L.","non-dropping-particle":"","parse-names":false,"suffix":""},{"dropping-particle":"","family":"Tranter","given":"Martyn","non-dropping-particle":"","parse-names":false,"suffix":""},{"dropping-particle":"","family":"Anesio","given":"Alexandre M.","non-dropping-particle":"","parse-names":false,"suffix":""}],"container-title":"Biogeosciences","id":"ITEM-1","issue":"16","issued":{"date-parts":[["2019"]]},"page":"3283-3296","title":"Dissolved organic nutrients dominate melting surface ice of the Dark Zone (Greenland Ice Sheet)","type":"article-journal","volume":"16"},"uris":["http://www.mendeley.com/documents/?uuid=89f48ff2-e944-4141-b569-bfde842c5ee9"]}],"mendeley":{"formattedCitation":"(Holland et al., 2019)","plainTextFormattedCitation":"(Holland et al., 2019)","previouslyFormattedCitation":"(Holland et al., 2019)"},"properties":{"noteIndex":0},"schema":"https://github.com/citation-style-language/schema/raw/master/csl-citation.json"}</w:instrText>
+            </w:r>
+            <w:r>
+              <w:fldChar w:fldCharType="separate"/>
+            </w:r>
+            <w:r>
+              <w:rPr>
+                <w:noProof/>
+              </w:rPr>
+              <w:t>(Holland et al., 2019)</w:t>
+            </w:r>
+            <w:r>
+              <w:fldChar w:fldCharType="end"/>
+            </w:r>
+          </w:p>
+          <w:p>
+            <w:pPr>
+              <w:cnfStyle w:val="000000100000" w:firstRow="0" w:lastRow="0" w:firstColumn="0" w:lastColumn="0" w:oddVBand="0" w:evenVBand="0" w:oddHBand="1" w:evenHBand="0" w:firstRowFirstColumn="0" w:firstRowLastColumn="0" w:lastRowFirstColumn="0" w:lastRowLastColumn="0"/>
+            </w:pPr>
+          </w:p>
+          <w:p>
+            <w:pPr>
+              <w:cnfStyle w:val="000000100000" w:firstRow="0" w:lastRow="0" w:firstColumn="0" w:lastColumn="0" w:oddVBand="0" w:evenVBand="0" w:oddHBand="1" w:evenHBand="0" w:firstRowFirstColumn="0" w:firstRowLastColumn="0" w:lastRowFirstColumn="0" w:lastRowLastColumn="0"/>
+            </w:pPr>
+            <w:r>
+              <w:t xml:space="preserve">If NO3 is below the level of detection, we might suggest it is taken up by phototrophs </w:t>
+            </w:r>
+            <w:r>
+              <w:fldChar w:fldCharType="begin" w:fldLock="1"/>
+            </w:r>
+            <w:r>
+              <w:instrText>ADDIN CSL_CITATION {"citationItems":[{"id":"ITEM-1","itemData":{"DOI":"10.5194/bg-16-3283-2019","ISSN":"17264189","abstract":"Glaciers and ice sheets host abundant and dynamic communities of microorganisms on the ice surface (supraglacial environments). Recently, it has been shown that Streptophyte glacier algae blooming on the surface ice of the south-western coast of the Greenland Ice Sheet are a significant contributor to the 15-year marked decrease in albedo. Currently, little is known about the constraints, such as nutrient availability, on this large-scale algal bloom. In this study, we investigate the relative abundances of dissolved inorganic and dissolved organic macronutrients (N and P) in these darkening surface ice environments. Three distinct ice surfaces, with low, medium and high visible impurity loadings, supraglacial stream water and cryoconite hole water, were sampled. Our results show a clear dominance of the organic phase in all ice surface samples containing low, medium and high visible impurity loadings, with 93% of the total dissolved nitrogen and 67% of the total dissolved phosphorus in the organic phase. Mean concentrations in low, medium and high visible impurity surface ice environments are 0.91, 0.62 and 1.0μM for dissolved inorganic nitrogen (DIN), 5.1, 11 and 14μM for dissolved organic nitrogen (DON), 0.03, 0.07 and 0.05μM for dissolved inorganic phosphorus (DIP) and 0.10, 0.15 and 0.12μM for dissolved organic phosphorus (DOP), respectively. DON concentrations in all three surface ice samples are significantly higher than DON concentrations in supraglacial streams and cryoconite hole water (0 and 0.7 μM, respectively). DOP concentrations are higher in all three surface ice samples compared to supraglacial streams and cryoconite hole water (0.07μM for both). Dissolved organic carbon (DOC) concentrations increase with the amount of visible impurities present (low: 83 μM, medium: 173μM and high: 242 μM) and are elevated compared to supraglacial streams and cryoconite hole water (30 and 50 μM, respectively). We speculate that the architecture of the weathering crust, which impacts on water flow paths and storage in the melting surface ice and/or the production of extracellular polymeric substances (EPS), containing both N and P in conjunction with C, is responsible for the temporary retention of DON and DOP in the melting surface ice. The unusual presence of measurable DIP and DIN, principally as NHC 4 , in the melting surface ice environments suggests that factors other than macronutrient limitation are controlling the extent and magnitude of the gla…","author":[{"dropping-particle":"","family":"Holland","given":"Alexandra T.","non-dropping-particle":"","parse-names":false,"suffix":""},{"dropping-particle":"","family":"Williamson","given":"Christopher J.","non-dropping-particle":"","parse-names":false,"suffix":""},{"dropping-particle":"","family":"Sgouridis","given":"Fotis","non-dropping-particle":"","parse-names":false,"suffix":""},{"dropping-particle":"","family":"Tedstone","given":"Andrew J.","non-dropping-particle":"","parse-names":false,"suffix":""},{"dropping-particle":"","family":"McCutcheon","given":"Jenine","non-dropping-particle":"","parse-names":false,"suffix":""},{"dropping-particle":"","family":"Cook","given":"Joseph M.","non-dropping-particle":"","parse-names":false,"suffix":""},{"dropping-particle":"","family":"Poniecka","given":"Ewa","non-dropping-particle":"","parse-names":false,"suffix":""},{"dropping-particle":"","family":"Yallop","given":"Marian L.","non-dropping-particle":"","parse-names":false,"suffix":""},{"dropping-particle":"","family":"Tranter","given":"Martyn","non-dropping-particle":"","parse-names":false,"suffix":""},{"dropping-particle":"","family":"Anesio","given":"Alexandre M.","non-dropping-particle":"","parse-names":false,"suffix":""}],"container-title":"Biogeosciences","id":"ITEM-1","issue":"16","issued":{"date-parts":[["2019"]]},"page":"3283-3296","title":"Dissolved organic nutrients dominate melting surface ice of the Dark Zone (Greenland Ice Sheet)","type":"article-journal","volume":"16"},"uris":["http://www.mendeley.com/documents/?uuid=89f48ff2-e944-4141-b569-bfde842c5ee9"]}],"mendeley":{"formattedCitation":"(Holland et al., 2019)","plainTextFormattedCitation":"(Holland et al., 2019)","previouslyFormattedCitation":"(Holland et al., 2019)"},"properties":{"noteIndex":0},"schema":"https://github.com/citation-style-language/schema/raw/master/csl-citation.json"}</w:instrText>
+            </w:r>
+            <w:r>
+              <w:fldChar w:fldCharType="separate"/>
+            </w:r>
+            <w:r>
+              <w:rPr>
+                <w:noProof/>
+              </w:rPr>
+              <w:t>(Holland et al., 2019)</w:t>
+            </w:r>
+            <w:r>
+              <w:fldChar w:fldCharType="end"/>
+            </w:r>
+            <w:r>
+              <w:t xml:space="preserve">. </w:t>
+            </w:r>
+          </w:p>
+        </w:tc>
+        <w:tc>
+          <w:tcPr>
+            <w:tcW w:w="829" w:type="pct"/>
           </w:tcPr>
           <w:p>
             <w:pPr>
@@ -3068,7 +3980,7 @@
               <w:rPr>
                 <w:vertAlign w:val="superscript"/>
               </w:rPr>
-              <w:instrText>ADDIN CSL_CITATION {"citationItems":[{"id":"ITEM-1","itemData":{"DOI":"10.1038/s41467-020-20627-w","ISSN":"20411723","abstract":"Melting of the Greenland Ice Sheet is a leading cause of land-ice mass loss and cryosphere-attributed sea level rise. Blooms of pigmented glacier ice algae lower ice albedo and accelerate surface melting in the ice sheet’s southwest sector. Although glacier ice algae cause up to 13% of the surface melting in this region, the controls on bloom development remain poorly understood. Here we show a direct link between mineral phosphorus in surface ice and glacier ice algae biomass through the quantification of solid and fluid phase phosphorus reservoirs in surface habitats across the southwest ablation zone of the ice sheet. We demonstrate that nutrients from mineral dust likely drive glacier ice algal growth, and thereby identify mineral dust as a secondary control on ice sheet melting.","author":[{"dropping-particle":"","family":"McCutcheon","given":"Jenine","non-dropping-particle":"","parse-names":false,"suffix":""},{"dropping-particle":"","family":"Lutz","given":"Stefanie","non-dropping-particle":"","parse-names":false,"suffix":""},{"dropping-particle":"","family":"Williamson","given":"Christopher","non-dropping-particle":"","parse-names":false,"suffix":""},{"dropping-particle":"","family":"Cook","given":"Joseph M.","non-dropping-particle":"","parse-names":false,"suffix":""},{"dropping-particle":"","family":"Tedstone","given":"Andrew J.","non-dropping-particle":"","parse-names":false,"suffix":""},{"dropping-particle":"","family":"Vanderstraeten","given":"Aubry","non-dropping-particle":"","parse-names":false,"suffix":""},{"dropping-particle":"","family":"Wilson","given":"Siobhan A.","non-dropping-particle":"","parse-names":false,"suffix":""},{"dropping-particle":"","family":"Stockdale","given":"Anthony","non-dropping-particle":"","parse-names":false,"suffix":""},{"dropping-particle":"","family":"Bonneville","given":"Steeve","non-dropping-particle":"","parse-names":false,"suffix":""},{"dropping-particle":"","family":"Anesio","given":"Alexandre M.","non-dropping-particle":"","parse-names":false,"suffix":""},{"dropping-particle":"","family":"Yallop","given":"Marian L.","non-dropping-particle":"","parse-names":false,"suffix":""},{"dropping-particle":"","family":"McQuaid","given":"James B.","non-dropping-particle":"","parse-names":false,"suffix":""},{"dropping-particle":"","family":"Tranter","given":"Martyn","non-dropping-particle":"","parse-names":false,"suffix":""},{"dropping-particle":"","family":"Benning","given":"Liane G.","non-dropping-particle":"","parse-names":false,"suffix":""}],"container-title":"Nature Communications","id":"ITEM-1","issue":"1","issued":{"date-parts":[["2021"]]},"page":"1-11","publisher":"Springer US","title":"Mineral phosphorus drives glacier algal blooms on the Greenland Ice Sheet","type":"article-journal","volume":"12"},"uris":["http://www.mendeley.com/documents/?uuid=48651b01-3d31-491b-b6cf-d3e21f9151d9"]}],"mendeley":{"formattedCitation":"(McCutcheon et al., 2021)","plainTextFormattedCitation":"(McCutcheon et al., 2021)"},"properties":{"noteIndex":0},"schema":"https://github.com/citation-style-language/schema/raw/master/csl-citation.json"}</w:instrText>
+              <w:instrText>ADDIN CSL_CITATION {"citationItems":[{"id":"ITEM-1","itemData":{"DOI":"10.1038/s41467-020-20627-w","ISSN":"20411723","abstract":"Melting of the Greenland Ice Sheet is a leading cause of land-ice mass loss and cryosphere-attributed sea level rise. Blooms of pigmented glacier ice algae lower ice albedo and accelerate surface melting in the ice sheet’s southwest sector. Although glacier ice algae cause up to 13% of the surface melting in this region, the controls on bloom development remain poorly understood. Here we show a direct link between mineral phosphorus in surface ice and glacier ice algae biomass through the quantification of solid and fluid phase phosphorus reservoirs in surface habitats across the southwest ablation zone of the ice sheet. We demonstrate that nutrients from mineral dust likely drive glacier ice algal growth, and thereby identify mineral dust as a secondary control on ice sheet melting.","author":[{"dropping-particle":"","family":"McCutcheon","given":"Jenine","non-dropping-particle":"","parse-names":false,"suffix":""},{"dropping-particle":"","family":"Lutz","given":"Stefanie","non-dropping-particle":"","parse-names":false,"suffix":""},{"dropping-particle":"","family":"Williamson","given":"Christopher","non-dropping-particle":"","parse-names":false,"suffix":""},{"dropping-particle":"","family":"Cook","given":"Joseph M.","non-dropping-particle":"","parse-names":false,"suffix":""},{"dropping-particle":"","family":"Tedstone","given":"Andrew J.","non-dropping-particle":"","parse-names":false,"suffix":""},{"dropping-particle":"","family":"Vanderstraeten","given":"Aubry","non-dropping-particle":"","parse-names":false,"suffix":""},{"dropping-particle":"","family":"Wilson","given":"Siobhan A.","non-dropping-particle":"","parse-names":false,"suffix":""},{"dropping-particle":"","family":"Stockdale","given":"Anthony","non-dropping-particle":"","parse-names":false,"suffix":""},{"dropping-particle":"","family":"Bonneville","given":"Steeve","non-dropping-particle":"","parse-names":false,"suffix":""},{"dropping-particle":"","family":"Anesio","given":"Alexandre M.","non-dropping-particle":"","parse-names":false,"suffix":""},{"dropping-particle":"","family":"Yallop","given":"Marian L.","non-dropping-particle":"","parse-names":false,"suffix":""},{"dropping-particle":"","family":"McQuaid","given":"James B.","non-dropping-particle":"","parse-names":false,"suffix":""},{"dropping-particle":"","family":"Tranter","given":"Martyn","non-dropping-particle":"","parse-names":false,"suffix":""},{"dropping-particle":"","family":"Benning","given":"Liane G.","non-dropping-particle":"","parse-names":false,"suffix":""}],"container-title":"Nature Communications","id":"ITEM-1","issue":"1","issued":{"date-parts":[["2021"]]},"page":"1-11","publisher":"Springer US","title":"Mineral phosphorus drives glacier algal blooms on the Greenland Ice Sheet","type":"article-journal","volume":"12"},"uris":["http://www.mendeley.com/documents/?uuid=48651b01-3d31-491b-b6cf-d3e21f9151d9"]}],"mendeley":{"formattedCitation":"(McCutcheon et al., 2021)","plainTextFormattedCitation":"(McCutcheon et al., 2021)","previouslyFormattedCitation":"(McCutcheon et al., 2021)"},"properties":{"noteIndex":0},"schema":"https://github.com/citation-style-language/schema/raw/master/csl-citation.json"}</w:instrText>
             </w:r>
             <w:r>
               <w:rPr>
@@ -3092,7 +4004,7 @@
         </w:tc>
         <w:tc>
           <w:tcPr>
-            <w:tcW w:w="5686" w:type="dxa"/>
+            <w:tcW w:w="1359" w:type="pct"/>
           </w:tcPr>
           <w:p>
             <w:pPr>
@@ -3156,21 +4068,89 @@
             <w:r>
               <w:t>IC (outsource) (Bradley email)</w:t>
             </w:r>
+          </w:p>
+        </w:tc>
+      </w:tr>
+      <w:tr>
+        <w:tc>
+          <w:tcPr>
+            <w:cnfStyle w:val="001000000000" w:firstRow="0" w:lastRow="0" w:firstColumn="1" w:lastColumn="0" w:oddVBand="0" w:evenVBand="0" w:oddHBand="0" w:evenHBand="0" w:firstRowFirstColumn="0" w:firstRowLastColumn="0" w:lastRowFirstColumn="0" w:lastRowLastColumn="0"/>
+            <w:tcW w:w="681" w:type="pct"/>
+          </w:tcPr>
+          <w:p>
+            <w:r>
+              <w:t>NO2 (DIN)</w:t>
+            </w:r>
+          </w:p>
+        </w:tc>
+        <w:tc>
+          <w:tcPr>
+            <w:tcW w:w="2131" w:type="pct"/>
+          </w:tcPr>
+          <w:p>
+            <w:pPr>
+              <w:cnfStyle w:val="000000000000" w:firstRow="0" w:lastRow="0" w:firstColumn="0" w:lastColumn="0" w:oddVBand="0" w:evenVBand="0" w:oddHBand="0" w:evenHBand="0" w:firstRowFirstColumn="0" w:firstRowLastColumn="0" w:lastRowFirstColumn="0" w:lastRowLastColumn="0"/>
+            </w:pPr>
+            <w:r>
+              <w:t xml:space="preserve">If NO2 is below the level of detection, we might suggest it is taken up by phototrophs </w:t>
+            </w:r>
+            <w:r>
+              <w:fldChar w:fldCharType="begin" w:fldLock="1"/>
+            </w:r>
+            <w:r>
+              <w:instrText>ADDIN CSL_CITATION {"citationItems":[{"id":"ITEM-1","itemData":{"DOI":"10.5194/bg-16-3283-2019","ISSN":"17264189","abstract":"Glaciers and ice sheets host abundant and dynamic communities of microorganisms on the ice surface (supraglacial environments). Recently, it has been shown that Streptophyte glacier algae blooming on the surface ice of the south-western coast of the Greenland Ice Sheet are a significant contributor to the 15-year marked decrease in albedo. Currently, little is known about the constraints, such as nutrient availability, on this large-scale algal bloom. In this study, we investigate the relative abundances of dissolved inorganic and dissolved organic macronutrients (N and P) in these darkening surface ice environments. Three distinct ice surfaces, with low, medium and high visible impurity loadings, supraglacial stream water and cryoconite hole water, were sampled. Our results show a clear dominance of the organic phase in all ice surface samples containing low, medium and high visible impurity loadings, with 93% of the total dissolved nitrogen and 67% of the total dissolved phosphorus in the organic phase. Mean concentrations in low, medium and high visible impurity surface ice environments are 0.91, 0.62 and 1.0μM for dissolved inorganic nitrogen (DIN), 5.1, 11 and 14μM for dissolved organic nitrogen (DON), 0.03, 0.07 and 0.05μM for dissolved inorganic phosphorus (DIP) and 0.10, 0.15 and 0.12μM for dissolved organic phosphorus (DOP), respectively. DON concentrations in all three surface ice samples are significantly higher than DON concentrations in supraglacial streams and cryoconite hole water (0 and 0.7 μM, respectively). DOP concentrations are higher in all three surface ice samples compared to supraglacial streams and cryoconite hole water (0.07μM for both). Dissolved organic carbon (DOC) concentrations increase with the amount of visible impurities present (low: 83 μM, medium: 173μM and high: 242 μM) and are elevated compared to supraglacial streams and cryoconite hole water (30 and 50 μM, respectively). We speculate that the architecture of the weathering crust, which impacts on water flow paths and storage in the melting surface ice and/or the production of extracellular polymeric substances (EPS), containing both N and P in conjunction with C, is responsible for the temporary retention of DON and DOP in the melting surface ice. The unusual presence of measurable DIP and DIN, principally as NHC 4 , in the melting surface ice environments suggests that factors other than macronutrient limitation are controlling the extent and magnitude of the gla…","author":[{"dropping-particle":"","family":"Holland","given":"Alexandra T.","non-dropping-particle":"","parse-names":false,"suffix":""},{"dropping-particle":"","family":"Williamson","given":"Christopher J.","non-dropping-particle":"","parse-names":false,"suffix":""},{"dropping-particle":"","family":"Sgouridis","given":"Fotis","non-dropping-particle":"","parse-names":false,"suffix":""},{"dropping-particle":"","family":"Tedstone","given":"Andrew J.","non-dropping-particle":"","parse-names":false,"suffix":""},{"dropping-particle":"","family":"McCutcheon","given":"Jenine","non-dropping-particle":"","parse-names":false,"suffix":""},{"dropping-particle":"","family":"Cook","given":"Joseph M.","non-dropping-particle":"","parse-names":false,"suffix":""},{"dropping-particle":"","family":"Poniecka","given":"Ewa","non-dropping-particle":"","parse-names":false,"suffix":""},{"dropping-particle":"","family":"Yallop","given":"Marian L.","non-dropping-particle":"","parse-names":false,"suffix":""},{"dropping-particle":"","family":"Tranter","given":"Martyn","non-dropping-particle":"","parse-names":false,"suffix":""},{"dropping-particle":"","family":"Anesio","given":"Alexandre M.","non-dropping-particle":"","parse-names":false,"suffix":""}],"container-title":"Biogeosciences","id":"ITEM-1","issue":"16","issued":{"date-parts":[["2019"]]},"page":"3283-3296","title":"Dissolved organic nutrients dominate melting surface ice of the Dark Zone (Greenland Ice Sheet)","type":"article-journal","volume":"16"},"uris":["http://www.mendeley.com/documents/?uuid=89f48ff2-e944-4141-b569-bfde842c5ee9"]}],"mendeley":{"formattedCitation":"(Holland et al., 2019)","plainTextFormattedCitation":"(Holland et al., 2019)","previouslyFormattedCitation":"(Holland et al., 2019)"},"properties":{"noteIndex":0},"schema":"https://github.com/citation-style-language/schema/raw/master/csl-citation.json"}</w:instrText>
+            </w:r>
+            <w:r>
+              <w:fldChar w:fldCharType="separate"/>
+            </w:r>
+            <w:r>
+              <w:rPr>
+                <w:noProof/>
+              </w:rPr>
+              <w:t>(Holland et al., 2019)</w:t>
+            </w:r>
+            <w:r>
+              <w:fldChar w:fldCharType="end"/>
+            </w:r>
+            <w:r>
+              <w:t>.</w:t>
+            </w:r>
+          </w:p>
+        </w:tc>
+        <w:tc>
+          <w:tcPr>
+            <w:tcW w:w="829" w:type="pct"/>
+          </w:tcPr>
+          <w:p>
+            <w:pPr>
+              <w:cnfStyle w:val="000000000000" w:firstRow="0" w:lastRow="0" w:firstColumn="0" w:lastColumn="0" w:oddVBand="0" w:evenVBand="0" w:oddHBand="0" w:evenHBand="0" w:firstRowFirstColumn="0" w:firstRowLastColumn="0" w:lastRowFirstColumn="0" w:lastRowLastColumn="0"/>
+            </w:pPr>
+          </w:p>
+        </w:tc>
+        <w:tc>
+          <w:tcPr>
+            <w:tcW w:w="1359" w:type="pct"/>
+          </w:tcPr>
+          <w:p>
+            <w:pPr>
+              <w:cnfStyle w:val="000000000000" w:firstRow="0" w:lastRow="0" w:firstColumn="0" w:lastColumn="0" w:oddVBand="0" w:evenVBand="0" w:oddHBand="0" w:evenHBand="0" w:firstRowFirstColumn="0" w:firstRowLastColumn="0" w:lastRowFirstColumn="0" w:lastRowLastColumn="0"/>
+            </w:pPr>
           </w:p>
         </w:tc>
       </w:tr>
       <w:tr>
         <w:trPr>
-          <w:jc w:val="center"/>
+          <w:cnfStyle w:val="000000100000" w:firstRow="0" w:lastRow="0" w:firstColumn="0" w:lastColumn="0" w:oddVBand="0" w:evenVBand="0" w:oddHBand="1" w:evenHBand="0" w:firstRowFirstColumn="0" w:firstRowLastColumn="0" w:lastRowFirstColumn="0" w:lastRowLastColumn="0"/>
         </w:trPr>
         <w:tc>
           <w:tcPr>
             <w:cnfStyle w:val="001000000000" w:firstRow="0" w:lastRow="0" w:firstColumn="1" w:lastColumn="0" w:oddVBand="0" w:evenVBand="0" w:oddHBand="0" w:evenHBand="0" w:firstRowFirstColumn="0" w:firstRowLastColumn="0" w:lastRowFirstColumn="0" w:lastRowLastColumn="0"/>
-            <w:tcW w:w="0" w:type="auto"/>
+            <w:tcW w:w="681" w:type="pct"/>
           </w:tcPr>
           <w:p>
             <w:proofErr w:type="spellStart"/>
             <w:r>
+              <w:lastRenderedPageBreak/>
               <w:t>Sulfate</w:t>
             </w:r>
             <w:proofErr w:type="spellEnd"/>
@@ -3181,11 +4161,75 @@
         </w:tc>
         <w:tc>
           <w:tcPr>
-            <w:tcW w:w="5953" w:type="dxa"/>
-          </w:tcPr>
-          <w:p>
-            <w:pPr>
-              <w:cnfStyle w:val="000000000000" w:firstRow="0" w:lastRow="0" w:firstColumn="0" w:lastColumn="0" w:oddVBand="0" w:evenVBand="0" w:oddHBand="0" w:evenHBand="0" w:firstRowFirstColumn="0" w:firstRowLastColumn="0" w:lastRowFirstColumn="0" w:lastRowLastColumn="0"/>
+            <w:tcW w:w="2131" w:type="pct"/>
+          </w:tcPr>
+          <w:p>
+            <w:pPr>
+              <w:cnfStyle w:val="000000100000" w:firstRow="0" w:lastRow="0" w:firstColumn="0" w:lastColumn="0" w:oddVBand="0" w:evenVBand="0" w:oddHBand="1" w:evenHBand="0" w:firstRowFirstColumn="0" w:firstRowLastColumn="0" w:lastRowFirstColumn="0" w:lastRowLastColumn="0"/>
+            </w:pPr>
+            <w:r>
+              <w:t>Sulphate is used by sulphate-reducing bacteria to degrade organic matter, as SO</w:t>
+            </w:r>
+            <w:r>
+              <w:rPr>
+                <w:vertAlign w:val="subscript"/>
+              </w:rPr>
+              <w:t>4</w:t>
+            </w:r>
+            <w:r>
+              <w:rPr>
+                <w:vertAlign w:val="superscript"/>
+              </w:rPr>
+              <w:t>2-</w:t>
+            </w:r>
+            <w:r>
+              <w:rPr>
+                <w:vertAlign w:val="superscript"/>
+              </w:rPr>
+              <w:t xml:space="preserve">  </w:t>
+            </w:r>
+            <w:r>
+              <w:t>a</w:t>
+            </w:r>
+            <w:r>
+              <w:t>c</w:t>
+            </w:r>
+            <w:r>
+              <w:t>ts</w:t>
+            </w:r>
+            <w:r>
+              <w:t xml:space="preserve"> as a terminal electron acceptor </w:t>
+            </w:r>
+            <w:r>
+              <w:fldChar w:fldCharType="begin" w:fldLock="1"/>
+            </w:r>
+            <w:r>
+              <w:instrText>ADDIN CSL_CITATION {"citationItems":[{"id":"ITEM-1","itemData":{"DOI":"10.1038/nrmicro1892","ISSN":"17401526","PMID":"18461075","abstract":"Sulphate-reducing bacteria (SRB) are anaerobic microorganisms that use sulphate as a terminal electron acceptor in, for example, the degradation of organic compounds. They are ubiquitous in anoxic habitats, where they have an important role in both the sulphur and carbon cycles. SRB can cause a serious problem for industries, such as the offshore oil industry, because of the production of sulphide, which is highly reactive, corrosive and toxic. However, these organisms can also be beneficial by removing sulphate and heavy metals from waste streams. Although SRB have been studied for more than a century, it is only with the recent emergence of new molecular biological and genomic techniques that we have begun to obtain detailed information on their way of life.","author":[{"dropping-particle":"","family":"Muyzer","given":"Gerard","non-dropping-particle":"","parse-names":false,"suffix":""},{"dropping-particle":"","family":"Stams","given":"Alfons J.M.","non-dropping-particle":"","parse-names":false,"suffix":""}],"container-title":"Nature Reviews Microbiology","id":"ITEM-1","issue":"6","issued":{"date-parts":[["2008"]]},"page":"441-454","title":"The ecology and biotechnology of sulphate-reducing bacteria","type":"article-journal","volume":"6"},"uris":["http://www.mendeley.com/documents/?uuid=13aa294d-e4e0-4d1f-af23-1521509e993d"]}],"mendeley":{"formattedCitation":"(Muyzer and Stams, 2008)","plainTextFormattedCitation":"(Muyzer and Stams, 2008)","previouslyFormattedCitation":"(Muyzer and Stams, 2008)"},"properties":{"noteIndex":0},"schema":"https://github.com/citation-style-language/schema/raw/master/csl-citation.json"}</w:instrText>
+            </w:r>
+            <w:r>
+              <w:fldChar w:fldCharType="separate"/>
+            </w:r>
+            <w:r>
+              <w:rPr>
+                <w:noProof/>
+              </w:rPr>
+              <w:t>(Muyzer and Stams, 2008)</w:t>
+            </w:r>
+            <w:r>
+              <w:fldChar w:fldCharType="end"/>
+            </w:r>
+            <w:r>
+              <w:t xml:space="preserve"> </w:t>
+            </w:r>
+          </w:p>
+        </w:tc>
+        <w:tc>
+          <w:tcPr>
+            <w:tcW w:w="829" w:type="pct"/>
+          </w:tcPr>
+          <w:p>
+            <w:pPr>
+              <w:cnfStyle w:val="000000100000" w:firstRow="0" w:lastRow="0" w:firstColumn="0" w:lastColumn="0" w:oddVBand="0" w:evenVBand="0" w:oddHBand="1" w:evenHBand="0" w:firstRowFirstColumn="0" w:firstRowLastColumn="0" w:lastRowFirstColumn="0" w:lastRowLastColumn="0"/>
             </w:pPr>
             <w:r>
               <w:t xml:space="preserve">Snow: 13  </w:t>
@@ -3222,7 +4266,7 @@
           </w:p>
           <w:p>
             <w:pPr>
-              <w:cnfStyle w:val="000000000000" w:firstRow="0" w:lastRow="0" w:firstColumn="0" w:lastColumn="0" w:oddVBand="0" w:evenVBand="0" w:oddHBand="0" w:evenHBand="0" w:firstRowFirstColumn="0" w:firstRowLastColumn="0" w:lastRowFirstColumn="0" w:lastRowLastColumn="0"/>
+              <w:cnfStyle w:val="000000100000" w:firstRow="0" w:lastRow="0" w:firstColumn="0" w:lastColumn="0" w:oddVBand="0" w:evenVBand="0" w:oddHBand="1" w:evenHBand="0" w:firstRowFirstColumn="0" w:firstRowLastColumn="0" w:lastRowFirstColumn="0" w:lastRowLastColumn="0"/>
             </w:pPr>
             <w:r>
               <w:t>Ice: 0.11-0.23 mg L</w:t>
@@ -3257,7 +4301,7 @@
           </w:p>
           <w:p>
             <w:pPr>
-              <w:cnfStyle w:val="000000000000" w:firstRow="0" w:lastRow="0" w:firstColumn="0" w:lastColumn="0" w:oddVBand="0" w:evenVBand="0" w:oddHBand="0" w:evenHBand="0" w:firstRowFirstColumn="0" w:firstRowLastColumn="0" w:lastRowFirstColumn="0" w:lastRowLastColumn="0"/>
+              <w:cnfStyle w:val="000000100000" w:firstRow="0" w:lastRow="0" w:firstColumn="0" w:lastColumn="0" w:oddVBand="0" w:evenVBand="0" w:oddHBand="1" w:evenHBand="0" w:firstRowFirstColumn="0" w:firstRowLastColumn="0" w:lastRowFirstColumn="0" w:lastRowLastColumn="0"/>
             </w:pPr>
             <w:r>
               <w:t xml:space="preserve">Ice: 1.0 </w:t>
@@ -3313,7 +4357,7 @@
           </w:p>
           <w:p>
             <w:pPr>
-              <w:cnfStyle w:val="000000000000" w:firstRow="0" w:lastRow="0" w:firstColumn="0" w:lastColumn="0" w:oddVBand="0" w:evenVBand="0" w:oddHBand="0" w:evenHBand="0" w:firstRowFirstColumn="0" w:firstRowLastColumn="0" w:lastRowFirstColumn="0" w:lastRowLastColumn="0"/>
+              <w:cnfStyle w:val="000000100000" w:firstRow="0" w:lastRow="0" w:firstColumn="0" w:lastColumn="0" w:oddVBand="0" w:evenVBand="0" w:oddHBand="1" w:evenHBand="0" w:firstRowFirstColumn="0" w:firstRowLastColumn="0" w:lastRowFirstColumn="0" w:lastRowLastColumn="0"/>
             </w:pPr>
             <w:r>
               <w:t>Snow: 0.02-0.03 mg L</w:t>
@@ -3349,11 +4393,11 @@
         </w:tc>
         <w:tc>
           <w:tcPr>
-            <w:tcW w:w="5686" w:type="dxa"/>
-          </w:tcPr>
-          <w:p>
-            <w:pPr>
-              <w:cnfStyle w:val="000000000000" w:firstRow="0" w:lastRow="0" w:firstColumn="0" w:lastColumn="0" w:oddVBand="0" w:evenVBand="0" w:oddHBand="0" w:evenHBand="0" w:firstRowFirstColumn="0" w:firstRowLastColumn="0" w:lastRowFirstColumn="0" w:lastRowLastColumn="0"/>
+            <w:tcW w:w="1359" w:type="pct"/>
+          </w:tcPr>
+          <w:p>
+            <w:pPr>
+              <w:cnfStyle w:val="000000100000" w:firstRow="0" w:lastRow="0" w:firstColumn="0" w:lastColumn="0" w:oddVBand="0" w:evenVBand="0" w:oddHBand="1" w:evenHBand="0" w:firstRowFirstColumn="0" w:firstRowLastColumn="0" w:lastRowFirstColumn="0" w:lastRowLastColumn="0"/>
             </w:pPr>
             <w:r>
               <w:t xml:space="preserve">IC LOD = 121 ppb </w:t>
@@ -3379,7 +4423,7 @@
           </w:p>
           <w:p>
             <w:pPr>
-              <w:cnfStyle w:val="000000000000" w:firstRow="0" w:lastRow="0" w:firstColumn="0" w:lastColumn="0" w:oddVBand="0" w:evenVBand="0" w:oddHBand="0" w:evenHBand="0" w:firstRowFirstColumn="0" w:firstRowLastColumn="0" w:lastRowFirstColumn="0" w:lastRowLastColumn="0"/>
+              <w:cnfStyle w:val="000000100000" w:firstRow="0" w:lastRow="0" w:firstColumn="0" w:lastColumn="0" w:oddVBand="0" w:evenVBand="0" w:oddHBand="1" w:evenHBand="0" w:firstRowFirstColumn="0" w:firstRowLastColumn="0" w:lastRowFirstColumn="0" w:lastRowLastColumn="0"/>
             </w:pPr>
             <w:r>
               <w:t xml:space="preserve">IC (Dionex-ICS2500) LOD = </w:t>
@@ -3411,7 +4455,7 @@
           </w:p>
           <w:p>
             <w:pPr>
-              <w:cnfStyle w:val="000000000000" w:firstRow="0" w:lastRow="0" w:firstColumn="0" w:lastColumn="0" w:oddVBand="0" w:evenVBand="0" w:oddHBand="0" w:evenHBand="0" w:firstRowFirstColumn="0" w:firstRowLastColumn="0" w:lastRowFirstColumn="0" w:lastRowLastColumn="0"/>
+              <w:cnfStyle w:val="000000100000" w:firstRow="0" w:lastRow="0" w:firstColumn="0" w:lastColumn="0" w:oddVBand="0" w:evenVBand="0" w:oddHBand="1" w:evenHBand="0" w:firstRowFirstColumn="0" w:firstRowLastColumn="0" w:lastRowFirstColumn="0" w:lastRowLastColumn="0"/>
             </w:pPr>
             <w:r>
               <w:t>IC (outsource) (Bradley email)</w:t>
@@ -3420,14 +4464,10 @@
         </w:tc>
       </w:tr>
       <w:tr>
-        <w:trPr>
-          <w:cnfStyle w:val="000000100000" w:firstRow="0" w:lastRow="0" w:firstColumn="0" w:lastColumn="0" w:oddVBand="0" w:evenVBand="0" w:oddHBand="1" w:evenHBand="0" w:firstRowFirstColumn="0" w:firstRowLastColumn="0" w:lastRowFirstColumn="0" w:lastRowLastColumn="0"/>
-          <w:jc w:val="center"/>
-        </w:trPr>
         <w:tc>
           <w:tcPr>
             <w:cnfStyle w:val="001000000000" w:firstRow="0" w:lastRow="0" w:firstColumn="1" w:lastColumn="0" w:oddVBand="0" w:evenVBand="0" w:oddHBand="0" w:evenHBand="0" w:firstRowFirstColumn="0" w:firstRowLastColumn="0" w:lastRowFirstColumn="0" w:lastRowLastColumn="0"/>
-            <w:tcW w:w="0" w:type="auto"/>
+            <w:tcW w:w="681" w:type="pct"/>
           </w:tcPr>
           <w:p>
             <w:r>
@@ -3437,11 +4477,42 @@
         </w:tc>
         <w:tc>
           <w:tcPr>
-            <w:tcW w:w="5953" w:type="dxa"/>
-          </w:tcPr>
-          <w:p>
-            <w:pPr>
-              <w:cnfStyle w:val="000000100000" w:firstRow="0" w:lastRow="0" w:firstColumn="0" w:lastColumn="0" w:oddVBand="0" w:evenVBand="0" w:oddHBand="1" w:evenHBand="0" w:firstRowFirstColumn="0" w:firstRowLastColumn="0" w:lastRowFirstColumn="0" w:lastRowLastColumn="0"/>
+            <w:tcW w:w="2131" w:type="pct"/>
+          </w:tcPr>
+          <w:p>
+            <w:pPr>
+              <w:cnfStyle w:val="000000000000" w:firstRow="0" w:lastRow="0" w:firstColumn="0" w:lastColumn="0" w:oddVBand="0" w:evenVBand="0" w:oddHBand="0" w:evenHBand="0" w:firstRowFirstColumn="0" w:firstRowLastColumn="0" w:lastRowFirstColumn="0" w:lastRowLastColumn="0"/>
+            </w:pPr>
+            <w:r>
+              <w:t xml:space="preserve">Calcium ions are involved in the maintenance of cell structure, in cell differentiation processes (sporulation, heterocyst) – so it’s important for microbial dormancy! </w:t>
+            </w:r>
+            <w:r>
+              <w:fldChar w:fldCharType="begin" w:fldLock="1"/>
+            </w:r>
+            <w:r>
+              <w:instrText>ADDIN CSL_CITATION {"citationItems":[{"id":"ITEM-1","itemData":{"DOI":"10.1111/j.1365-2958.2004.04276.x","ISSN":"0950382X","PMID":"15469503","abstract":"Whereas the importance of calcium as a cell regulator is well established in eukaryotes, the role of calcium in prokaryotes is still elusive. Over the past few years, there has been an increased interest in the role of calcium in bacteria. It has been demonstrated that as in eukaryotic organisms, the intracellular calcium concentration in prokaryotes is tightly regulated ranging from 100 to 300 nM. It has been found that calcium ions are involved in the maintenance of cell structure, motility, transport and cell differentiation processes such as sporulation, heterocyst formation and fruiting body development. In addition, a number of calcium-binding proteins have been isolated in several prokaryotic organisms. The characterization of these proteins and the identification of other factors suggest the possibility that calcium signal transduction exists in bacteria. This review presents recent developments of calcium in bacteria as it relates to signal transduction.","author":[{"dropping-particle":"","family":"Dominguez","given":"Delfina C.","non-dropping-particle":"","parse-names":false,"suffix":""}],"container-title":"Molecular Microbiology","id":"ITEM-1","issue":"2","issued":{"date-parts":[["2004"]]},"page":"291-297","title":"Calcium signalling in bacteria","type":"article-journal","volume":"54"},"uris":["http://www.mendeley.com/documents/?uuid=3390dce5-0b73-461f-b29b-27a6019baf92"]}],"mendeley":{"formattedCitation":"(Dominguez, 2004)","plainTextFormattedCitation":"(Dominguez, 2004)"},"properties":{"noteIndex":0},"schema":"https://github.com/citation-style-language/schema/raw/master/csl-citation.json"}</w:instrText>
+            </w:r>
+            <w:r>
+              <w:fldChar w:fldCharType="separate"/>
+            </w:r>
+            <w:r>
+              <w:rPr>
+                <w:noProof/>
+              </w:rPr>
+              <w:t>(Dominguez, 2004)</w:t>
+            </w:r>
+            <w:r>
+              <w:fldChar w:fldCharType="end"/>
+            </w:r>
+          </w:p>
+        </w:tc>
+        <w:tc>
+          <w:tcPr>
+            <w:tcW w:w="829" w:type="pct"/>
+          </w:tcPr>
+          <w:p>
+            <w:pPr>
+              <w:cnfStyle w:val="000000000000" w:firstRow="0" w:lastRow="0" w:firstColumn="0" w:lastColumn="0" w:oddVBand="0" w:evenVBand="0" w:oddHBand="0" w:evenHBand="0" w:firstRowFirstColumn="0" w:firstRowLastColumn="0" w:lastRowFirstColumn="0" w:lastRowLastColumn="0"/>
             </w:pPr>
             <w:r>
               <w:t xml:space="preserve">Snow: 381  </w:t>
@@ -3478,7 +4549,7 @@
           </w:p>
           <w:p>
             <w:pPr>
-              <w:cnfStyle w:val="000000100000" w:firstRow="0" w:lastRow="0" w:firstColumn="0" w:lastColumn="0" w:oddVBand="0" w:evenVBand="0" w:oddHBand="1" w:evenHBand="0" w:firstRowFirstColumn="0" w:firstRowLastColumn="0" w:lastRowFirstColumn="0" w:lastRowLastColumn="0"/>
+              <w:cnfStyle w:val="000000000000" w:firstRow="0" w:lastRow="0" w:firstColumn="0" w:lastColumn="0" w:oddVBand="0" w:evenVBand="0" w:oddHBand="0" w:evenHBand="0" w:firstRowFirstColumn="0" w:firstRowLastColumn="0" w:lastRowFirstColumn="0" w:lastRowLastColumn="0"/>
             </w:pPr>
             <w:r>
               <w:t>Ice: 2.93-3.46 mg L</w:t>
@@ -3513,7 +4584,7 @@
           </w:p>
           <w:p>
             <w:pPr>
-              <w:cnfStyle w:val="000000100000" w:firstRow="0" w:lastRow="0" w:firstColumn="0" w:lastColumn="0" w:oddVBand="0" w:evenVBand="0" w:oddHBand="1" w:evenHBand="0" w:firstRowFirstColumn="0" w:firstRowLastColumn="0" w:lastRowFirstColumn="0" w:lastRowLastColumn="0"/>
+              <w:cnfStyle w:val="000000000000" w:firstRow="0" w:lastRow="0" w:firstColumn="0" w:lastColumn="0" w:oddVBand="0" w:evenVBand="0" w:oddHBand="0" w:evenHBand="0" w:firstRowFirstColumn="0" w:firstRowLastColumn="0" w:lastRowFirstColumn="0" w:lastRowLastColumn="0"/>
             </w:pPr>
             <w:r>
               <w:t xml:space="preserve">Ice: 4.0 </w:t>
@@ -3569,7 +4640,7 @@
           </w:p>
           <w:p>
             <w:pPr>
-              <w:cnfStyle w:val="000000100000" w:firstRow="0" w:lastRow="0" w:firstColumn="0" w:lastColumn="0" w:oddVBand="0" w:evenVBand="0" w:oddHBand="1" w:evenHBand="0" w:firstRowFirstColumn="0" w:firstRowLastColumn="0" w:lastRowFirstColumn="0" w:lastRowLastColumn="0"/>
+              <w:cnfStyle w:val="000000000000" w:firstRow="0" w:lastRow="0" w:firstColumn="0" w:lastColumn="0" w:oddVBand="0" w:evenVBand="0" w:oddHBand="0" w:evenHBand="0" w:firstRowFirstColumn="0" w:firstRowLastColumn="0" w:lastRowFirstColumn="0" w:lastRowLastColumn="0"/>
             </w:pPr>
             <w:r>
               <w:t>Snow: 0.09-0.13 mg L</w:t>
@@ -3604,10 +4675,9 @@
           </w:p>
           <w:p>
             <w:pPr>
-              <w:cnfStyle w:val="000000100000" w:firstRow="0" w:lastRow="0" w:firstColumn="0" w:lastColumn="0" w:oddVBand="0" w:evenVBand="0" w:oddHBand="1" w:evenHBand="0" w:firstRowFirstColumn="0" w:firstRowLastColumn="0" w:lastRowFirstColumn="0" w:lastRowLastColumn="0"/>
-            </w:pPr>
-            <w:r>
-              <w:lastRenderedPageBreak/>
+              <w:cnfStyle w:val="000000000000" w:firstRow="0" w:lastRow="0" w:firstColumn="0" w:lastColumn="0" w:oddVBand="0" w:evenVBand="0" w:oddHBand="0" w:evenHBand="0" w:firstRowFirstColumn="0" w:firstRowLastColumn="0" w:lastRowFirstColumn="0" w:lastRowLastColumn="0"/>
+            </w:pPr>
+            <w:r>
               <w:t>Ice: 0.01 mg L</w:t>
             </w:r>
             <w:r>
@@ -3632,7 +4702,7 @@
               <w:rPr>
                 <w:vertAlign w:val="superscript"/>
               </w:rPr>
-              <w:instrText>ADDIN CSL_CITATION {"citationItems":[{"id":"ITEM-1","itemData":{"DOI":"10.1038/s41467-020-20627-w","ISSN":"20411723","abstract":"Melting of the Greenland Ice Sheet is a leading cause of land-ice mass loss and cryosphere-attributed sea level rise. Blooms of pigmented glacier ice algae lower ice albedo and accelerate surface melting in the ice sheet’s southwest sector. Although glacier ice algae cause up to 13% of the surface melting in this region, the controls on bloom development remain poorly understood. Here we show a direct link between mineral phosphorus in surface ice and glacier ice algae biomass through the quantification of solid and fluid phase phosphorus reservoirs in surface habitats across the southwest ablation zone of the ice sheet. We demonstrate that nutrients from mineral dust likely drive glacier ice algal growth, and thereby identify mineral dust as a secondary control on ice sheet melting.","author":[{"dropping-particle":"","family":"McCutcheon","given":"Jenine","non-dropping-particle":"","parse-names":false,"suffix":""},{"dropping-particle":"","family":"Lutz","given":"Stefanie","non-dropping-particle":"","parse-names":false,"suffix":""},{"dropping-particle":"","family":"Williamson","given":"Christopher","non-dropping-particle":"","parse-names":false,"suffix":""},{"dropping-particle":"","family":"Cook","given":"Joseph M.","non-dropping-particle":"","parse-names":false,"suffix":""},{"dropping-particle":"","family":"Tedstone","given":"Andrew J.","non-dropping-particle":"","parse-names":false,"suffix":""},{"dropping-particle":"","family":"Vanderstraeten","given":"Aubry","non-dropping-particle":"","parse-names":false,"suffix":""},{"dropping-particle":"","family":"Wilson","given":"Siobhan A.","non-dropping-particle":"","parse-names":false,"suffix":""},{"dropping-particle":"","family":"Stockdale","given":"Anthony","non-dropping-particle":"","parse-names":false,"suffix":""},{"dropping-particle":"","family":"Bonneville","given":"Steeve","non-dropping-particle":"","parse-names":false,"suffix":""},{"dropping-particle":"","family":"Anesio","given":"Alexandre M.","non-dropping-particle":"","parse-names":false,"suffix":""},{"dropping-particle":"","family":"Yallop","given":"Marian L.","non-dropping-particle":"","parse-names":false,"suffix":""},{"dropping-particle":"","family":"McQuaid","given":"James B.","non-dropping-particle":"","parse-names":false,"suffix":""},{"dropping-particle":"","family":"Tranter","given":"Martyn","non-dropping-particle":"","parse-names":false,"suffix":""},{"dropping-particle":"","family":"Benning","given":"Liane G.","non-dropping-particle":"","parse-names":false,"suffix":""}],"container-title":"Nature Communications","id":"ITEM-1","issue":"1","issued":{"date-parts":[["2021"]]},"page":"1-11","publisher":"Springer US","title":"Mineral phosphorus drives glacier algal blooms on the Greenland Ice Sheet","type":"article-journal","volume":"12"},"uris":["http://www.mendeley.com/documents/?uuid=48651b01-3d31-491b-b6cf-d3e21f9151d9"]}],"mendeley":{"formattedCitation":"(McCutcheon et al., 2021)","plainTextFormattedCitation":"(McCutcheon et al., 2021)"},"properties":{"noteIndex":0},"schema":"https://github.com/citation-style-language/schema/raw/master/csl-citation.json"}</w:instrText>
+              <w:instrText>ADDIN CSL_CITATION {"citationItems":[{"id":"ITEM-1","itemData":{"DOI":"10.1038/s41467-020-20627-w","ISSN":"20411723","abstract":"Melting of the Greenland Ice Sheet is a leading cause of land-ice mass loss and cryosphere-attributed sea level rise. Blooms of pigmented glacier ice algae lower ice albedo and accelerate surface melting in the ice sheet’s southwest sector. Although glacier ice algae cause up to 13% of the surface melting in this region, the controls on bloom development remain poorly understood. Here we show a direct link between mineral phosphorus in surface ice and glacier ice algae biomass through the quantification of solid and fluid phase phosphorus reservoirs in surface habitats across the southwest ablation zone of the ice sheet. We demonstrate that nutrients from mineral dust likely drive glacier ice algal growth, and thereby identify mineral dust as a secondary control on ice sheet melting.","author":[{"dropping-particle":"","family":"McCutcheon","given":"Jenine","non-dropping-particle":"","parse-names":false,"suffix":""},{"dropping-particle":"","family":"Lutz","given":"Stefanie","non-dropping-particle":"","parse-names":false,"suffix":""},{"dropping-particle":"","family":"Williamson","given":"Christopher","non-dropping-particle":"","parse-names":false,"suffix":""},{"dropping-particle":"","family":"Cook","given":"Joseph M.","non-dropping-particle":"","parse-names":false,"suffix":""},{"dropping-particle":"","family":"Tedstone","given":"Andrew J.","non-dropping-particle":"","parse-names":false,"suffix":""},{"dropping-particle":"","family":"Vanderstraeten","given":"Aubry","non-dropping-particle":"","parse-names":false,"suffix":""},{"dropping-particle":"","family":"Wilson","given":"Siobhan A.","non-dropping-particle":"","parse-names":false,"suffix":""},{"dropping-particle":"","family":"Stockdale","given":"Anthony","non-dropping-particle":"","parse-names":false,"suffix":""},{"dropping-particle":"","family":"Bonneville","given":"Steeve","non-dropping-particle":"","parse-names":false,"suffix":""},{"dropping-particle":"","family":"Anesio","given":"Alexandre M.","non-dropping-particle":"","parse-names":false,"suffix":""},{"dropping-particle":"","family":"Yallop","given":"Marian L.","non-dropping-particle":"","parse-names":false,"suffix":""},{"dropping-particle":"","family":"McQuaid","given":"James B.","non-dropping-particle":"","parse-names":false,"suffix":""},{"dropping-particle":"","family":"Tranter","given":"Martyn","non-dropping-particle":"","parse-names":false,"suffix":""},{"dropping-particle":"","family":"Benning","given":"Liane G.","non-dropping-particle":"","parse-names":false,"suffix":""}],"container-title":"Nature Communications","id":"ITEM-1","issue":"1","issued":{"date-parts":[["2021"]]},"page":"1-11","publisher":"Springer US","title":"Mineral phosphorus drives glacier algal blooms on the Greenland Ice Sheet","type":"article-journal","volume":"12"},"uris":["http://www.mendeley.com/documents/?uuid=48651b01-3d31-491b-b6cf-d3e21f9151d9"]}],"mendeley":{"formattedCitation":"(McCutcheon et al., 2021)","plainTextFormattedCitation":"(McCutcheon et al., 2021)","previouslyFormattedCitation":"(McCutcheon et al., 2021)"},"properties":{"noteIndex":0},"schema":"https://github.com/citation-style-language/schema/raw/master/csl-citation.json"}</w:instrText>
             </w:r>
             <w:r>
               <w:rPr>
@@ -3656,14 +4726,13 @@
         </w:tc>
         <w:tc>
           <w:tcPr>
-            <w:tcW w:w="5686" w:type="dxa"/>
-          </w:tcPr>
-          <w:p>
-            <w:pPr>
-              <w:cnfStyle w:val="000000100000" w:firstRow="0" w:lastRow="0" w:firstColumn="0" w:lastColumn="0" w:oddVBand="0" w:evenVBand="0" w:oddHBand="1" w:evenHBand="0" w:firstRowFirstColumn="0" w:firstRowLastColumn="0" w:lastRowFirstColumn="0" w:lastRowLastColumn="0"/>
-            </w:pPr>
-            <w:r>
-              <w:lastRenderedPageBreak/>
+            <w:tcW w:w="1359" w:type="pct"/>
+          </w:tcPr>
+          <w:p>
+            <w:pPr>
+              <w:cnfStyle w:val="000000000000" w:firstRow="0" w:lastRow="0" w:firstColumn="0" w:lastColumn="0" w:oddVBand="0" w:evenVBand="0" w:oddHBand="0" w:evenHBand="0" w:firstRowFirstColumn="0" w:firstRowLastColumn="0" w:lastRowFirstColumn="0" w:lastRowLastColumn="0"/>
+            </w:pPr>
+            <w:r>
               <w:t xml:space="preserve">ICP-MS LOD = 1 ppb </w:t>
             </w:r>
             <w:r>
@@ -3680,299 +4749,6 @@
                 <w:noProof/>
               </w:rPr>
               <w:t>(Lutz et al., 2016)</w:t>
-            </w:r>
-            <w:r>
-              <w:fldChar w:fldCharType="end"/>
-            </w:r>
-          </w:p>
-          <w:p>
-            <w:pPr>
-              <w:cnfStyle w:val="000000100000" w:firstRow="0" w:lastRow="0" w:firstColumn="0" w:lastColumn="0" w:oddVBand="0" w:evenVBand="0" w:oddHBand="1" w:evenHBand="0" w:firstRowFirstColumn="0" w:firstRowLastColumn="0" w:lastRowFirstColumn="0" w:lastRowLastColumn="0"/>
-            </w:pPr>
-            <w:r>
-              <w:t>IC (outsource) (Bradley email)</w:t>
-            </w:r>
-          </w:p>
-        </w:tc>
-      </w:tr>
-      <w:tr>
-        <w:trPr>
-          <w:jc w:val="center"/>
-        </w:trPr>
-        <w:tc>
-          <w:tcPr>
-            <w:cnfStyle w:val="001000000000" w:firstRow="0" w:lastRow="0" w:firstColumn="1" w:lastColumn="0" w:oddVBand="0" w:evenVBand="0" w:oddHBand="0" w:evenHBand="0" w:firstRowFirstColumn="0" w:firstRowLastColumn="0" w:lastRowFirstColumn="0" w:lastRowLastColumn="0"/>
-            <w:tcW w:w="0" w:type="auto"/>
-          </w:tcPr>
-          <w:p>
-            <w:r>
-              <w:t>Chloride (</w:t>
-            </w:r>
-            <w:proofErr w:type="gramStart"/>
-            <w:r>
-              <w:t>Cl  -</w:t>
-            </w:r>
-            <w:proofErr w:type="gramEnd"/>
-            <w:r>
-              <w:t xml:space="preserve"> anion)</w:t>
-            </w:r>
-          </w:p>
-        </w:tc>
-        <w:tc>
-          <w:tcPr>
-            <w:tcW w:w="5953" w:type="dxa"/>
-          </w:tcPr>
-          <w:p>
-            <w:pPr>
-              <w:cnfStyle w:val="000000000000" w:firstRow="0" w:lastRow="0" w:firstColumn="0" w:lastColumn="0" w:oddVBand="0" w:evenVBand="0" w:oddHBand="0" w:evenHBand="0" w:firstRowFirstColumn="0" w:firstRowLastColumn="0" w:lastRowFirstColumn="0" w:lastRowLastColumn="0"/>
-            </w:pPr>
-            <w:r>
-              <w:t xml:space="preserve">Snow:  136-381 ppb </w:t>
-            </w:r>
-            <w:r>
-              <w:fldChar w:fldCharType="begin" w:fldLock="1"/>
-            </w:r>
-            <w:r>
-              <w:instrText>ADDIN CSL_CITATION {"citationItems":[{"id":"ITEM-1","itemData":{"DOI":"10.1038/ncomms11968","ISSN":"20411723","PMID":"27329445","abstract":"The Arctic is melting at an unprecedented rate and key drivers are changes in snow and ice albedo. Here we show that red snow, a common algal habitat blooming after the onset of melting, plays a crucial role in decreasing albedo. Our data reveal that red pigmented snow algae are cosmopolitan as well as independent of location-specific geochemical and mineralogical factors. The patterns for snow algal diversity, pigmentation and, consequently albedo, are ubiquitous across the Arctic and the reduction in albedo accelerates snow melt and increases the time and area of exposed bare ice. We estimated that the overall decrease in snow albedo by red pigmented snow algal blooms over the course of one melt season can be 13%. This will invariably result in higher melt rates. We argue that such a 'bio-albedo' effect has to be considered in climate models.","author":[{"dropping-particle":"","family":"Lutz","given":"Stefanie","non-dropping-particle":"","parse-names":false,"suffix":""},{"dropping-particle":"","family":"Anesio","given":"Alexandre M.","non-dropping-particle":"","parse-names":false,"suffix":""},{"dropping-particle":"","family":"Raiswell","given":"Rob","non-dropping-particle":"","parse-names":false,"suffix":""},{"dropping-particle":"","family":"Edwards","given":"Arwyn","non-dropping-particle":"","parse-names":false,"suffix":""},{"dropping-particle":"","family":"Newton","given":"Rob J.","non-dropping-particle":"","parse-names":false,"suffix":""},{"dropping-particle":"","family":"Gill","given":"Fiona","non-dropping-particle":"","parse-names":false,"suffix":""},{"dropping-particle":"","family":"Benning","given":"Liane G.","non-dropping-particle":"","parse-names":false,"suffix":""}],"container-title":"Nature Communications","id":"ITEM-1","issue":"May","issued":{"date-parts":[["2016"]]},"page":"1-9","publisher":"Nature Publishing Group","title":"The biogeography of red snow microbiomes and their role in melting arctic glaciers","type":"article-journal","volume":"7"},"uris":["http://www.mendeley.com/documents/?uuid=9020975f-8089-46fa-98be-ed55a0e364fb"]}],"mendeley":{"formattedCitation":"(Lutz et al., 2016)","plainTextFormattedCitation":"(Lutz et al., 2016)","previouslyFormattedCitation":"(Lutz et al., 2016)"},"properties":{"noteIndex":0},"schema":"https://github.com/citation-style-language/schema/raw/master/csl-citation.json"}</w:instrText>
-            </w:r>
-            <w:r>
-              <w:fldChar w:fldCharType="separate"/>
-            </w:r>
-            <w:r>
-              <w:rPr>
-                <w:noProof/>
-              </w:rPr>
-              <w:t>(Lutz et al., 2016)</w:t>
-            </w:r>
-            <w:r>
-              <w:fldChar w:fldCharType="end"/>
-            </w:r>
-          </w:p>
-          <w:p>
-            <w:pPr>
-              <w:cnfStyle w:val="000000000000" w:firstRow="0" w:lastRow="0" w:firstColumn="0" w:lastColumn="0" w:oddVBand="0" w:evenVBand="0" w:oddHBand="0" w:evenHBand="0" w:firstRowFirstColumn="0" w:firstRowLastColumn="0" w:lastRowFirstColumn="0" w:lastRowLastColumn="0"/>
-            </w:pPr>
-            <w:r>
-              <w:t>Ice: 0.49 – 0.80 mg L</w:t>
-            </w:r>
-            <w:r>
-              <w:rPr>
-                <w:vertAlign w:val="superscript"/>
-              </w:rPr>
-              <w:t>-1</w:t>
-            </w:r>
-            <w:r>
-              <w:t xml:space="preserve"> </w:t>
-            </w:r>
-            <w:r>
-              <w:fldChar w:fldCharType="begin" w:fldLock="1"/>
-            </w:r>
-            <w:r>
-              <w:instrText>ADDIN CSL_CITATION {"citationItems":[{"id":"ITEM-1","itemData":{"DOI":"10.1007/s00792-015-0764-z","ISSN":"14334909","PMID":"26104673","abstract":"Surface ice and cryoconite holes of two types of polythermal Svalbard Glaciers (Hans Glacier—grounded tidewater glacier and Werenskiold Glacier—land-based valley glacier) were investigated in terms of chemical composition, microbial abundance and diversity. Gathered data served to describe supraglacial habitats and to compare microbe–environment interactions on those different type glaciers. Hans Glacier samples displayed elevated nutrient levels (DOC, nitrogen and seston) compared to Werenskiold Glacier. Adjacent tundra formations, bird nesting sites and marine aerosol were candidates for allochtonic enrichment sources. Microbial numbers were comparable on both glaciers, with surface ice containing cells in the range of 10&lt;sup&gt;4&lt;/sup&gt; mL&lt;sup&gt;−1&lt;/sup&gt; and cryoconite sediment 10&lt;sup&gt;8&lt;/sup&gt; g&lt;sup&gt;−1&lt;/sup&gt; dry weight. Denaturating gradient gel electrophoresis band-based clustering revealed differences between glaciers in terms of dominant bacterial taxa structure. Microbial community on Werenskiold Glacier benefited from the snow-released substances. On Hans Glacier, this effect was not as pronounced, affecting mainly the photoautotrophs. Over-fertilization of Hans Glacier surface was proposed as the major factor, desensitizing the microbial community to the snow melt event. Nitrogen emerged as a limiting factor in surface ice habitats, especially to Eukaryotic algae.","author":[{"dropping-particle":"","family":"Grzesiak","given":"Jakub","non-dropping-particle":"","parse-names":false,"suffix":""},{"dropping-particle":"","family":"Górniak","given":"Dorota","non-dropping-particle":"","parse-names":false,"suffix":""},{"dropping-particle":"","family":"Świątecki","given":"Aleksander","non-dropping-particle":"","parse-names":false,"suffix":""},{"dropping-particle":"","family":"Aleksandrzak-Piekarczyk","given":"Tamara","non-dropping-particle":"","parse-names":false,"suffix":""},{"dropping-particle":"","family":"Szatraj","given":"Katarzyna","non-dropping-particle":"","parse-names":false,"suffix":""},{"dropping-particle":"","family":"Zdanowski","given":"Marek K.","non-dropping-particle":"","parse-names":false,"suffix":""}],"container-title":"Extremophiles","id":"ITEM-1","issue":"5","issued":{"date-parts":[["2015"]]},"page":"885-897","title":"Microbial community development on the surface of Hans and Werenskiold Glaciers (Svalbard, Arctic): a comparison","type":"article-journal","volume":"19"},"uris":["http://www.mendeley.com/documents/?uuid=089818a3-49af-46f1-a60e-3aa9c97e4604"]}],"mendeley":{"formattedCitation":"(Grzesiak et al., 2015)","plainTextFormattedCitation":"(Grzesiak et al., 2015)","previouslyFormattedCitation":"(Grzesiak et al., 2015)"},"properties":{"noteIndex":0},"schema":"https://github.com/citation-style-language/schema/raw/master/csl-citation.json"}</w:instrText>
-            </w:r>
-            <w:r>
-              <w:fldChar w:fldCharType="separate"/>
-            </w:r>
-            <w:r>
-              <w:rPr>
-                <w:noProof/>
-              </w:rPr>
-              <w:t>(Grzesiak et al., 2015)</w:t>
-            </w:r>
-            <w:r>
-              <w:fldChar w:fldCharType="end"/>
-            </w:r>
-          </w:p>
-          <w:p>
-            <w:pPr>
-              <w:cnfStyle w:val="000000000000" w:firstRow="0" w:lastRow="0" w:firstColumn="0" w:lastColumn="0" w:oddVBand="0" w:evenVBand="0" w:oddHBand="0" w:evenHBand="0" w:firstRowFirstColumn="0" w:firstRowLastColumn="0" w:lastRowFirstColumn="0" w:lastRowLastColumn="0"/>
-            </w:pPr>
-            <w:r>
-              <w:t xml:space="preserve">Ice: 9.3 </w:t>
-            </w:r>
-            <w:r>
-              <w:sym w:font="Symbol" w:char="F06D"/>
-            </w:r>
-            <w:r>
-              <w:t xml:space="preserve">moles L-1 </w:t>
-            </w:r>
-            <w:r>
-              <w:fldChar w:fldCharType="begin" w:fldLock="1"/>
-            </w:r>
-            <w:r>
-              <w:instrText>ADDIN CSL_CITATION {"citationItems":[{"id":"ITEM-1","itemData":{"DOI":"10.3389/fmicb.2014.00694","ISSN":"1664302X","PMID":"25566210","abstract":"The seasonal melting of ice entombed cryoconite holes on McMurdo Dry Valley glaciers provides oases for life in the harsh environmental conditions of the polar desert where surface air temperatures only occasionally exceed 0°C during the Austral summer. Here we follow temporal changes in cryoconite hole biogeochemistry on Canada Glacier from fully frozen conditions through the initial stages of spring thaw toward fully melted holes. The cryoconite holes had a mean isolation age from the glacial drainage system of 3.4 years, with an increasing mass of aqueous nutrients (dissolved organic carbon, total nitrogen, total phosphorus) with longer isolation age. During the initial melt there was a mean nine times enrichment in dissolved chloride relative to mean concentrations of the initial frozen holes indicative of an ionic pulse, with similar mean nine times enrichments in nitrite, ammonium, and dissolved organic matter. Nitrate was enriched twelve times and dissolved organic nitrogen six times, suggesting net nitrification, while lower enrichments for dissolved organic phosphorus and phosphate were consistent with net microbial phosphorus uptake. Rates of bacterial production were significantly elevated during the ionic pulse, likely due to the increased nutrient availability. There was no concomitant increase in photosynthesis rates, with a net depletion of dissolved inorganic carbon suggesting inorganic carbon limitation. Potential nitrogen fixation was detected in fully melted holes where it could be an important source of nitrogen to support microbial growth, but not during the ionic pulse where nitrogen availability was higher. This study demonstrates that ionic pulses significantly alter the timing and magnitude of microbial activity within entombed cryoconite holes, and adds credence to hypotheses that ionic enrichments during freeze-thaw can elevate rates of microbial growth and activity in other icy habitats, such as ice veins and subglacial regelation zones.","author":[{"dropping-particle":"","family":"Telling","given":"Jon","non-dropping-particle":"","parse-names":false,"suffix":""},{"dropping-particle":"","family":"Anesio","given":"Alexandre M.","non-dropping-particle":"","parse-names":false,"suffix":""},{"dropping-particle":"","family":"Tranter","given":"Martyn","non-dropping-particle":"","parse-names":false,"suffix":""},{"dropping-particle":"","family":"Fountain","given":"Andrew G.","non-dropping-particle":"","parse-names":false,"suffix":""},{"dropping-particle":"","family":"Nylen","given":"Thomas","non-dropping-particle":"","parse-names":false,"suffix":""},{"dropping-particle":"","family":"Hawkings","given":"Jon","non-dropping-particle":"","parse-names":false,"suffix":""},{"dropping-particle":"","family":"Singh","given":"Virendra B.","non-dropping-particle":"","parse-names":false,"suffix":""},{"dropping-particle":"","family":"Kaur","given":"Preeti","non-dropping-particle":"","parse-names":false,"suffix":""},{"dropping-particle":"","family":"Musilova","given":"Michaela","non-dropping-particle":"","parse-names":false,"suffix":""},{"dropping-particle":"","family":"Wadham","given":"Jemma L.","non-dropping-particle":"","parse-names":false,"suffix":""}],"container-title":"Frontiers in Microbiology","id":"ITEM-1","issue":"DEC","issued":{"date-parts":[["2014"]]},"page":"1-15","title":"Spring thaw ionic pulses boost nutrient availability and microbial growth in entombed Antarctic Dry Valley cryoconite holes","type":"article-journal","volume":"5"},"uris":["http://www.mendeley.com/documents/?uuid=9bfd9fe4-32a2-4185-8aad-37b409c63881"]}],"mendeley":{"formattedCitation":"(Telling et al., 2014)","plainTextFormattedCitation":"(Telling et al., 2014)","previouslyFormattedCitation":"(Telling et al., 2014)"},"properties":{"noteIndex":0},"schema":"https://github.com/citation-style-language/schema/raw/master/csl-citation.json"}</w:instrText>
-            </w:r>
-            <w:r>
-              <w:fldChar w:fldCharType="separate"/>
-            </w:r>
-            <w:r>
-              <w:rPr>
-                <w:noProof/>
-              </w:rPr>
-              <w:t>(Telling et al., 2014)</w:t>
-            </w:r>
-            <w:r>
-              <w:fldChar w:fldCharType="end"/>
-            </w:r>
-            <w:r>
-              <w:t xml:space="preserve"> (1.07 </w:t>
-            </w:r>
-            <w:r>
-              <w:t>mg L</w:t>
-            </w:r>
-            <w:r>
-              <w:rPr>
-                <w:vertAlign w:val="superscript"/>
-              </w:rPr>
-              <w:t>-1</w:t>
-            </w:r>
-            <w:r>
-              <w:t>)</w:t>
-            </w:r>
-          </w:p>
-          <w:p>
-            <w:pPr>
-              <w:cnfStyle w:val="000000000000" w:firstRow="0" w:lastRow="0" w:firstColumn="0" w:lastColumn="0" w:oddVBand="0" w:evenVBand="0" w:oddHBand="0" w:evenHBand="0" w:firstRowFirstColumn="0" w:firstRowLastColumn="0" w:lastRowFirstColumn="0" w:lastRowLastColumn="0"/>
-            </w:pPr>
-            <w:r>
-              <w:t>Snow: 0.10-0.27 mg L</w:t>
-            </w:r>
-            <w:r>
-              <w:rPr>
-                <w:vertAlign w:val="superscript"/>
-              </w:rPr>
-              <w:t>-1</w:t>
-            </w:r>
-            <w:r>
-              <w:t xml:space="preserve"> </w:t>
-            </w:r>
-            <w:r>
-              <w:fldChar w:fldCharType="begin" w:fldLock="1"/>
-            </w:r>
-            <w:r>
-              <w:instrText>ADDIN CSL_CITATION {"citationItems":[{"id":"ITEM-1","itemData":{"DOI":"10.1029/2020jg005958","ISSN":"2169-8953","abstract":"While the role of supraglacial environments such as the cryoconite holes and surface snow in cycling of carbon and nutrients has gained momentum in the last decade, little has been done to assess how interactions with sunlight and microbes control the dissolved organic matter cycling in these environments. In this study, the cryoconite holes, which are subjected to different light conditions, were monitored in the coastal Antarctica during the summer in order to determine how the geochemistry ofthese environments varied through the melt season. Additionally, mesocosm experiments were conducted to understand the impact of photochemical and microbial activities on dissolved organic carbon (DOC) and ionic constituents in the snow and cryoconite holes. In situ measurements of primary and bacterial production carried out in the surface snow and cryoconite holes showed that the primary production rates were higher than the bacterial production rates. Both photochemical and microbial processes resulted in changing the concentration of DOC, carboxylate, and nitrate ions in these environments. Sunlight‐induced production of biologically labile compounds, such as acetate and formate, and photochemical degradation of oxalate were also observed. Microbial activity had the opposite effect, resulting in an increase in oxalate and decrease in acetate and formate concentrations. Consequences of these combined processes would determine the fate of DOC and associated nutrients in the Antarctic supraglacial environments and potentially influence the local productivity within these systems.","author":[{"dropping-particle":"","family":"Samui","given":"Gautami","non-dropping-particle":"","parse-names":false,"suffix":""},{"dropping-particle":"","family":"Antony","given":"Runa","non-dropping-particle":"","parse-names":false,"suffix":""},{"dropping-particle":"","family":"Thamban","given":"Meloth","non-dropping-particle":"","parse-names":false,"suffix":""}],"container-title":"Journal of Geophysical Research: Biogeosciences","id":"ITEM-1","issue":"12","issued":{"date-parts":[["2020"]]},"page":"1-14","title":"Fate of Dissolved Organic Carbon in Antarctic Surface Environments During Summer","type":"article-journal","volume":"125"},"uris":["http://www.mendeley.com/documents/?uuid=f5c9bb4e-c223-4404-b0a5-f4a83693076f"]}],"mendeley":{"formattedCitation":"(Samui et al., 2020)","plainTextFormattedCitation":"(Samui et al., 2020)","previouslyFormattedCitation":"(Samui et al., 2020)"},"properties":{"noteIndex":0},"schema":"https://github.com/citation-style-language/schema/raw/master/csl-citation.json"}</w:instrText>
-            </w:r>
-            <w:r>
-              <w:fldChar w:fldCharType="separate"/>
-            </w:r>
-            <w:r>
-              <w:rPr>
-                <w:noProof/>
-              </w:rPr>
-              <w:t>(Samui et al., 2020)</w:t>
-            </w:r>
-            <w:r>
-              <w:fldChar w:fldCharType="end"/>
-            </w:r>
-          </w:p>
-          <w:p>
-            <w:pPr>
-              <w:cnfStyle w:val="000000000000" w:firstRow="0" w:lastRow="0" w:firstColumn="0" w:lastColumn="0" w:oddVBand="0" w:evenVBand="0" w:oddHBand="0" w:evenHBand="0" w:firstRowFirstColumn="0" w:firstRowLastColumn="0" w:lastRowFirstColumn="0" w:lastRowLastColumn="0"/>
-            </w:pPr>
-            <w:r>
-              <w:t>Ice: 0.29-10.47 mg L</w:t>
-            </w:r>
-            <w:r>
-              <w:rPr>
-                <w:vertAlign w:val="superscript"/>
-              </w:rPr>
-              <w:t>-1</w:t>
-            </w:r>
-            <w:r>
-              <w:rPr>
-                <w:vertAlign w:val="superscript"/>
-              </w:rPr>
-              <w:t xml:space="preserve"> </w:t>
-            </w:r>
-            <w:r>
-              <w:rPr>
-                <w:vertAlign w:val="superscript"/>
-              </w:rPr>
-              <w:fldChar w:fldCharType="begin" w:fldLock="1"/>
-            </w:r>
-            <w:r>
-              <w:rPr>
-                <w:vertAlign w:val="superscript"/>
-              </w:rPr>
-              <w:instrText>ADDIN CSL_CITATION {"citationItems":[{"id":"ITEM-1","itemData":{"DOI":"10.1038/s41467-020-20627-w","ISSN":"20411723","abstract":"Melting of the Greenland Ice Sheet is a leading cause of land-ice mass loss and cryosphere-attributed sea level rise. Blooms of pigmented glacier ice algae lower ice albedo and accelerate surface melting in the ice sheet’s southwest sector. Although glacier ice algae cause up to 13% of the surface melting in this region, the controls on bloom development remain poorly understood. Here we show a direct link between mineral phosphorus in surface ice and glacier ice algae biomass through the quantification of solid and fluid phase phosphorus reservoirs in surface habitats across the southwest ablation zone of the ice sheet. We demonstrate that nutrients from mineral dust likely drive glacier ice algal growth, and thereby identify mineral dust as a secondary control on ice sheet melting.","author":[{"dropping-particle":"","family":"McCutcheon","given":"Jenine","non-dropping-particle":"","parse-names":false,"suffix":""},{"dropping-particle":"","family":"Lutz","given":"Stefanie","non-dropping-particle":"","parse-names":false,"suffix":""},{"dropping-particle":"","family":"Williamson","given":"Christopher","non-dropping-particle":"","parse-names":false,"suffix":""},{"dropping-particle":"","family":"Cook","given":"Joseph M.","non-dropping-particle":"","parse-names":false,"suffix":""},{"dropping-particle":"","family":"Tedstone","given":"Andrew J.","non-dropping-particle":"","parse-names":false,"suffix":""},{"dropping-particle":"","family":"Vanderstraeten","given":"Aubry","non-dropping-particle":"","parse-names":false,"suffix":""},{"dropping-particle":"","family":"Wilson","given":"Siobhan A.","non-dropping-particle":"","parse-names":false,"suffix":""},{"dropping-particle":"","family":"Stockdale","given":"Anthony","non-dropping-particle":"","parse-names":false,"suffix":""},{"dropping-particle":"","family":"Bonneville","given":"Steeve","non-dropping-particle":"","parse-names":false,"suffix":""},{"dropping-particle":"","family":"Anesio","given":"Alexandre M.","non-dropping-particle":"","parse-names":false,"suffix":""},{"dropping-particle":"","family":"Yallop","given":"Marian L.","non-dropping-particle":"","parse-names":false,"suffix":""},{"dropping-particle":"","family":"McQuaid","given":"James B.","non-dropping-particle":"","parse-names":false,"suffix":""},{"dropping-particle":"","family":"Tranter","given":"Martyn","non-dropping-particle":"","parse-names":false,"suffix":""},{"dropping-particle":"","family":"Benning","given":"Liane G.","non-dropping-particle":"","parse-names":false,"suffix":""}],"container-title":"Nature Communications","id":"ITEM-1","issue":"1","issued":{"date-parts":[["2021"]]},"page":"1-11","publisher":"Springer US","title":"Mineral phosphorus drives glacier algal blooms on the Greenland Ice Sheet","type":"article-journal","volume":"12"},"uris":["http://www.mendeley.com/documents/?uuid=48651b01-3d31-491b-b6cf-d3e21f9151d9"]}],"mendeley":{"formattedCitation":"(McCutcheon et al., 2021)","plainTextFormattedCitation":"(McCutcheon et al., 2021)"},"properties":{"noteIndex":0},"schema":"https://github.com/citation-style-language/schema/raw/master/csl-citation.json"}</w:instrText>
-            </w:r>
-            <w:r>
-              <w:rPr>
-                <w:vertAlign w:val="superscript"/>
-              </w:rPr>
-              <w:fldChar w:fldCharType="separate"/>
-            </w:r>
-            <w:r>
-              <w:rPr>
-                <w:noProof/>
-              </w:rPr>
-              <w:t>(McCutcheon et al., 2021)</w:t>
-            </w:r>
-            <w:r>
-              <w:rPr>
-                <w:vertAlign w:val="superscript"/>
-              </w:rPr>
-              <w:fldChar w:fldCharType="end"/>
-            </w:r>
-          </w:p>
-        </w:tc>
-        <w:tc>
-          <w:tcPr>
-            <w:tcW w:w="5686" w:type="dxa"/>
-          </w:tcPr>
-          <w:p>
-            <w:pPr>
-              <w:cnfStyle w:val="000000000000" w:firstRow="0" w:lastRow="0" w:firstColumn="0" w:lastColumn="0" w:oddVBand="0" w:evenVBand="0" w:oddHBand="0" w:evenHBand="0" w:firstRowFirstColumn="0" w:firstRowLastColumn="0" w:lastRowFirstColumn="0" w:lastRowLastColumn="0"/>
-            </w:pPr>
-            <w:r>
-              <w:t xml:space="preserve">IC LOC = 72 ppb </w:t>
-            </w:r>
-            <w:r>
-              <w:fldChar w:fldCharType="begin" w:fldLock="1"/>
-            </w:r>
-            <w:r>
-              <w:instrText>ADDIN CSL_CITATION {"citationItems":[{"id":"ITEM-1","itemData":{"DOI":"10.1038/ncomms11968","ISSN":"20411723","PMID":"27329445","abstract":"The Arctic is melting at an unprecedented rate and key drivers are changes in snow and ice albedo. Here we show that red snow, a common algal habitat blooming after the onset of melting, plays a crucial role in decreasing albedo. Our data reveal that red pigmented snow algae are cosmopolitan as well as independent of location-specific geochemical and mineralogical factors. The patterns for snow algal diversity, pigmentation and, consequently albedo, are ubiquitous across the Arctic and the reduction in albedo accelerates snow melt and increases the time and area of exposed bare ice. We estimated that the overall decrease in snow albedo by red pigmented snow algal blooms over the course of one melt season can be 13%. This will invariably result in higher melt rates. We argue that such a 'bio-albedo' effect has to be considered in climate models.","author":[{"dropping-particle":"","family":"Lutz","given":"Stefanie","non-dropping-particle":"","parse-names":false,"suffix":""},{"dropping-particle":"","family":"Anesio","given":"Alexandre M.","non-dropping-particle":"","parse-names":false,"suffix":""},{"dropping-particle":"","family":"Raiswell","given":"Rob","non-dropping-particle":"","parse-names":false,"suffix":""},{"dropping-particle":"","family":"Edwards","given":"Arwyn","non-dropping-particle":"","parse-names":false,"suffix":""},{"dropping-particle":"","family":"Newton","given":"Rob J.","non-dropping-particle":"","parse-names":false,"suffix":""},{"dropping-particle":"","family":"Gill","given":"Fiona","non-dropping-particle":"","parse-names":false,"suffix":""},{"dropping-particle":"","family":"Benning","given":"Liane G.","non-dropping-particle":"","parse-names":false,"suffix":""}],"container-title":"Nature Communications","id":"ITEM-1","issue":"May","issued":{"date-parts":[["2016"]]},"page":"1-9","publisher":"Nature Publishing Group","title":"The biogeography of red snow microbiomes and their role in melting arctic glaciers","type":"article-journal","volume":"7"},"uris":["http://www.mendeley.com/documents/?uuid=9020975f-8089-46fa-98be-ed55a0e364fb"]}],"mendeley":{"formattedCitation":"(Lutz et al., 2016)","plainTextFormattedCitation":"(Lutz et al., 2016)","previouslyFormattedCitation":"(Lutz et al., 2016)"},"properties":{"noteIndex":0},"schema":"https://github.com/citation-style-language/schema/raw/master/csl-citation.json"}</w:instrText>
-            </w:r>
-            <w:r>
-              <w:fldChar w:fldCharType="separate"/>
-            </w:r>
-            <w:r>
-              <w:rPr>
-                <w:noProof/>
-              </w:rPr>
-              <w:t>(Lutz et al., 2016)</w:t>
-            </w:r>
-            <w:r>
-              <w:fldChar w:fldCharType="end"/>
-            </w:r>
-          </w:p>
-          <w:p>
-            <w:pPr>
-              <w:cnfStyle w:val="000000000000" w:firstRow="0" w:lastRow="0" w:firstColumn="0" w:lastColumn="0" w:oddVBand="0" w:evenVBand="0" w:oddHBand="0" w:evenHBand="0" w:firstRowFirstColumn="0" w:firstRowLastColumn="0" w:lastRowFirstColumn="0" w:lastRowLastColumn="0"/>
-            </w:pPr>
-            <w:r>
-              <w:t xml:space="preserve">IC (Dionex-ICS2500) LOD = </w:t>
-            </w:r>
-            <w:r>
-              <w:t xml:space="preserve">﻿0.7 mg L-1 </w:t>
-            </w:r>
-            <w:r>
-              <w:t xml:space="preserve"> </w:t>
-            </w:r>
-            <w:r>
-              <w:fldChar w:fldCharType="begin" w:fldLock="1"/>
-            </w:r>
-            <w:r>
-              <w:instrText>ADDIN CSL_CITATION {"citationItems":[{"id":"ITEM-1","itemData":{"DOI":"10.1007/s10533-013-9895-4","ISSN":"1573515X","abstract":"Water pathways through permeable riverbeds are multi-dimensional, including lateral hyporheic exchange flows as well as vertical (upwelling and downwelling) fluxes. The influence of different pathways of water on solute patterns and the supply of nitrate and other redox-sensitive chemical species in the riverbed is poorly understood but could be environmentally significant. For example, nitrate-rich upwelling water in the gaining reaches of groundwater-fed rivers has the potential to supply significant quantities of nitrate through the riverbed to surface waters, constraining opportunities to deliver the goals of the EU Water Framework Directive to achieve 'good ecological status'. We show that patterns in porewater chemistry in the armoured river bed of a gaining reach (River Leith, Cumbria) reflect the spatial variability in different sources of water; oxic conditions being associated with preferential discharge from groundwater and reducing conditions with longitudinal and lateral fluxes of water due to water movement from riparian zones and/or hyporheic exchange flows. Our findings demonstrate the important control of both vertical and lateral water fluxes on patterns of redox-sensitive chemical species in the river bed. Furthermore, under stable, baseflow conditions (&lt;Q90) a zone of preferential discharge, comprising 20 % of the reach by area contributes 4-9 % of the total nitrate being transported through the reach in surface water, highlighting the need to understand the spatial distribution of such preferential discharge locations at the catchment scale to establish their importance for nitrate delivery to the stream channel. © 2013 Springer Science+Business Media Dordrecht.","author":[{"dropping-particle":"","family":"Heppell","given":"Catherine","non-dropping-particle":"","parse-names":false,"suffix":""},{"dropping-particle":"","family":"Louise Heathwaite","given":"A.","non-dropping-particle":"","parse-names":false,"suffix":""},{"dropping-particle":"","family":"Binley","given":"Andrew","non-dropping-particle":"","parse-names":false,"suffix":""},{"dropping-particle":"","family":"Byrne","given":"Patrick","non-dropping-particle":"","parse-names":false,"suffix":""},{"dropping-particle":"","family":"Ullah","given":"Sami","non-dropping-particle":"","parse-names":false,"suffix":""},{"dropping-particle":"","family":"Lansdown","given":"Katrina","non-dropping-particle":"","parse-names":false,"suffix":""},{"dropping-particle":"","family":"Keenan","given":"Patrick","non-dropping-particle":"","parse-names":false,"suffix":""},{"dropping-particle":"","family":"Trimmer","given":"Mark","non-dropping-particle":"","parse-names":false,"suffix":""},{"dropping-particle":"","family":"Zhang","given":"Hao","non-dropping-particle":"","parse-names":false,"suffix":""}],"container-title":"Biogeochemistry","id":"ITEM-1","issue":"2-3","issued":{"date-parts":[["2014"]]},"page":"491-509","title":"Interpreting spatial patterns in redox and coupled water-nitrogen fluxes in the streambed of a gaining river reach","type":"article-journal","volume":"117"},"uris":["http://www.mendeley.com/documents/?uuid=4f49d7ef-7b00-43b3-99ab-c33b2ad820ee"]}],"mendeley":{"formattedCitation":"(Heppell et al., 2014)","plainTextFormattedCitation":"(Heppell et al., 2014)","previouslyFormattedCitation":"(Heppell et al., 2014)"},"properties":{"noteIndex":0},"schema":"https://github.com/citation-style-language/schema/raw/master/csl-citation.json"}</w:instrText>
-            </w:r>
-            <w:r>
-              <w:fldChar w:fldCharType="separate"/>
-            </w:r>
-            <w:r>
-              <w:rPr>
-                <w:noProof/>
-              </w:rPr>
-              <w:t>(Heppell et al., 2014)</w:t>
             </w:r>
             <w:r>
               <w:fldChar w:fldCharType="end"/>
@@ -3991,28 +4767,505 @@
       <w:tr>
         <w:trPr>
           <w:cnfStyle w:val="000000100000" w:firstRow="0" w:lastRow="0" w:firstColumn="0" w:lastColumn="0" w:oddVBand="0" w:evenVBand="0" w:oddHBand="1" w:evenHBand="0" w:firstRowFirstColumn="0" w:firstRowLastColumn="0" w:lastRowFirstColumn="0" w:lastRowLastColumn="0"/>
-          <w:jc w:val="center"/>
         </w:trPr>
         <w:tc>
           <w:tcPr>
             <w:cnfStyle w:val="001000000000" w:firstRow="0" w:lastRow="0" w:firstColumn="1" w:lastColumn="0" w:oddVBand="0" w:evenVBand="0" w:oddHBand="0" w:evenHBand="0" w:firstRowFirstColumn="0" w:firstRowLastColumn="0" w:lastRowFirstColumn="0" w:lastRowLastColumn="0"/>
-            <w:tcW w:w="0" w:type="auto"/>
-          </w:tcPr>
-          <w:p>
-            <w:r>
-              <w:t>Ammonium (NH4 - cation)</w:t>
-            </w:r>
-          </w:p>
-        </w:tc>
-        <w:tc>
-          <w:tcPr>
-            <w:tcW w:w="5953" w:type="dxa"/>
-          </w:tcPr>
-          <w:p>
-            <w:pPr>
-              <w:cnfStyle w:val="000000100000" w:firstRow="0" w:lastRow="0" w:firstColumn="0" w:lastColumn="0" w:oddVBand="0" w:evenVBand="0" w:oddHBand="1" w:evenHBand="0" w:firstRowFirstColumn="0" w:firstRowLastColumn="0" w:lastRowFirstColumn="0" w:lastRowLastColumn="0"/>
-            </w:pPr>
-            <w:r>
+            <w:tcW w:w="681" w:type="pct"/>
+          </w:tcPr>
+          <w:p>
+            <w:r>
+              <w:t>Chloride (</w:t>
+            </w:r>
+            <w:proofErr w:type="gramStart"/>
+            <w:r>
+              <w:t>Cl  -</w:t>
+            </w:r>
+            <w:proofErr w:type="gramEnd"/>
+            <w:r>
+              <w:t xml:space="preserve"> anion)</w:t>
+            </w:r>
+          </w:p>
+        </w:tc>
+        <w:tc>
+          <w:tcPr>
+            <w:tcW w:w="2131" w:type="pct"/>
+          </w:tcPr>
+          <w:p>
+            <w:pPr>
+              <w:cnfStyle w:val="000000100000" w:firstRow="0" w:lastRow="0" w:firstColumn="0" w:lastColumn="0" w:oddVBand="0" w:evenVBand="0" w:oddHBand="1" w:evenHBand="0" w:firstRowFirstColumn="0" w:firstRowLastColumn="0" w:lastRowFirstColumn="0" w:lastRowLastColumn="0"/>
+            </w:pPr>
+            <w:r>
+              <w:t xml:space="preserve">Prokaryotes may be dependent on Chloride for growth at high salt (Na+) concentrations. May also impact growth, endospore </w:t>
+            </w:r>
+            <w:proofErr w:type="spellStart"/>
+            <w:proofErr w:type="gramStart"/>
+            <w:r>
+              <w:t>germination,motility</w:t>
+            </w:r>
+            <w:proofErr w:type="spellEnd"/>
+            <w:proofErr w:type="gramEnd"/>
+            <w:r>
+              <w:t xml:space="preserve"> </w:t>
+            </w:r>
+          </w:p>
+        </w:tc>
+        <w:tc>
+          <w:tcPr>
+            <w:tcW w:w="829" w:type="pct"/>
+          </w:tcPr>
+          <w:p>
+            <w:pPr>
+              <w:cnfStyle w:val="000000100000" w:firstRow="0" w:lastRow="0" w:firstColumn="0" w:lastColumn="0" w:oddVBand="0" w:evenVBand="0" w:oddHBand="1" w:evenHBand="0" w:firstRowFirstColumn="0" w:firstRowLastColumn="0" w:lastRowFirstColumn="0" w:lastRowLastColumn="0"/>
+            </w:pPr>
+            <w:r>
+              <w:t xml:space="preserve">Snow:  136-381 ppb </w:t>
+            </w:r>
+            <w:r>
+              <w:fldChar w:fldCharType="begin" w:fldLock="1"/>
+            </w:r>
+            <w:r>
+              <w:instrText>ADDIN CSL_CITATION {"citationItems":[{"id":"ITEM-1","itemData":{"DOI":"10.1038/ncomms11968","ISSN":"20411723","PMID":"27329445","abstract":"The Arctic is melting at an unprecedented rate and key drivers are changes in snow and ice albedo. Here we show that red snow, a common algal habitat blooming after the onset of melting, plays a crucial role in decreasing albedo. Our data reveal that red pigmented snow algae are cosmopolitan as well as independent of location-specific geochemical and mineralogical factors. The patterns for snow algal diversity, pigmentation and, consequently albedo, are ubiquitous across the Arctic and the reduction in albedo accelerates snow melt and increases the time and area of exposed bare ice. We estimated that the overall decrease in snow albedo by red pigmented snow algal blooms over the course of one melt season can be 13%. This will invariably result in higher melt rates. We argue that such a 'bio-albedo' effect has to be considered in climate models.","author":[{"dropping-particle":"","family":"Lutz","given":"Stefanie","non-dropping-particle":"","parse-names":false,"suffix":""},{"dropping-particle":"","family":"Anesio","given":"Alexandre M.","non-dropping-particle":"","parse-names":false,"suffix":""},{"dropping-particle":"","family":"Raiswell","given":"Rob","non-dropping-particle":"","parse-names":false,"suffix":""},{"dropping-particle":"","family":"Edwards","given":"Arwyn","non-dropping-particle":"","parse-names":false,"suffix":""},{"dropping-particle":"","family":"Newton","given":"Rob J.","non-dropping-particle":"","parse-names":false,"suffix":""},{"dropping-particle":"","family":"Gill","given":"Fiona","non-dropping-particle":"","parse-names":false,"suffix":""},{"dropping-particle":"","family":"Benning","given":"Liane G.","non-dropping-particle":"","parse-names":false,"suffix":""}],"container-title":"Nature Communications","id":"ITEM-1","issue":"May","issued":{"date-parts":[["2016"]]},"page":"1-9","publisher":"Nature Publishing Group","title":"The biogeography of red snow microbiomes and their role in melting arctic glaciers","type":"article-journal","volume":"7"},"uris":["http://www.mendeley.com/documents/?uuid=9020975f-8089-46fa-98be-ed55a0e364fb"]}],"mendeley":{"formattedCitation":"(Lutz et al., 2016)","plainTextFormattedCitation":"(Lutz et al., 2016)","previouslyFormattedCitation":"(Lutz et al., 2016)"},"properties":{"noteIndex":0},"schema":"https://github.com/citation-style-language/schema/raw/master/csl-citation.json"}</w:instrText>
+            </w:r>
+            <w:r>
+              <w:fldChar w:fldCharType="separate"/>
+            </w:r>
+            <w:r>
+              <w:rPr>
+                <w:noProof/>
+              </w:rPr>
+              <w:t>(Lutz et al., 2016)</w:t>
+            </w:r>
+            <w:r>
+              <w:fldChar w:fldCharType="end"/>
+            </w:r>
+          </w:p>
+          <w:p>
+            <w:pPr>
+              <w:cnfStyle w:val="000000100000" w:firstRow="0" w:lastRow="0" w:firstColumn="0" w:lastColumn="0" w:oddVBand="0" w:evenVBand="0" w:oddHBand="1" w:evenHBand="0" w:firstRowFirstColumn="0" w:firstRowLastColumn="0" w:lastRowFirstColumn="0" w:lastRowLastColumn="0"/>
+            </w:pPr>
+            <w:r>
+              <w:lastRenderedPageBreak/>
+              <w:t>Ice: 0.49 – 0.80 mg L</w:t>
+            </w:r>
+            <w:r>
+              <w:rPr>
+                <w:vertAlign w:val="superscript"/>
+              </w:rPr>
+              <w:t>-1</w:t>
+            </w:r>
+            <w:r>
+              <w:t xml:space="preserve"> </w:t>
+            </w:r>
+            <w:r>
+              <w:fldChar w:fldCharType="begin" w:fldLock="1"/>
+            </w:r>
+            <w:r>
+              <w:instrText>ADDIN CSL_CITATION {"citationItems":[{"id":"ITEM-1","itemData":{"DOI":"10.1007/s00792-015-0764-z","ISSN":"14334909","PMID":"26104673","abstract":"Surface ice and cryoconite holes of two types of polythermal Svalbard Glaciers (Hans Glacier—grounded tidewater glacier and Werenskiold Glacier—land-based valley glacier) were investigated in terms of chemical composition, microbial abundance and diversity. Gathered data served to describe supraglacial habitats and to compare microbe–environment interactions on those different type glaciers. Hans Glacier samples displayed elevated nutrient levels (DOC, nitrogen and seston) compared to Werenskiold Glacier. Adjacent tundra formations, bird nesting sites and marine aerosol were candidates for allochtonic enrichment sources. Microbial numbers were comparable on both glaciers, with surface ice containing cells in the range of 10&lt;sup&gt;4&lt;/sup&gt; mL&lt;sup&gt;−1&lt;/sup&gt; and cryoconite sediment 10&lt;sup&gt;8&lt;/sup&gt; g&lt;sup&gt;−1&lt;/sup&gt; dry weight. Denaturating gradient gel electrophoresis band-based clustering revealed differences between glaciers in terms of dominant bacterial taxa structure. Microbial community on Werenskiold Glacier benefited from the snow-released substances. On Hans Glacier, this effect was not as pronounced, affecting mainly the photoautotrophs. Over-fertilization of Hans Glacier surface was proposed as the major factor, desensitizing the microbial community to the snow melt event. Nitrogen emerged as a limiting factor in surface ice habitats, especially to Eukaryotic algae.","author":[{"dropping-particle":"","family":"Grzesiak","given":"Jakub","non-dropping-particle":"","parse-names":false,"suffix":""},{"dropping-particle":"","family":"Górniak","given":"Dorota","non-dropping-particle":"","parse-names":false,"suffix":""},{"dropping-particle":"","family":"Świątecki","given":"Aleksander","non-dropping-particle":"","parse-names":false,"suffix":""},{"dropping-particle":"","family":"Aleksandrzak-Piekarczyk","given":"Tamara","non-dropping-particle":"","parse-names":false,"suffix":""},{"dropping-particle":"","family":"Szatraj","given":"Katarzyna","non-dropping-particle":"","parse-names":false,"suffix":""},{"dropping-particle":"","family":"Zdanowski","given":"Marek K.","non-dropping-particle":"","parse-names":false,"suffix":""}],"container-title":"Extremophiles","id":"ITEM-1","issue":"5","issued":{"date-parts":[["2015"]]},"page":"885-897","title":"Microbial community development on the surface of Hans and Werenskiold Glaciers (Svalbard, Arctic): a comparison","type":"article-journal","volume":"19"},"uris":["http://www.mendeley.com/documents/?uuid=089818a3-49af-46f1-a60e-3aa9c97e4604"]}],"mendeley":{"formattedCitation":"(Grzesiak et al., 2015)","plainTextFormattedCitation":"(Grzesiak et al., 2015)","previouslyFormattedCitation":"(Grzesiak et al., 2015)"},"properties":{"noteIndex":0},"schema":"https://github.com/citation-style-language/schema/raw/master/csl-citation.json"}</w:instrText>
+            </w:r>
+            <w:r>
+              <w:fldChar w:fldCharType="separate"/>
+            </w:r>
+            <w:r>
+              <w:rPr>
+                <w:noProof/>
+              </w:rPr>
+              <w:t>(Grzesiak et al., 2015)</w:t>
+            </w:r>
+            <w:r>
+              <w:fldChar w:fldCharType="end"/>
+            </w:r>
+          </w:p>
+          <w:p>
+            <w:pPr>
+              <w:cnfStyle w:val="000000100000" w:firstRow="0" w:lastRow="0" w:firstColumn="0" w:lastColumn="0" w:oddVBand="0" w:evenVBand="0" w:oddHBand="1" w:evenHBand="0" w:firstRowFirstColumn="0" w:firstRowLastColumn="0" w:lastRowFirstColumn="0" w:lastRowLastColumn="0"/>
+            </w:pPr>
+            <w:r>
+              <w:t xml:space="preserve">Ice: 9.3 </w:t>
+            </w:r>
+            <w:r>
+              <w:sym w:font="Symbol" w:char="F06D"/>
+            </w:r>
+            <w:r>
+              <w:t xml:space="preserve">moles L-1 </w:t>
+            </w:r>
+            <w:r>
+              <w:fldChar w:fldCharType="begin" w:fldLock="1"/>
+            </w:r>
+            <w:r>
+              <w:instrText>ADDIN CSL_CITATION {"citationItems":[{"id":"ITEM-1","itemData":{"DOI":"10.3389/fmicb.2014.00694","ISSN":"1664302X","PMID":"25566210","abstract":"The seasonal melting of ice entombed cryoconite holes on McMurdo Dry Valley glaciers provides oases for life in the harsh environmental conditions of the polar desert where surface air temperatures only occasionally exceed 0°C during the Austral summer. Here we follow temporal changes in cryoconite hole biogeochemistry on Canada Glacier from fully frozen conditions through the initial stages of spring thaw toward fully melted holes. The cryoconite holes had a mean isolation age from the glacial drainage system of 3.4 years, with an increasing mass of aqueous nutrients (dissolved organic carbon, total nitrogen, total phosphorus) with longer isolation age. During the initial melt there was a mean nine times enrichment in dissolved chloride relative to mean concentrations of the initial frozen holes indicative of an ionic pulse, with similar mean nine times enrichments in nitrite, ammonium, and dissolved organic matter. Nitrate was enriched twelve times and dissolved organic nitrogen six times, suggesting net nitrification, while lower enrichments for dissolved organic phosphorus and phosphate were consistent with net microbial phosphorus uptake. Rates of bacterial production were significantly elevated during the ionic pulse, likely due to the increased nutrient availability. There was no concomitant increase in photosynthesis rates, with a net depletion of dissolved inorganic carbon suggesting inorganic carbon limitation. Potential nitrogen fixation was detected in fully melted holes where it could be an important source of nitrogen to support microbial growth, but not during the ionic pulse where nitrogen availability was higher. This study demonstrates that ionic pulses significantly alter the timing and magnitude of microbial activity within entombed cryoconite holes, and adds credence to hypotheses that ionic enrichments during freeze-thaw can elevate rates of microbial growth and activity in other icy habitats, such as ice veins and subglacial regelation zones.","author":[{"dropping-particle":"","family":"Telling","given":"Jon","non-dropping-particle":"","parse-names":false,"suffix":""},{"dropping-particle":"","family":"Anesio","given":"Alexandre M.","non-dropping-particle":"","parse-names":false,"suffix":""},{"dropping-particle":"","family":"Tranter","given":"Martyn","non-dropping-particle":"","parse-names":false,"suffix":""},{"dropping-particle":"","family":"Fountain","given":"Andrew G.","non-dropping-particle":"","parse-names":false,"suffix":""},{"dropping-particle":"","family":"Nylen","given":"Thomas","non-dropping-particle":"","parse-names":false,"suffix":""},{"dropping-particle":"","family":"Hawkings","given":"Jon","non-dropping-particle":"","parse-names":false,"suffix":""},{"dropping-particle":"","family":"Singh","given":"Virendra B.","non-dropping-particle":"","parse-names":false,"suffix":""},{"dropping-particle":"","family":"Kaur","given":"Preeti","non-dropping-particle":"","parse-names":false,"suffix":""},{"dropping-particle":"","family":"Musilova","given":"Michaela","non-dropping-particle":"","parse-names":false,"suffix":""},{"dropping-particle":"","family":"Wadham","given":"Jemma L.","non-dropping-particle":"","parse-names":false,"suffix":""}],"container-title":"Frontiers in Microbiology","id":"ITEM-1","issue":"DEC","issued":{"date-parts":[["2014"]]},"page":"1-15","title":"Spring thaw ionic pulses boost nutrient availability and microbial growth in entombed Antarctic Dry Valley cryoconite holes","type":"article-journal","volume":"5"},"uris":["http://www.mendeley.com/documents/?uuid=9bfd9fe4-32a2-4185-8aad-37b409c63881"]}],"mendeley":{"formattedCitation":"(Telling et al., 2014)","plainTextFormattedCitation":"(Telling et al., 2014)","previouslyFormattedCitation":"(Telling et al., 2014)"},"properties":{"noteIndex":0},"schema":"https://github.com/citation-style-language/schema/raw/master/csl-citation.json"}</w:instrText>
+            </w:r>
+            <w:r>
+              <w:fldChar w:fldCharType="separate"/>
+            </w:r>
+            <w:r>
+              <w:rPr>
+                <w:noProof/>
+              </w:rPr>
+              <w:t>(Telling et al., 2014)</w:t>
+            </w:r>
+            <w:r>
+              <w:fldChar w:fldCharType="end"/>
+            </w:r>
+            <w:r>
+              <w:t xml:space="preserve"> (1.07 </w:t>
+            </w:r>
+            <w:r>
+              <w:t>mg L</w:t>
+            </w:r>
+            <w:r>
+              <w:rPr>
+                <w:vertAlign w:val="superscript"/>
+              </w:rPr>
+              <w:t>-1</w:t>
+            </w:r>
+            <w:r>
+              <w:t>)</w:t>
+            </w:r>
+          </w:p>
+          <w:p>
+            <w:pPr>
+              <w:cnfStyle w:val="000000100000" w:firstRow="0" w:lastRow="0" w:firstColumn="0" w:lastColumn="0" w:oddVBand="0" w:evenVBand="0" w:oddHBand="1" w:evenHBand="0" w:firstRowFirstColumn="0" w:firstRowLastColumn="0" w:lastRowFirstColumn="0" w:lastRowLastColumn="0"/>
+            </w:pPr>
+            <w:r>
+              <w:t>Snow: 0.10-0.27 mg L</w:t>
+            </w:r>
+            <w:r>
+              <w:rPr>
+                <w:vertAlign w:val="superscript"/>
+              </w:rPr>
+              <w:t>-1</w:t>
+            </w:r>
+            <w:r>
+              <w:t xml:space="preserve"> </w:t>
+            </w:r>
+            <w:r>
+              <w:fldChar w:fldCharType="begin" w:fldLock="1"/>
+            </w:r>
+            <w:r>
+              <w:instrText>ADDIN CSL_CITATION {"citationItems":[{"id":"ITEM-1","itemData":{"DOI":"10.1029/2020jg005958","ISSN":"2169-8953","abstract":"While the role of supraglacial environments such as the cryoconite holes and surface snow in cycling of carbon and nutrients has gained momentum in the last decade, little has been done to assess how interactions with sunlight and microbes control the dissolved organic matter cycling in these environments. In this study, the cryoconite holes, which are subjected to different light conditions, were monitored in the coastal Antarctica during the summer in order to determine how the geochemistry ofthese environments varied through the melt season. Additionally, mesocosm experiments were conducted to understand the impact of photochemical and microbial activities on dissolved organic carbon (DOC) and ionic constituents in the snow and cryoconite holes. In situ measurements of primary and bacterial production carried out in the surface snow and cryoconite holes showed that the primary production rates were higher than the bacterial production rates. Both photochemical and microbial processes resulted in changing the concentration of DOC, carboxylate, and nitrate ions in these environments. Sunlight‐induced production of biologically labile compounds, such as acetate and formate, and photochemical degradation of oxalate were also observed. Microbial activity had the opposite effect, resulting in an increase in oxalate and decrease in acetate and formate concentrations. Consequences of these combined processes would determine the fate of DOC and associated nutrients in the Antarctic supraglacial environments and potentially influence the local productivity within these systems.","author":[{"dropping-particle":"","family":"Samui","given":"Gautami","non-dropping-particle":"","parse-names":false,"suffix":""},{"dropping-particle":"","family":"Antony","given":"Runa","non-dropping-particle":"","parse-names":false,"suffix":""},{"dropping-particle":"","family":"Thamban","given":"Meloth","non-dropping-particle":"","parse-names":false,"suffix":""}],"container-title":"Journal of Geophysical Research: Biogeosciences","id":"ITEM-1","issue":"12","issued":{"date-parts":[["2020"]]},"page":"1-14","title":"Fate of Dissolved Organic Carbon in Antarctic Surface Environments During Summer","type":"article-journal","volume":"125"},"uris":["http://www.mendeley.com/documents/?uuid=f5c9bb4e-c223-4404-b0a5-f4a83693076f"]}],"mendeley":{"formattedCitation":"(Samui et al., 2020)","plainTextFormattedCitation":"(Samui et al., 2020)","previouslyFormattedCitation":"(Samui et al., 2020)"},"properties":{"noteIndex":0},"schema":"https://github.com/citation-style-language/schema/raw/master/csl-citation.json"}</w:instrText>
+            </w:r>
+            <w:r>
+              <w:fldChar w:fldCharType="separate"/>
+            </w:r>
+            <w:r>
+              <w:rPr>
+                <w:noProof/>
+              </w:rPr>
+              <w:t>(Samui et al., 2020)</w:t>
+            </w:r>
+            <w:r>
+              <w:fldChar w:fldCharType="end"/>
+            </w:r>
+          </w:p>
+          <w:p>
+            <w:pPr>
+              <w:cnfStyle w:val="000000100000" w:firstRow="0" w:lastRow="0" w:firstColumn="0" w:lastColumn="0" w:oddVBand="0" w:evenVBand="0" w:oddHBand="1" w:evenHBand="0" w:firstRowFirstColumn="0" w:firstRowLastColumn="0" w:lastRowFirstColumn="0" w:lastRowLastColumn="0"/>
+            </w:pPr>
+            <w:r>
+              <w:t>Ice: 0.29-10.47 mg L</w:t>
+            </w:r>
+            <w:r>
+              <w:rPr>
+                <w:vertAlign w:val="superscript"/>
+              </w:rPr>
+              <w:t>-1</w:t>
+            </w:r>
+            <w:r>
+              <w:rPr>
+                <w:vertAlign w:val="superscript"/>
+              </w:rPr>
+              <w:t xml:space="preserve"> </w:t>
+            </w:r>
+            <w:r>
+              <w:rPr>
+                <w:vertAlign w:val="superscript"/>
+              </w:rPr>
+              <w:fldChar w:fldCharType="begin" w:fldLock="1"/>
+            </w:r>
+            <w:r>
+              <w:rPr>
+                <w:vertAlign w:val="superscript"/>
+              </w:rPr>
+              <w:instrText>ADDIN CSL_CITATION {"citationItems":[{"id":"ITEM-1","itemData":{"DOI":"10.1038/s41467-020-20627-w","ISSN":"20411723","abstract":"Melting of the Greenland Ice Sheet is a leading cause of land-ice mass loss and cryosphere-attributed sea level rise. Blooms of pigmented glacier ice algae lower ice albedo and accelerate surface melting in the ice sheet’s southwest sector. Although glacier ice algae cause up to 13% of the surface melting in this region, the controls on bloom development remain poorly understood. Here we show a direct link between mineral phosphorus in surface ice and glacier ice algae biomass through the quantification of solid and fluid phase phosphorus reservoirs in surface habitats across the southwest ablation zone of the ice sheet. We demonstrate that nutrients from mineral dust likely drive glacier ice algal growth, and thereby identify mineral dust as a secondary control on ice sheet melting.","author":[{"dropping-particle":"","family":"McCutcheon","given":"Jenine","non-dropping-particle":"","parse-names":false,"suffix":""},{"dropping-particle":"","family":"Lutz","given":"Stefanie","non-dropping-particle":"","parse-names":false,"suffix":""},{"dropping-particle":"","family":"Williamson","given":"Christopher","non-dropping-particle":"","parse-names":false,"suffix":""},{"dropping-particle":"","family":"Cook","given":"Joseph M.","non-dropping-particle":"","parse-names":false,"suffix":""},{"dropping-particle":"","family":"Tedstone","given":"Andrew J.","non-dropping-particle":"","parse-names":false,"suffix":""},{"dropping-particle":"","family":"Vanderstraeten","given":"Aubry","non-dropping-particle":"","parse-names":false,"suffix":""},{"dropping-particle":"","family":"Wilson","given":"Siobhan A.","non-dropping-particle":"","parse-names":false,"suffix":""},{"dropping-particle":"","family":"Stockdale","given":"Anthony","non-dropping-particle":"","parse-names":false,"suffix":""},{"dropping-particle":"","family":"Bonneville","given":"Steeve","non-dropping-particle":"","parse-names":false,"suffix":""},{"dropping-particle":"","family":"Anesio","given":"Alexandre M.","non-dropping-particle":"","parse-names":false,"suffix":""},{"dropping-particle":"","family":"Yallop","given":"Marian L.","non-dropping-particle":"","parse-names":false,"suffix":""},{"dropping-particle":"","family":"McQuaid","given":"James B.","non-dropping-particle":"","parse-names":false,"suffix":""},{"dropping-particle":"","family":"Tranter","given":"Martyn","non-dropping-particle":"","parse-names":false,"suffix":""},{"dropping-particle":"","family":"Benning","given":"Liane G.","non-dropping-particle":"","parse-names":false,"suffix":""}],"container-title":"Nature Communications","id":"ITEM-1","issue":"1","issued":{"date-parts":[["2021"]]},"page":"1-11","publisher":"Springer US","title":"Mineral phosphorus drives glacier algal blooms on the Greenland Ice Sheet","type":"article-journal","volume":"12"},"uris":["http://www.mendeley.com/documents/?uuid=48651b01-3d31-491b-b6cf-d3e21f9151d9"]}],"mendeley":{"formattedCitation":"(McCutcheon et al., 2021)","plainTextFormattedCitation":"(McCutcheon et al., 2021)","previouslyFormattedCitation":"(McCutcheon et al., 2021)"},"properties":{"noteIndex":0},"schema":"https://github.com/citation-style-language/schema/raw/master/csl-citation.json"}</w:instrText>
+            </w:r>
+            <w:r>
+              <w:rPr>
+                <w:vertAlign w:val="superscript"/>
+              </w:rPr>
+              <w:fldChar w:fldCharType="separate"/>
+            </w:r>
+            <w:r>
+              <w:rPr>
+                <w:noProof/>
+              </w:rPr>
+              <w:t>(McCutcheon et al., 2021)</w:t>
+            </w:r>
+            <w:r>
+              <w:rPr>
+                <w:vertAlign w:val="superscript"/>
+              </w:rPr>
+              <w:fldChar w:fldCharType="end"/>
+            </w:r>
+          </w:p>
+        </w:tc>
+        <w:tc>
+          <w:tcPr>
+            <w:tcW w:w="1359" w:type="pct"/>
+          </w:tcPr>
+          <w:p>
+            <w:pPr>
+              <w:cnfStyle w:val="000000100000" w:firstRow="0" w:lastRow="0" w:firstColumn="0" w:lastColumn="0" w:oddVBand="0" w:evenVBand="0" w:oddHBand="1" w:evenHBand="0" w:firstRowFirstColumn="0" w:firstRowLastColumn="0" w:lastRowFirstColumn="0" w:lastRowLastColumn="0"/>
+            </w:pPr>
+            <w:r>
+              <w:lastRenderedPageBreak/>
+              <w:t xml:space="preserve">IC LOC = 72 ppb </w:t>
+            </w:r>
+            <w:r>
+              <w:fldChar w:fldCharType="begin" w:fldLock="1"/>
+            </w:r>
+            <w:r>
+              <w:instrText>ADDIN CSL_CITATION {"citationItems":[{"id":"ITEM-1","itemData":{"DOI":"10.1038/ncomms11968","ISSN":"20411723","PMID":"27329445","abstract":"The Arctic is melting at an unprecedented rate and key drivers are changes in snow and ice albedo. Here we show that red snow, a common algal habitat blooming after the onset of melting, plays a crucial role in decreasing albedo. Our data reveal that red pigmented snow algae are cosmopolitan as well as independent of location-specific geochemical and mineralogical factors. The patterns for snow algal diversity, pigmentation and, consequently albedo, are ubiquitous across the Arctic and the reduction in albedo accelerates snow melt and increases the time and area of exposed bare ice. We estimated that the overall decrease in snow albedo by red pigmented snow algal blooms over the course of one melt season can be 13%. This will invariably result in higher melt rates. We argue that such a 'bio-albedo' effect has to be considered in climate models.","author":[{"dropping-particle":"","family":"Lutz","given":"Stefanie","non-dropping-particle":"","parse-names":false,"suffix":""},{"dropping-particle":"","family":"Anesio","given":"Alexandre M.","non-dropping-particle":"","parse-names":false,"suffix":""},{"dropping-particle":"","family":"Raiswell","given":"Rob","non-dropping-particle":"","parse-names":false,"suffix":""},{"dropping-particle":"","family":"Edwards","given":"Arwyn","non-dropping-particle":"","parse-names":false,"suffix":""},{"dropping-particle":"","family":"Newton","given":"Rob J.","non-dropping-particle":"","parse-names":false,"suffix":""},{"dropping-particle":"","family":"Gill","given":"Fiona","non-dropping-particle":"","parse-names":false,"suffix":""},{"dropping-particle":"","family":"Benning","given":"Liane G.","non-dropping-particle":"","parse-names":false,"suffix":""}],"container-title":"Nature Communications","id":"ITEM-1","issue":"May","issued":{"date-parts":[["2016"]]},"page":"1-9","publisher":"Nature Publishing Group","title":"The biogeography of red snow microbiomes and their role in melting arctic glaciers","type":"article-journal","volume":"7"},"uris":["http://www.mendeley.com/documents/?uuid=9020975f-8089-46fa-98be-ed55a0e364fb"]}],"mendeley":{"formattedCitation":"(Lutz et al., 2016)","plainTextFormattedCitation":"(Lutz et al., 2016)","previouslyFormattedCitation":"(Lutz et al., 2016)"},"properties":{"noteIndex":0},"schema":"https://github.com/citation-style-language/schema/raw/master/csl-citation.json"}</w:instrText>
+            </w:r>
+            <w:r>
+              <w:fldChar w:fldCharType="separate"/>
+            </w:r>
+            <w:r>
+              <w:rPr>
+                <w:noProof/>
+              </w:rPr>
+              <w:t>(Lutz et al., 2016)</w:t>
+            </w:r>
+            <w:r>
+              <w:fldChar w:fldCharType="end"/>
+            </w:r>
+          </w:p>
+          <w:p>
+            <w:pPr>
+              <w:cnfStyle w:val="000000100000" w:firstRow="0" w:lastRow="0" w:firstColumn="0" w:lastColumn="0" w:oddVBand="0" w:evenVBand="0" w:oddHBand="1" w:evenHBand="0" w:firstRowFirstColumn="0" w:firstRowLastColumn="0" w:lastRowFirstColumn="0" w:lastRowLastColumn="0"/>
+            </w:pPr>
+            <w:r>
+              <w:t xml:space="preserve">IC (Dionex-ICS2500) LOD = </w:t>
+            </w:r>
+            <w:r>
+              <w:t xml:space="preserve">﻿0.7 mg L-1 </w:t>
+            </w:r>
+            <w:r>
+              <w:t xml:space="preserve"> </w:t>
+            </w:r>
+            <w:r>
+              <w:fldChar w:fldCharType="begin" w:fldLock="1"/>
+            </w:r>
+            <w:r>
+              <w:instrText>ADDIN CSL_CITATION {"citationItems":[{"id":"ITEM-1","itemData":{"DOI":"10.1007/s10533-013-9895-4","ISSN":"1573515X","abstract":"Water pathways through permeable riverbeds are multi-dimensional, including lateral hyporheic exchange flows as well as vertical (upwelling and downwelling) fluxes. The influence of different pathways of water on solute patterns and the supply of nitrate and other redox-sensitive chemical species in the riverbed is poorly understood but could be environmentally significant. For example, nitrate-rich upwelling water in the gaining reaches of groundwater-fed rivers has the potential to supply significant quantities of nitrate through the riverbed to surface waters, constraining opportunities to deliver the goals of the EU Water Framework Directive to achieve 'good ecological status'. We show that patterns in porewater chemistry in the armoured river bed of a gaining reach (River Leith, Cumbria) reflect the spatial variability in different sources of water; oxic conditions being associated with preferential discharge from groundwater and reducing conditions with longitudinal and lateral fluxes of water due to water movement from riparian zones and/or hyporheic exchange flows. Our findings demonstrate the important control of both vertical and lateral water fluxes on patterns of redox-sensitive chemical species in the river bed. Furthermore, under stable, baseflow conditions (&lt;Q90) a zone of preferential discharge, comprising 20 % of the reach by area contributes 4-9 % of the total nitrate being transported through the reach in surface water, highlighting the need to understand the spatial distribution of such preferential discharge locations at the catchment scale to establish their importance for nitrate delivery to the stream channel. © 2013 Springer Science+Business Media Dordrecht.","author":[{"dropping-particle":"","family":"Heppell","given":"Catherine","non-dropping-particle":"","parse-names":false,"suffix":""},{"dropping-particle":"","family":"Louise Heathwaite","given":"A.","non-dropping-particle":"","parse-names":false,"suffix":""},{"dropping-particle":"","family":"Binley","given":"Andrew","non-dropping-particle":"","parse-names":false,"suffix":""},{"dropping-particle":"","family":"Byrne","given":"Patrick","non-dropping-particle":"","parse-names":false,"suffix":""},{"dropping-particle":"","family":"Ullah","given":"Sami","non-dropping-particle":"","parse-names":false,"suffix":""},{"dropping-particle":"","family":"Lansdown","given":"Katrina","non-dropping-particle":"","parse-names":false,"suffix":""},{"dropping-particle":"","family":"Keenan","given":"Patrick","non-dropping-particle":"","parse-names":false,"suffix":""},{"dropping-particle":"","family":"Trimmer","given":"Mark","non-dropping-particle":"","parse-names":false,"suffix":""},{"dropping-particle":"","family":"Zhang","given":"Hao","non-dropping-particle":"","parse-names":false,"suffix":""}],"container-title":"Biogeochemistry","id":"ITEM-1","issue":"2-3","issued":{"date-parts":[["2014"]]},"page":"491-509","title":"Interpreting spatial patterns in redox and coupled water-nitrogen fluxes in the streambed of a gaining river reach","type":"article-journal","volume":"117"},"uris":["http://www.mendeley.com/documents/?uuid=4f49d7ef-7b00-43b3-99ab-c33b2ad820ee"]}],"mendeley":{"formattedCitation":"(Heppell et al., 2014)","plainTextFormattedCitation":"(Heppell et al., 2014)","previouslyFormattedCitation":"(Heppell et al., 2014)"},"properties":{"noteIndex":0},"schema":"https://github.com/citation-style-language/schema/raw/master/csl-citation.json"}</w:instrText>
+            </w:r>
+            <w:r>
+              <w:fldChar w:fldCharType="separate"/>
+            </w:r>
+            <w:r>
+              <w:rPr>
+                <w:noProof/>
+              </w:rPr>
+              <w:t>(Heppell et al., 2014)</w:t>
+            </w:r>
+            <w:r>
+              <w:fldChar w:fldCharType="end"/>
+            </w:r>
+          </w:p>
+          <w:p>
+            <w:pPr>
+              <w:cnfStyle w:val="000000100000" w:firstRow="0" w:lastRow="0" w:firstColumn="0" w:lastColumn="0" w:oddVBand="0" w:evenVBand="0" w:oddHBand="1" w:evenHBand="0" w:firstRowFirstColumn="0" w:firstRowLastColumn="0" w:lastRowFirstColumn="0" w:lastRowLastColumn="0"/>
+            </w:pPr>
+            <w:r>
+              <w:t>IC (outsource) (Bradley email)</w:t>
+            </w:r>
+          </w:p>
+        </w:tc>
+      </w:tr>
+      <w:tr>
+        <w:tc>
+          <w:tcPr>
+            <w:cnfStyle w:val="001000000000" w:firstRow="0" w:lastRow="0" w:firstColumn="1" w:lastColumn="0" w:oddVBand="0" w:evenVBand="0" w:oddHBand="0" w:evenHBand="0" w:firstRowFirstColumn="0" w:firstRowLastColumn="0" w:lastRowFirstColumn="0" w:lastRowLastColumn="0"/>
+            <w:tcW w:w="681" w:type="pct"/>
+          </w:tcPr>
+          <w:p>
+            <w:r>
+              <w:t>Ammonium (NH4 - cation) (DIN)</w:t>
+            </w:r>
+          </w:p>
+        </w:tc>
+        <w:tc>
+          <w:tcPr>
+            <w:tcW w:w="2131" w:type="pct"/>
+          </w:tcPr>
+          <w:p>
+            <w:pPr>
+              <w:cnfStyle w:val="000000000000" w:firstRow="0" w:lastRow="0" w:firstColumn="0" w:lastColumn="0" w:oddVBand="0" w:evenVBand="0" w:oddHBand="0" w:evenHBand="0" w:firstRowFirstColumn="0" w:firstRowLastColumn="0" w:lastRowFirstColumn="0" w:lastRowLastColumn="0"/>
+            </w:pPr>
+            <w:r>
+              <w:t>If NH</w:t>
+            </w:r>
+            <w:r>
+              <w:rPr>
+                <w:vertAlign w:val="subscript"/>
+              </w:rPr>
+              <w:t>4</w:t>
+            </w:r>
+            <w:r>
+              <w:t xml:space="preserve"> if the dominant DIN species it may suggest heterotrophic remineralization of organic material.</w:t>
+            </w:r>
+          </w:p>
+          <w:p>
+            <w:pPr>
+              <w:cnfStyle w:val="000000000000" w:firstRow="0" w:lastRow="0" w:firstColumn="0" w:lastColumn="0" w:oddVBand="0" w:evenVBand="0" w:oddHBand="0" w:evenHBand="0" w:firstRowFirstColumn="0" w:firstRowLastColumn="0" w:lastRowFirstColumn="0" w:lastRowLastColumn="0"/>
+            </w:pPr>
+            <w:r>
+              <w:t xml:space="preserve">If DIN + DON in samples is less than the DIN of melting ice then we can suggest nitrogen is being held within microbial biomass </w:t>
+            </w:r>
+            <w:r>
+              <w:fldChar w:fldCharType="begin" w:fldLock="1"/>
+            </w:r>
+            <w:r>
+              <w:instrText>ADDIN CSL_CITATION {"citationItems":[{"id":"ITEM-1","itemData":{"DOI":"10.5194/bg-16-3283-2019","ISSN":"17264189","abstract":"Glaciers and ice sheets host abundant and dynamic communities of microorganisms on the ice surface (supraglacial environments). Recently, it has been shown that Streptophyte glacier algae blooming on the surface ice of the south-western coast of the Greenland Ice Sheet are a significant contributor to the 15-year marked decrease in albedo. Currently, little is known about the constraints, such as nutrient availability, on this large-scale algal bloom. In this study, we investigate the relative abundances of dissolved inorganic and dissolved organic macronutrients (N and P) in these darkening surface ice environments. Three distinct ice surfaces, with low, medium and high visible impurity loadings, supraglacial stream water and cryoconite hole water, were sampled. Our results show a clear dominance of the organic phase in all ice surface samples containing low, medium and high visible impurity loadings, with 93% of the total dissolved nitrogen and 67% of the total dissolved phosphorus in the organic phase. Mean concentrations in low, medium and high visible impurity surface ice environments are 0.91, 0.62 and 1.0μM for dissolved inorganic nitrogen (DIN), 5.1, 11 and 14μM for dissolved organic nitrogen (DON), 0.03, 0.07 and 0.05μM for dissolved inorganic phosphorus (DIP) and 0.10, 0.15 and 0.12μM for dissolved organic phosphorus (DOP), respectively. DON concentrations in all three surface ice samples are significantly higher than DON concentrations in supraglacial streams and cryoconite hole water (0 and 0.7 μM, respectively). DOP concentrations are higher in all three surface ice samples compared to supraglacial streams and cryoconite hole water (0.07μM for both). Dissolved organic carbon (DOC) concentrations increase with the amount of visible impurities present (low: 83 μM, medium: 173μM and high: 242 μM) and are elevated compared to supraglacial streams and cryoconite hole water (30 and 50 μM, respectively). We speculate that the architecture of the weathering crust, which impacts on water flow paths and storage in the melting surface ice and/or the production of extracellular polymeric substances (EPS), containing both N and P in conjunction with C, is responsible for the temporary retention of DON and DOP in the melting surface ice. The unusual presence of measurable DIP and DIN, principally as NHC 4 , in the melting surface ice environments suggests that factors other than macronutrient limitation are controlling the extent and magnitude of the gla…","author":[{"dropping-particle":"","family":"Holland","given":"Alexandra T.","non-dropping-particle":"","parse-names":false,"suffix":""},{"dropping-particle":"","family":"Williamson","given":"Christopher J.","non-dropping-particle":"","parse-names":false,"suffix":""},{"dropping-particle":"","family":"Sgouridis","given":"Fotis","non-dropping-particle":"","parse-names":false,"suffix":""},{"dropping-particle":"","family":"Tedstone","given":"Andrew J.","non-dropping-particle":"","parse-names":false,"suffix":""},{"dropping-particle":"","family":"McCutcheon","given":"Jenine","non-dropping-particle":"","parse-names":false,"suffix":""},{"dropping-particle":"","family":"Cook","given":"Joseph M.","non-dropping-particle":"","parse-names":false,"suffix":""},{"dropping-particle":"","family":"Poniecka","given":"Ewa","non-dropping-particle":"","parse-names":false,"suffix":""},{"dropping-particle":"","family":"Yallop","given":"Marian L.","non-dropping-particle":"","parse-names":false,"suffix":""},{"dropping-particle":"","family":"Tranter","given":"Martyn","non-dropping-particle":"","parse-names":false,"suffix":""},{"dropping-particle":"","family":"Anesio","given":"Alexandre M.","non-dropping-particle":"","parse-names":false,"suffix":""}],"container-title":"Biogeosciences","id":"ITEM-1","issue":"16","issued":{"date-parts":[["2019"]]},"page":"3283-3296","title":"Dissolved organic nutrients dominate melting surface ice of the Dark Zone (Greenland Ice Sheet)","type":"article-journal","volume":"16"},"uris":["http://www.mendeley.com/documents/?uuid=89f48ff2-e944-4141-b569-bfde842c5ee9"]}],"mendeley":{"formattedCitation":"(Holland et al., 2019)","plainTextFormattedCitation":"(Holland et al., 2019)","previouslyFormattedCitation":"(Holland et al., 2019)"},"properties":{"noteIndex":0},"schema":"https://github.com/citation-style-language/schema/raw/master/csl-citation.json"}</w:instrText>
+            </w:r>
+            <w:r>
+              <w:fldChar w:fldCharType="separate"/>
+            </w:r>
+            <w:r>
+              <w:rPr>
+                <w:noProof/>
+              </w:rPr>
+              <w:t>(Holland et al., 2019)</w:t>
+            </w:r>
+            <w:r>
+              <w:fldChar w:fldCharType="end"/>
+            </w:r>
+            <w:r>
+              <w:t xml:space="preserve">. Presence of NH4 as dominant DIN species would suggest ammonification was an important process. </w:t>
+            </w:r>
+          </w:p>
+          <w:p>
+            <w:pPr>
+              <w:cnfStyle w:val="000000000000" w:firstRow="0" w:lastRow="0" w:firstColumn="0" w:lastColumn="0" w:oddVBand="0" w:evenVBand="0" w:oddHBand="0" w:evenHBand="0" w:firstRowFirstColumn="0" w:firstRowLastColumn="0" w:lastRowFirstColumn="0" w:lastRowLastColumn="0"/>
+            </w:pPr>
+          </w:p>
+          <w:p>
+            <w:pPr>
+              <w:cnfStyle w:val="000000000000" w:firstRow="0" w:lastRow="0" w:firstColumn="0" w:lastColumn="0" w:oddVBand="0" w:evenVBand="0" w:oddHBand="0" w:evenHBand="0" w:firstRowFirstColumn="0" w:firstRowLastColumn="0" w:lastRowFirstColumn="0" w:lastRowLastColumn="0"/>
+            </w:pPr>
+            <w:r>
+              <w:t xml:space="preserve">If there is more DON than DIN it would suggest mineralization of DIN to DON is happening  or DON is being leached from allochthonous organic material  </w:t>
+            </w:r>
+            <w:r>
+              <w:fldChar w:fldCharType="begin" w:fldLock="1"/>
+            </w:r>
+            <w:r>
+              <w:instrText>ADDIN CSL_CITATION {"citationItems":[{"id":"ITEM-1","itemData":{"DOI":"10.5194/bg-16-3283-2019","ISSN":"17264189","abstract":"Glaciers and ice sheets host abundant and dynamic communities of microorganisms on the ice surface (supraglacial environments). Recently, it has been shown that Streptophyte glacier algae blooming on the surface ice of the south-western coast of the Greenland Ice Sheet are a significant contributor to the 15-year marked decrease in albedo. Currently, little is known about the constraints, such as nutrient availability, on this large-scale algal bloom. In this study, we investigate the relative abundances of dissolved inorganic and dissolved organic macronutrients (N and P) in these darkening surface ice environments. Three distinct ice surfaces, with low, medium and high visible impurity loadings, supraglacial stream water and cryoconite hole water, were sampled. Our results show a clear dominance of the organic phase in all ice surface samples containing low, medium and high visible impurity loadings, with 93% of the total dissolved nitrogen and 67% of the total dissolved phosphorus in the organic phase. Mean concentrations in low, medium and high visible impurity surface ice environments are 0.91, 0.62 and 1.0μM for dissolved inorganic nitrogen (DIN), 5.1, 11 and 14μM for dissolved organic nitrogen (DON), 0.03, 0.07 and 0.05μM for dissolved inorganic phosphorus (DIP) and 0.10, 0.15 and 0.12μM for dissolved organic phosphorus (DOP), respectively. DON concentrations in all three surface ice samples are significantly higher than DON concentrations in supraglacial streams and cryoconite hole water (0 and 0.7 μM, respectively). DOP concentrations are higher in all three surface ice samples compared to supraglacial streams and cryoconite hole water (0.07μM for both). Dissolved organic carbon (DOC) concentrations increase with the amount of visible impurities present (low: 83 μM, medium: 173μM and high: 242 μM) and are elevated compared to supraglacial streams and cryoconite hole water (30 and 50 μM, respectively). We speculate that the architecture of the weathering crust, which impacts on water flow paths and storage in the melting surface ice and/or the production of extracellular polymeric substances (EPS), containing both N and P in conjunction with C, is responsible for the temporary retention of DON and DOP in the melting surface ice. The unusual presence of measurable DIP and DIN, principally as NHC 4 , in the melting surface ice environments suggests that factors other than macronutrient limitation are controlling the extent and magnitude of the gla…","author":[{"dropping-particle":"","family":"Holland","given":"Alexandra T.","non-dropping-particle":"","parse-names":false,"suffix":""},{"dropping-particle":"","family":"Williamson","given":"Christopher J.","non-dropping-particle":"","parse-names":false,"suffix":""},{"dropping-particle":"","family":"Sgouridis","given":"Fotis","non-dropping-particle":"","parse-names":false,"suffix":""},{"dropping-particle":"","family":"Tedstone","given":"Andrew J.","non-dropping-particle":"","parse-names":false,"suffix":""},{"dropping-particle":"","family":"McCutcheon","given":"Jenine","non-dropping-particle":"","parse-names":false,"suffix":""},{"dropping-particle":"","family":"Cook","given":"Joseph M.","non-dropping-particle":"","parse-names":false,"suffix":""},{"dropping-particle":"","family":"Poniecka","given":"Ewa","non-dropping-particle":"","parse-names":false,"suffix":""},{"dropping-particle":"","family":"Yallop","given":"Marian L.","non-dropping-particle":"","parse-names":false,"suffix":""},{"dropping-particle":"","family":"Tranter","given":"Martyn","non-dropping-particle":"","parse-names":false,"suffix":""},{"dropping-particle":"","family":"Anesio","given":"Alexandre M.","non-dropping-particle":"","parse-names":false,"suffix":""}],"container-title":"Biogeosciences","id":"ITEM-1","issue":"16","issued":{"date-parts":[["2019"]]},"page":"3283-3296","title":"Dissolved organic nutrients dominate melting surface ice of the Dark Zone (Greenland Ice Sheet)","type":"article-journal","volume":"16"},"uris":["http://www.mendeley.com/documents/?uuid=89f48ff2-e944-4141-b569-bfde842c5ee9"]}],"mendeley":{"formattedCitation":"(Holland et al., 2019)","plainTextFormattedCitation":"(Holland et al., 2019)","previouslyFormattedCitation":"(Holland et al., 2019)"},"properties":{"noteIndex":0},"schema":"https://github.com/citation-style-language/schema/raw/master/csl-citation.json"}</w:instrText>
+            </w:r>
+            <w:r>
+              <w:fldChar w:fldCharType="separate"/>
+            </w:r>
+            <w:r>
+              <w:rPr>
+                <w:noProof/>
+              </w:rPr>
+              <w:t>(Holland et al., 2019)</w:t>
+            </w:r>
+            <w:r>
+              <w:fldChar w:fldCharType="end"/>
+            </w:r>
+            <w:r>
+              <w:t xml:space="preserve">.  </w:t>
+            </w:r>
+          </w:p>
+          <w:p>
+            <w:pPr>
+              <w:cnfStyle w:val="000000000000" w:firstRow="0" w:lastRow="0" w:firstColumn="0" w:lastColumn="0" w:oddVBand="0" w:evenVBand="0" w:oddHBand="0" w:evenHBand="0" w:firstRowFirstColumn="0" w:firstRowLastColumn="0" w:lastRowFirstColumn="0" w:lastRowLastColumn="0"/>
+            </w:pPr>
+            <w:r>
+              <w:t xml:space="preserve">If we find less dissolved nutrients in meltwaters relative to melting ice we may suggest the nutrients are being retained in these environments </w:t>
+            </w:r>
+            <w:r>
+              <w:fldChar w:fldCharType="begin" w:fldLock="1"/>
+            </w:r>
+            <w:r>
+              <w:instrText>ADDIN CSL_CITATION {"citationItems":[{"id":"ITEM-1","itemData":{"DOI":"10.5194/bg-16-3283-2019","ISSN":"17264189","abstract":"Glaciers and ice sheets host abundant and dynamic communities of microorganisms on the ice surface (supraglacial environments). Recently, it has been shown that Streptophyte glacier algae blooming on the surface ice of the south-western coast of the Greenland Ice Sheet are a significant contributor to the 15-year marked decrease in albedo. Currently, little is known about the constraints, such as nutrient availability, on this large-scale algal bloom. In this study, we investigate the relative abundances of dissolved inorganic and dissolved organic macronutrients (N and P) in these darkening surface ice environments. Three distinct ice surfaces, with low, medium and high visible impurity loadings, supraglacial stream water and cryoconite hole water, were sampled. Our results show a clear dominance of the organic phase in all ice surface samples containing low, medium and high visible impurity loadings, with 93% of the total dissolved nitrogen and 67% of the total dissolved phosphorus in the organic phase. Mean concentrations in low, medium and high visible impurity surface ice environments are 0.91, 0.62 and 1.0μM for dissolved inorganic nitrogen (DIN), 5.1, 11 and 14μM for dissolved organic nitrogen (DON), 0.03, 0.07 and 0.05μM for dissolved inorganic phosphorus (DIP) and 0.10, 0.15 and 0.12μM for dissolved organic phosphorus (DOP), respectively. DON concentrations in all three surface ice samples are significantly higher than DON concentrations in supraglacial streams and cryoconite hole water (0 and 0.7 μM, respectively). DOP concentrations are higher in all three surface ice samples compared to supraglacial streams and cryoconite hole water (0.07μM for both). Dissolved organic carbon (DOC) concentrations increase with the amount of visible impurities present (low: 83 μM, medium: 173μM and high: 242 μM) and are elevated compared to supraglacial streams and cryoconite hole water (30 and 50 μM, respectively). We speculate that the architecture of the weathering crust, which impacts on water flow paths and storage in the melting surface ice and/or the production of extracellular polymeric substances (EPS), containing both N and P in conjunction with C, is responsible for the temporary retention of DON and DOP in the melting surface ice. The unusual presence of measurable DIP and DIN, principally as NHC 4 , in the melting surface ice environments suggests that factors other than macronutrient limitation are controlling the extent and magnitude of the gla…","author":[{"dropping-particle":"","family":"Holland","given":"Alexandra T.","non-dropping-particle":"","parse-names":false,"suffix":""},{"dropping-particle":"","family":"Williamson","given":"Christopher J.","non-dropping-particle":"","parse-names":false,"suffix":""},{"dropping-particle":"","family":"Sgouridis","given":"Fotis","non-dropping-particle":"","parse-names":false,"suffix":""},{"dropping-particle":"","family":"Tedstone","given":"Andrew J.","non-dropping-particle":"","parse-names":false,"suffix":""},{"dropping-particle":"","family":"McCutcheon","given":"Jenine","non-dropping-particle":"","parse-names":false,"suffix":""},{"dropping-particle":"","family":"Cook","given":"Joseph M.","non-dropping-particle":"","parse-names":false,"suffix":""},{"dropping-particle":"","family":"Poniecka","given":"Ewa","non-dropping-particle":"","parse-names":false,"suffix":""},{"dropping-particle":"","family":"Yallop","given":"Marian L.","non-dropping-particle":"","parse-names":false,"suffix":""},{"dropping-particle":"","family":"Tranter","given":"Martyn","non-dropping-particle":"","parse-names":false,"suffix":""},{"dropping-particle":"","family":"Anesio","given":"Alexandre M.","non-dropping-particle":"","parse-names":false,"suffix":""}],"container-title":"Biogeosciences","id":"ITEM-1","issue":"16","issued":{"date-parts":[["2019"]]},"page":"3283-3296","title":"Dissolved organic nutrients dominate melting surface ice of the Dark Zone (Greenland Ice Sheet)","type":"article-journal","volume":"16"},"uris":["http://www.mendeley.com/documents/?uuid=89f48ff2-e944-4141-b569-bfde842c5ee9"]}],"mendeley":{"formattedCitation":"(Holland et al., 2019)","plainTextFormattedCitation":"(Holland et al., 2019)","previouslyFormattedCitation":"(Holland et al., 2019)"},"properties":{"noteIndex":0},"schema":"https://github.com/citation-style-language/schema/raw/master/csl-citation.json"}</w:instrText>
+            </w:r>
+            <w:r>
+              <w:fldChar w:fldCharType="separate"/>
+            </w:r>
+            <w:r>
+              <w:rPr>
+                <w:noProof/>
+              </w:rPr>
+              <w:t>(Holland et al., 2019)</w:t>
+            </w:r>
+            <w:r>
+              <w:fldChar w:fldCharType="end"/>
+            </w:r>
+            <w:r>
+              <w:t>.</w:t>
+            </w:r>
+          </w:p>
+          <w:p>
+            <w:pPr>
+              <w:cnfStyle w:val="000000000000" w:firstRow="0" w:lastRow="0" w:firstColumn="0" w:lastColumn="0" w:oddVBand="0" w:evenVBand="0" w:oddHBand="0" w:evenHBand="0" w:firstRowFirstColumn="0" w:firstRowLastColumn="0" w:lastRowFirstColumn="0" w:lastRowLastColumn="0"/>
+            </w:pPr>
+          </w:p>
+          <w:p>
+            <w:pPr>
+              <w:cnfStyle w:val="000000000000" w:firstRow="0" w:lastRow="0" w:firstColumn="0" w:lastColumn="0" w:oddVBand="0" w:evenVBand="0" w:oddHBand="0" w:evenHBand="0" w:firstRowFirstColumn="0" w:firstRowLastColumn="0" w:lastRowFirstColumn="0" w:lastRowLastColumn="0"/>
+            </w:pPr>
+            <w:r>
+              <w:lastRenderedPageBreak/>
+              <w:t xml:space="preserve">If NH4 is the only measurable DIN species we might suggest this is due to heterotrophic activity </w:t>
+            </w:r>
+            <w:r>
+              <w:fldChar w:fldCharType="begin" w:fldLock="1"/>
+            </w:r>
+            <w:r>
+              <w:instrText>ADDIN CSL_CITATION {"citationItems":[{"id":"ITEM-1","itemData":{"DOI":"10.5194/bg-16-3283-2019","ISSN":"17264189","abstract":"Glaciers and ice sheets host abundant and dynamic communities of microorganisms on the ice surface (supraglacial environments). Recently, it has been shown that Streptophyte glacier algae blooming on the surface ice of the south-western coast of the Greenland Ice Sheet are a significant contributor to the 15-year marked decrease in albedo. Currently, little is known about the constraints, such as nutrient availability, on this large-scale algal bloom. In this study, we investigate the relative abundances of dissolved inorganic and dissolved organic macronutrients (N and P) in these darkening surface ice environments. Three distinct ice surfaces, with low, medium and high visible impurity loadings, supraglacial stream water and cryoconite hole water, were sampled. Our results show a clear dominance of the organic phase in all ice surface samples containing low, medium and high visible impurity loadings, with 93% of the total dissolved nitrogen and 67% of the total dissolved phosphorus in the organic phase. Mean concentrations in low, medium and high visible impurity surface ice environments are 0.91, 0.62 and 1.0μM for dissolved inorganic nitrogen (DIN), 5.1, 11 and 14μM for dissolved organic nitrogen (DON), 0.03, 0.07 and 0.05μM for dissolved inorganic phosphorus (DIP) and 0.10, 0.15 and 0.12μM for dissolved organic phosphorus (DOP), respectively. DON concentrations in all three surface ice samples are significantly higher than DON concentrations in supraglacial streams and cryoconite hole water (0 and 0.7 μM, respectively). DOP concentrations are higher in all three surface ice samples compared to supraglacial streams and cryoconite hole water (0.07μM for both). Dissolved organic carbon (DOC) concentrations increase with the amount of visible impurities present (low: 83 μM, medium: 173μM and high: 242 μM) and are elevated compared to supraglacial streams and cryoconite hole water (30 and 50 μM, respectively). We speculate that the architecture of the weathering crust, which impacts on water flow paths and storage in the melting surface ice and/or the production of extracellular polymeric substances (EPS), containing both N and P in conjunction with C, is responsible for the temporary retention of DON and DOP in the melting surface ice. The unusual presence of measurable DIP and DIN, principally as NHC 4 , in the melting surface ice environments suggests that factors other than macronutrient limitation are controlling the extent and magnitude of the gla…","author":[{"dropping-particle":"","family":"Holland","given":"Alexandra T.","non-dropping-particle":"","parse-names":false,"suffix":""},{"dropping-particle":"","family":"Williamson","given":"Christopher J.","non-dropping-particle":"","parse-names":false,"suffix":""},{"dropping-particle":"","family":"Sgouridis","given":"Fotis","non-dropping-particle":"","parse-names":false,"suffix":""},{"dropping-particle":"","family":"Tedstone","given":"Andrew J.","non-dropping-particle":"","parse-names":false,"suffix":""},{"dropping-particle":"","family":"McCutcheon","given":"Jenine","non-dropping-particle":"","parse-names":false,"suffix":""},{"dropping-particle":"","family":"Cook","given":"Joseph M.","non-dropping-particle":"","parse-names":false,"suffix":""},{"dropping-particle":"","family":"Poniecka","given":"Ewa","non-dropping-particle":"","parse-names":false,"suffix":""},{"dropping-particle":"","family":"Yallop","given":"Marian L.","non-dropping-particle":"","parse-names":false,"suffix":""},{"dropping-particle":"","family":"Tranter","given":"Martyn","non-dropping-particle":"","parse-names":false,"suffix":""},{"dropping-particle":"","family":"Anesio","given":"Alexandre M.","non-dropping-particle":"","parse-names":false,"suffix":""}],"container-title":"Biogeosciences","id":"ITEM-1","issue":"16","issued":{"date-parts":[["2019"]]},"page":"3283-3296","title":"Dissolved organic nutrients dominate melting surface ice of the Dark Zone (Greenland Ice Sheet)","type":"article-journal","volume":"16"},"uris":["http://www.mendeley.com/documents/?uuid=89f48ff2-e944-4141-b569-bfde842c5ee9"]}],"mendeley":{"formattedCitation":"(Holland et al., 2019)","plainTextFormattedCitation":"(Holland et al., 2019)","previouslyFormattedCitation":"(Holland et al., 2019)"},"properties":{"noteIndex":0},"schema":"https://github.com/citation-style-language/schema/raw/master/csl-citation.json"}</w:instrText>
+            </w:r>
+            <w:r>
+              <w:fldChar w:fldCharType="separate"/>
+            </w:r>
+            <w:r>
+              <w:rPr>
+                <w:noProof/>
+              </w:rPr>
+              <w:t>(Holland et al., 2019)</w:t>
+            </w:r>
+            <w:r>
+              <w:fldChar w:fldCharType="end"/>
+            </w:r>
+            <w:r>
+              <w:t>.</w:t>
+            </w:r>
+          </w:p>
+          <w:p>
+            <w:pPr>
+              <w:cnfStyle w:val="000000000000" w:firstRow="0" w:lastRow="0" w:firstColumn="0" w:lastColumn="0" w:oddVBand="0" w:evenVBand="0" w:oddHBand="0" w:evenHBand="0" w:firstRowFirstColumn="0" w:firstRowLastColumn="0" w:lastRowFirstColumn="0" w:lastRowLastColumn="0"/>
+            </w:pPr>
+          </w:p>
+          <w:p>
+            <w:pPr>
+              <w:cnfStyle w:val="000000000000" w:firstRow="0" w:lastRow="0" w:firstColumn="0" w:lastColumn="0" w:oddVBand="0" w:evenVBand="0" w:oddHBand="0" w:evenHBand="0" w:firstRowFirstColumn="0" w:firstRowLastColumn="0" w:lastRowFirstColumn="0" w:lastRowLastColumn="0"/>
+            </w:pPr>
+            <w:r>
+              <w:t>Basically, if there is NH4 present, we might suggest there is something else limiting the communities (otherwise it would all be used up as soon as it was available).</w:t>
+            </w:r>
+          </w:p>
+        </w:tc>
+        <w:tc>
+          <w:tcPr>
+            <w:tcW w:w="829" w:type="pct"/>
+          </w:tcPr>
+          <w:p>
+            <w:pPr>
+              <w:cnfStyle w:val="000000000000" w:firstRow="0" w:lastRow="0" w:firstColumn="0" w:lastColumn="0" w:oddVBand="0" w:evenVBand="0" w:oddHBand="0" w:evenHBand="0" w:firstRowFirstColumn="0" w:firstRowLastColumn="0" w:lastRowFirstColumn="0" w:lastRowLastColumn="0"/>
+            </w:pPr>
+            <w:r>
+              <w:lastRenderedPageBreak/>
               <w:t>Ice: 0 mg L</w:t>
             </w:r>
             <w:r>
@@ -4045,7 +5298,7 @@
           </w:p>
           <w:p>
             <w:pPr>
-              <w:cnfStyle w:val="000000100000" w:firstRow="0" w:lastRow="0" w:firstColumn="0" w:lastColumn="0" w:oddVBand="0" w:evenVBand="0" w:oddHBand="1" w:evenHBand="0" w:firstRowFirstColumn="0" w:firstRowLastColumn="0" w:lastRowFirstColumn="0" w:lastRowLastColumn="0"/>
+              <w:cnfStyle w:val="000000000000" w:firstRow="0" w:lastRow="0" w:firstColumn="0" w:lastColumn="0" w:oddVBand="0" w:evenVBand="0" w:oddHBand="0" w:evenHBand="0" w:firstRowFirstColumn="0" w:firstRowLastColumn="0" w:lastRowFirstColumn="0" w:lastRowLastColumn="0"/>
             </w:pPr>
             <w:r>
               <w:t xml:space="preserve">Ice: 0.04 </w:t>
@@ -4087,11 +5340,11 @@
         </w:tc>
         <w:tc>
           <w:tcPr>
-            <w:tcW w:w="5686" w:type="dxa"/>
-          </w:tcPr>
-          <w:p>
-            <w:pPr>
-              <w:cnfStyle w:val="000000100000" w:firstRow="0" w:lastRow="0" w:firstColumn="0" w:lastColumn="0" w:oddVBand="0" w:evenVBand="0" w:oddHBand="1" w:evenHBand="0" w:firstRowFirstColumn="0" w:firstRowLastColumn="0" w:lastRowFirstColumn="0" w:lastRowLastColumn="0"/>
+            <w:tcW w:w="1359" w:type="pct"/>
+          </w:tcPr>
+          <w:p>
+            <w:pPr>
+              <w:cnfStyle w:val="000000000000" w:firstRow="0" w:lastRow="0" w:firstColumn="0" w:lastColumn="0" w:oddVBand="0" w:evenVBand="0" w:oddHBand="0" w:evenHBand="0" w:firstRowFirstColumn="0" w:firstRowLastColumn="0" w:lastRowFirstColumn="0" w:lastRowLastColumn="0"/>
             </w:pPr>
             <w:r>
               <w:t xml:space="preserve">Automated colorimetric flow injection analysis (Seal AQ2) LOD = </w:t>
@@ -4120,7 +5373,7 @@
           </w:p>
           <w:p>
             <w:pPr>
-              <w:cnfStyle w:val="000000100000" w:firstRow="0" w:lastRow="0" w:firstColumn="0" w:lastColumn="0" w:oddVBand="0" w:evenVBand="0" w:oddHBand="1" w:evenHBand="0" w:firstRowFirstColumn="0" w:firstRowLastColumn="0" w:lastRowFirstColumn="0" w:lastRowLastColumn="0"/>
+              <w:cnfStyle w:val="000000000000" w:firstRow="0" w:lastRow="0" w:firstColumn="0" w:lastColumn="0" w:oddVBand="0" w:evenVBand="0" w:oddHBand="0" w:evenHBand="0" w:firstRowFirstColumn="0" w:firstRowLastColumn="0" w:lastRowFirstColumn="0" w:lastRowLastColumn="0"/>
             </w:pPr>
             <w:r>
               <w:t>ICP-MS (outsource) (Bradley email)</w:t>
@@ -4130,12 +5383,12 @@
       </w:tr>
       <w:tr>
         <w:trPr>
-          <w:jc w:val="center"/>
+          <w:cnfStyle w:val="000000100000" w:firstRow="0" w:lastRow="0" w:firstColumn="0" w:lastColumn="0" w:oddVBand="0" w:evenVBand="0" w:oddHBand="1" w:evenHBand="0" w:firstRowFirstColumn="0" w:firstRowLastColumn="0" w:lastRowFirstColumn="0" w:lastRowLastColumn="0"/>
         </w:trPr>
         <w:tc>
           <w:tcPr>
             <w:cnfStyle w:val="001000000000" w:firstRow="0" w:lastRow="0" w:firstColumn="1" w:lastColumn="0" w:oddVBand="0" w:evenVBand="0" w:oddHBand="0" w:evenHBand="0" w:firstRowFirstColumn="0" w:firstRowLastColumn="0" w:lastRowFirstColumn="0" w:lastRowLastColumn="0"/>
-            <w:tcW w:w="0" w:type="auto"/>
+            <w:tcW w:w="681" w:type="pct"/>
           </w:tcPr>
           <w:p>
             <w:r>
@@ -4145,11 +5398,21 @@
         </w:tc>
         <w:tc>
           <w:tcPr>
-            <w:tcW w:w="5953" w:type="dxa"/>
-          </w:tcPr>
-          <w:p>
-            <w:pPr>
-              <w:cnfStyle w:val="000000000000" w:firstRow="0" w:lastRow="0" w:firstColumn="0" w:lastColumn="0" w:oddVBand="0" w:evenVBand="0" w:oddHBand="0" w:evenHBand="0" w:firstRowFirstColumn="0" w:firstRowLastColumn="0" w:lastRowFirstColumn="0" w:lastRowLastColumn="0"/>
+            <w:tcW w:w="2131" w:type="pct"/>
+          </w:tcPr>
+          <w:p>
+            <w:pPr>
+              <w:cnfStyle w:val="000000100000" w:firstRow="0" w:lastRow="0" w:firstColumn="0" w:lastColumn="0" w:oddVBand="0" w:evenVBand="0" w:oddHBand="1" w:evenHBand="0" w:firstRowFirstColumn="0" w:firstRowLastColumn="0" w:lastRowFirstColumn="0" w:lastRowLastColumn="0"/>
+            </w:pPr>
+          </w:p>
+        </w:tc>
+        <w:tc>
+          <w:tcPr>
+            <w:tcW w:w="829" w:type="pct"/>
+          </w:tcPr>
+          <w:p>
+            <w:pPr>
+              <w:cnfStyle w:val="000000100000" w:firstRow="0" w:lastRow="0" w:firstColumn="0" w:lastColumn="0" w:oddVBand="0" w:evenVBand="0" w:oddHBand="1" w:evenHBand="0" w:firstRowFirstColumn="0" w:firstRowLastColumn="0" w:lastRowFirstColumn="0" w:lastRowLastColumn="0"/>
             </w:pPr>
             <w:r>
               <w:t xml:space="preserve">Snow: 1.9  </w:t>
@@ -4186,7 +5449,7 @@
           </w:p>
           <w:p>
             <w:pPr>
-              <w:cnfStyle w:val="000000000000" w:firstRow="0" w:lastRow="0" w:firstColumn="0" w:lastColumn="0" w:oddVBand="0" w:evenVBand="0" w:oddHBand="0" w:evenHBand="0" w:firstRowFirstColumn="0" w:firstRowLastColumn="0" w:lastRowFirstColumn="0" w:lastRowLastColumn="0"/>
+              <w:cnfStyle w:val="000000100000" w:firstRow="0" w:lastRow="0" w:firstColumn="0" w:lastColumn="0" w:oddVBand="0" w:evenVBand="0" w:oddHBand="1" w:evenHBand="0" w:firstRowFirstColumn="0" w:firstRowLastColumn="0" w:lastRowFirstColumn="0" w:lastRowLastColumn="0"/>
             </w:pPr>
             <w:r>
               <w:t>Ice: 0.2 mg L</w:t>
@@ -4221,7 +5484,7 @@
           </w:p>
           <w:p>
             <w:pPr>
-              <w:cnfStyle w:val="000000000000" w:firstRow="0" w:lastRow="0" w:firstColumn="0" w:lastColumn="0" w:oddVBand="0" w:evenVBand="0" w:oddHBand="0" w:evenHBand="0" w:firstRowFirstColumn="0" w:firstRowLastColumn="0" w:lastRowFirstColumn="0" w:lastRowLastColumn="0"/>
+              <w:cnfStyle w:val="000000100000" w:firstRow="0" w:lastRow="0" w:firstColumn="0" w:lastColumn="0" w:oddVBand="0" w:evenVBand="0" w:oddHBand="1" w:evenHBand="0" w:firstRowFirstColumn="0" w:firstRowLastColumn="0" w:lastRowFirstColumn="0" w:lastRowLastColumn="0"/>
             </w:pPr>
             <w:r>
               <w:t>Ice: 0.002-0.4mg L</w:t>
@@ -4248,7 +5511,7 @@
               <w:rPr>
                 <w:vertAlign w:val="superscript"/>
               </w:rPr>
-              <w:instrText>ADDIN CSL_CITATION {"citationItems":[{"id":"ITEM-1","itemData":{"DOI":"10.1038/s41467-020-20627-w","ISSN":"20411723","abstract":"Melting of the Greenland Ice Sheet is a leading cause of land-ice mass loss and cryosphere-attributed sea level rise. Blooms of pigmented glacier ice algae lower ice albedo and accelerate surface melting in the ice sheet’s southwest sector. Although glacier ice algae cause up to 13% of the surface melting in this region, the controls on bloom development remain poorly understood. Here we show a direct link between mineral phosphorus in surface ice and glacier ice algae biomass through the quantification of solid and fluid phase phosphorus reservoirs in surface habitats across the southwest ablation zone of the ice sheet. We demonstrate that nutrients from mineral dust likely drive glacier ice algal growth, and thereby identify mineral dust as a secondary control on ice sheet melting.","author":[{"dropping-particle":"","family":"McCutcheon","given":"Jenine","non-dropping-particle":"","parse-names":false,"suffix":""},{"dropping-particle":"","family":"Lutz","given":"Stefanie","non-dropping-particle":"","parse-names":false,"suffix":""},{"dropping-particle":"","family":"Williamson","given":"Christopher","non-dropping-particle":"","parse-names":false,"suffix":""},{"dropping-particle":"","family":"Cook","given":"Joseph M.","non-dropping-particle":"","parse-names":false,"suffix":""},{"dropping-particle":"","family":"Tedstone","given":"Andrew J.","non-dropping-particle":"","parse-names":false,"suffix":""},{"dropping-particle":"","family":"Vanderstraeten","given":"Aubry","non-dropping-particle":"","parse-names":false,"suffix":""},{"dropping-particle":"","family":"Wilson","given":"Siobhan A.","non-dropping-particle":"","parse-names":false,"suffix":""},{"dropping-particle":"","family":"Stockdale","given":"Anthony","non-dropping-particle":"","parse-names":false,"suffix":""},{"dropping-particle":"","family":"Bonneville","given":"Steeve","non-dropping-particle":"","parse-names":false,"suffix":""},{"dropping-particle":"","family":"Anesio","given":"Alexandre M.","non-dropping-particle":"","parse-names":false,"suffix":""},{"dropping-particle":"","family":"Yallop","given":"Marian L.","non-dropping-particle":"","parse-names":false,"suffix":""},{"dropping-particle":"","family":"McQuaid","given":"James B.","non-dropping-particle":"","parse-names":false,"suffix":""},{"dropping-particle":"","family":"Tranter","given":"Martyn","non-dropping-particle":"","parse-names":false,"suffix":""},{"dropping-particle":"","family":"Benning","given":"Liane G.","non-dropping-particle":"","parse-names":false,"suffix":""}],"container-title":"Nature Communications","id":"ITEM-1","issue":"1","issued":{"date-parts":[["2021"]]},"page":"1-11","publisher":"Springer US","title":"Mineral phosphorus drives glacier algal blooms on the Greenland Ice Sheet","type":"article-journal","volume":"12"},"uris":["http://www.mendeley.com/documents/?uuid=48651b01-3d31-491b-b6cf-d3e21f9151d9"]}],"mendeley":{"formattedCitation":"(McCutcheon et al., 2021)","plainTextFormattedCitation":"(McCutcheon et al., 2021)"},"properties":{"noteIndex":0},"schema":"https://github.com/citation-style-language/schema/raw/master/csl-citation.json"}</w:instrText>
+              <w:instrText>ADDIN CSL_CITATION {"citationItems":[{"id":"ITEM-1","itemData":{"DOI":"10.1038/s41467-020-20627-w","ISSN":"20411723","abstract":"Melting of the Greenland Ice Sheet is a leading cause of land-ice mass loss and cryosphere-attributed sea level rise. Blooms of pigmented glacier ice algae lower ice albedo and accelerate surface melting in the ice sheet’s southwest sector. Although glacier ice algae cause up to 13% of the surface melting in this region, the controls on bloom development remain poorly understood. Here we show a direct link between mineral phosphorus in surface ice and glacier ice algae biomass through the quantification of solid and fluid phase phosphorus reservoirs in surface habitats across the southwest ablation zone of the ice sheet. We demonstrate that nutrients from mineral dust likely drive glacier ice algal growth, and thereby identify mineral dust as a secondary control on ice sheet melting.","author":[{"dropping-particle":"","family":"McCutcheon","given":"Jenine","non-dropping-particle":"","parse-names":false,"suffix":""},{"dropping-particle":"","family":"Lutz","given":"Stefanie","non-dropping-particle":"","parse-names":false,"suffix":""},{"dropping-particle":"","family":"Williamson","given":"Christopher","non-dropping-particle":"","parse-names":false,"suffix":""},{"dropping-particle":"","family":"Cook","given":"Joseph M.","non-dropping-particle":"","parse-names":false,"suffix":""},{"dropping-particle":"","family":"Tedstone","given":"Andrew J.","non-dropping-particle":"","parse-names":false,"suffix":""},{"dropping-particle":"","family":"Vanderstraeten","given":"Aubry","non-dropping-particle":"","parse-names":false,"suffix":""},{"dropping-particle":"","family":"Wilson","given":"Siobhan A.","non-dropping-particle":"","parse-names":false,"suffix":""},{"dropping-particle":"","family":"Stockdale","given":"Anthony","non-dropping-particle":"","parse-names":false,"suffix":""},{"dropping-particle":"","family":"Bonneville","given":"Steeve","non-dropping-particle":"","parse-names":false,"suffix":""},{"dropping-particle":"","family":"Anesio","given":"Alexandre M.","non-dropping-particle":"","parse-names":false,"suffix":""},{"dropping-particle":"","family":"Yallop","given":"Marian L.","non-dropping-particle":"","parse-names":false,"suffix":""},{"dropping-particle":"","family":"McQuaid","given":"James B.","non-dropping-particle":"","parse-names":false,"suffix":""},{"dropping-particle":"","family":"Tranter","given":"Martyn","non-dropping-particle":"","parse-names":false,"suffix":""},{"dropping-particle":"","family":"Benning","given":"Liane G.","non-dropping-particle":"","parse-names":false,"suffix":""}],"container-title":"Nature Communications","id":"ITEM-1","issue":"1","issued":{"date-parts":[["2021"]]},"page":"1-11","publisher":"Springer US","title":"Mineral phosphorus drives glacier algal blooms on the Greenland Ice Sheet","type":"article-journal","volume":"12"},"uris":["http://www.mendeley.com/documents/?uuid=48651b01-3d31-491b-b6cf-d3e21f9151d9"]}],"mendeley":{"formattedCitation":"(McCutcheon et al., 2021)","plainTextFormattedCitation":"(McCutcheon et al., 2021)","previouslyFormattedCitation":"(McCutcheon et al., 2021)"},"properties":{"noteIndex":0},"schema":"https://github.com/citation-style-language/schema/raw/master/csl-citation.json"}</w:instrText>
             </w:r>
             <w:r>
               <w:rPr>
@@ -4271,17 +5534,17 @@
           </w:p>
           <w:p>
             <w:pPr>
-              <w:cnfStyle w:val="000000000000" w:firstRow="0" w:lastRow="0" w:firstColumn="0" w:lastColumn="0" w:oddVBand="0" w:evenVBand="0" w:oddHBand="0" w:evenHBand="0" w:firstRowFirstColumn="0" w:firstRowLastColumn="0" w:lastRowFirstColumn="0" w:lastRowLastColumn="0"/>
-            </w:pPr>
-          </w:p>
-        </w:tc>
-        <w:tc>
-          <w:tcPr>
-            <w:tcW w:w="5686" w:type="dxa"/>
-          </w:tcPr>
-          <w:p>
-            <w:pPr>
-              <w:cnfStyle w:val="000000000000" w:firstRow="0" w:lastRow="0" w:firstColumn="0" w:lastColumn="0" w:oddVBand="0" w:evenVBand="0" w:oddHBand="0" w:evenHBand="0" w:firstRowFirstColumn="0" w:firstRowLastColumn="0" w:lastRowFirstColumn="0" w:lastRowLastColumn="0"/>
+              <w:cnfStyle w:val="000000100000" w:firstRow="0" w:lastRow="0" w:firstColumn="0" w:lastColumn="0" w:oddVBand="0" w:evenVBand="0" w:oddHBand="1" w:evenHBand="0" w:firstRowFirstColumn="0" w:firstRowLastColumn="0" w:lastRowFirstColumn="0" w:lastRowLastColumn="0"/>
+            </w:pPr>
+          </w:p>
+        </w:tc>
+        <w:tc>
+          <w:tcPr>
+            <w:tcW w:w="1359" w:type="pct"/>
+          </w:tcPr>
+          <w:p>
+            <w:pPr>
+              <w:cnfStyle w:val="000000100000" w:firstRow="0" w:lastRow="0" w:firstColumn="0" w:lastColumn="0" w:oddVBand="0" w:evenVBand="0" w:oddHBand="1" w:evenHBand="0" w:firstRowFirstColumn="0" w:firstRowLastColumn="0" w:lastRowFirstColumn="0" w:lastRowLastColumn="0"/>
             </w:pPr>
             <w:r>
               <w:t xml:space="preserve">ICP-MS LOD = 0.1 ppb </w:t>
@@ -4307,7 +5570,7 @@
           </w:p>
           <w:p>
             <w:pPr>
-              <w:cnfStyle w:val="000000000000" w:firstRow="0" w:lastRow="0" w:firstColumn="0" w:lastColumn="0" w:oddVBand="0" w:evenVBand="0" w:oddHBand="0" w:evenHBand="0" w:firstRowFirstColumn="0" w:firstRowLastColumn="0" w:lastRowFirstColumn="0" w:lastRowLastColumn="0"/>
+              <w:cnfStyle w:val="000000100000" w:firstRow="0" w:lastRow="0" w:firstColumn="0" w:lastColumn="0" w:oddVBand="0" w:evenVBand="0" w:oddHBand="1" w:evenHBand="0" w:firstRowFirstColumn="0" w:firstRowLastColumn="0" w:lastRowFirstColumn="0" w:lastRowLastColumn="0"/>
             </w:pPr>
             <w:r>
               <w:t xml:space="preserve">﻿ICP-OES (Varian Vista-Pro) </w:t>
@@ -4342,7 +5605,7 @@
           </w:p>
           <w:p>
             <w:pPr>
-              <w:cnfStyle w:val="000000000000" w:firstRow="0" w:lastRow="0" w:firstColumn="0" w:lastColumn="0" w:oddVBand="0" w:evenVBand="0" w:oddHBand="0" w:evenHBand="0" w:firstRowFirstColumn="0" w:firstRowLastColumn="0" w:lastRowFirstColumn="0" w:lastRowLastColumn="0"/>
+              <w:cnfStyle w:val="000000100000" w:firstRow="0" w:lastRow="0" w:firstColumn="0" w:lastColumn="0" w:oddVBand="0" w:evenVBand="0" w:oddHBand="1" w:evenHBand="0" w:firstRowFirstColumn="0" w:firstRowLastColumn="0" w:lastRowFirstColumn="0" w:lastRowLastColumn="0"/>
             </w:pPr>
             <w:r>
               <w:t>ICP-MS (outsource) (Bradley email)</w:t>
@@ -4351,14 +5614,10 @@
         </w:tc>
       </w:tr>
       <w:tr>
-        <w:trPr>
-          <w:cnfStyle w:val="000000100000" w:firstRow="0" w:lastRow="0" w:firstColumn="0" w:lastColumn="0" w:oddVBand="0" w:evenVBand="0" w:oddHBand="1" w:evenHBand="0" w:firstRowFirstColumn="0" w:firstRowLastColumn="0" w:lastRowFirstColumn="0" w:lastRowLastColumn="0"/>
-          <w:jc w:val="center"/>
-        </w:trPr>
         <w:tc>
           <w:tcPr>
             <w:cnfStyle w:val="001000000000" w:firstRow="0" w:lastRow="0" w:firstColumn="1" w:lastColumn="0" w:oddVBand="0" w:evenVBand="0" w:oddHBand="0" w:evenHBand="0" w:firstRowFirstColumn="0" w:firstRowLastColumn="0" w:lastRowFirstColumn="0" w:lastRowLastColumn="0"/>
-            <w:tcW w:w="0" w:type="auto"/>
+            <w:tcW w:w="681" w:type="pct"/>
           </w:tcPr>
           <w:p>
             <w:r>
@@ -4368,11 +5627,21 @@
         </w:tc>
         <w:tc>
           <w:tcPr>
-            <w:tcW w:w="5953" w:type="dxa"/>
-          </w:tcPr>
-          <w:p>
-            <w:pPr>
-              <w:cnfStyle w:val="000000100000" w:firstRow="0" w:lastRow="0" w:firstColumn="0" w:lastColumn="0" w:oddVBand="0" w:evenVBand="0" w:oddHBand="1" w:evenHBand="0" w:firstRowFirstColumn="0" w:firstRowLastColumn="0" w:lastRowFirstColumn="0" w:lastRowLastColumn="0"/>
+            <w:tcW w:w="2131" w:type="pct"/>
+          </w:tcPr>
+          <w:p>
+            <w:pPr>
+              <w:cnfStyle w:val="000000000000" w:firstRow="0" w:lastRow="0" w:firstColumn="0" w:lastColumn="0" w:oddVBand="0" w:evenVBand="0" w:oddHBand="0" w:evenHBand="0" w:firstRowFirstColumn="0" w:firstRowLastColumn="0" w:lastRowFirstColumn="0" w:lastRowLastColumn="0"/>
+            </w:pPr>
+          </w:p>
+        </w:tc>
+        <w:tc>
+          <w:tcPr>
+            <w:tcW w:w="829" w:type="pct"/>
+          </w:tcPr>
+          <w:p>
+            <w:pPr>
+              <w:cnfStyle w:val="000000000000" w:firstRow="0" w:lastRow="0" w:firstColumn="0" w:lastColumn="0" w:oddVBand="0" w:evenVBand="0" w:oddHBand="0" w:evenHBand="0" w:firstRowFirstColumn="0" w:firstRowLastColumn="0" w:lastRowFirstColumn="0" w:lastRowLastColumn="0"/>
             </w:pPr>
             <w:r>
               <w:t xml:space="preserve">Snow: 41  </w:t>
@@ -4409,7 +5678,7 @@
           </w:p>
           <w:p>
             <w:pPr>
-              <w:cnfStyle w:val="000000100000" w:firstRow="0" w:lastRow="0" w:firstColumn="0" w:lastColumn="0" w:oddVBand="0" w:evenVBand="0" w:oddHBand="1" w:evenHBand="0" w:firstRowFirstColumn="0" w:firstRowLastColumn="0" w:lastRowFirstColumn="0" w:lastRowLastColumn="0"/>
+              <w:cnfStyle w:val="000000000000" w:firstRow="0" w:lastRow="0" w:firstColumn="0" w:lastColumn="0" w:oddVBand="0" w:evenVBand="0" w:oddHBand="0" w:evenHBand="0" w:firstRowFirstColumn="0" w:firstRowLastColumn="0" w:lastRowFirstColumn="0" w:lastRowLastColumn="0"/>
             </w:pPr>
             <w:r>
               <w:t>Ice: 0.27-0.28 mg L</w:t>
@@ -4444,7 +5713,7 @@
           </w:p>
           <w:p>
             <w:pPr>
-              <w:cnfStyle w:val="000000100000" w:firstRow="0" w:lastRow="0" w:firstColumn="0" w:lastColumn="0" w:oddVBand="0" w:evenVBand="0" w:oddHBand="1" w:evenHBand="0" w:firstRowFirstColumn="0" w:firstRowLastColumn="0" w:lastRowFirstColumn="0" w:lastRowLastColumn="0"/>
+              <w:cnfStyle w:val="000000000000" w:firstRow="0" w:lastRow="0" w:firstColumn="0" w:lastColumn="0" w:oddVBand="0" w:evenVBand="0" w:oddHBand="0" w:evenHBand="0" w:firstRowFirstColumn="0" w:firstRowLastColumn="0" w:lastRowFirstColumn="0" w:lastRowLastColumn="0"/>
             </w:pPr>
             <w:r>
               <w:t xml:space="preserve">Ice: 2.3 </w:t>
@@ -4500,7 +5769,7 @@
           </w:p>
           <w:p>
             <w:pPr>
-              <w:cnfStyle w:val="000000100000" w:firstRow="0" w:lastRow="0" w:firstColumn="0" w:lastColumn="0" w:oddVBand="0" w:evenVBand="0" w:oddHBand="1" w:evenHBand="0" w:firstRowFirstColumn="0" w:firstRowLastColumn="0" w:lastRowFirstColumn="0" w:lastRowLastColumn="0"/>
+              <w:cnfStyle w:val="000000000000" w:firstRow="0" w:lastRow="0" w:firstColumn="0" w:lastColumn="0" w:oddVBand="0" w:evenVBand="0" w:oddHBand="0" w:evenHBand="0" w:firstRowFirstColumn="0" w:firstRowLastColumn="0" w:lastRowFirstColumn="0" w:lastRowLastColumn="0"/>
             </w:pPr>
             <w:r>
               <w:t>Snow: 0.04-0.05 mg L</w:t>
@@ -4535,7 +5804,7 @@
           </w:p>
           <w:p>
             <w:pPr>
-              <w:cnfStyle w:val="000000100000" w:firstRow="0" w:lastRow="0" w:firstColumn="0" w:lastColumn="0" w:oddVBand="0" w:evenVBand="0" w:oddHBand="1" w:evenHBand="0" w:firstRowFirstColumn="0" w:firstRowLastColumn="0" w:lastRowFirstColumn="0" w:lastRowLastColumn="0"/>
+              <w:cnfStyle w:val="000000000000" w:firstRow="0" w:lastRow="0" w:firstColumn="0" w:lastColumn="0" w:oddVBand="0" w:evenVBand="0" w:oddHBand="0" w:evenHBand="0" w:firstRowFirstColumn="0" w:firstRowLastColumn="0" w:lastRowFirstColumn="0" w:lastRowLastColumn="0"/>
             </w:pPr>
             <w:r>
               <w:t>Ice: 0.02 mg L</w:t>
@@ -4562,7 +5831,7 @@
               <w:rPr>
                 <w:vertAlign w:val="superscript"/>
               </w:rPr>
-              <w:instrText>ADDIN CSL_CITATION {"citationItems":[{"id":"ITEM-1","itemData":{"DOI":"10.1038/s41467-020-20627-w","ISSN":"20411723","abstract":"Melting of the Greenland Ice Sheet is a leading cause of land-ice mass loss and cryosphere-attributed sea level rise. Blooms of pigmented glacier ice algae lower ice albedo and accelerate surface melting in the ice sheet’s southwest sector. Although glacier ice algae cause up to 13% of the surface melting in this region, the controls on bloom development remain poorly understood. Here we show a direct link between mineral phosphorus in surface ice and glacier ice algae biomass through the quantification of solid and fluid phase phosphorus reservoirs in surface habitats across the southwest ablation zone of the ice sheet. We demonstrate that nutrients from mineral dust likely drive glacier ice algal growth, and thereby identify mineral dust as a secondary control on ice sheet melting.","author":[{"dropping-particle":"","family":"McCutcheon","given":"Jenine","non-dropping-particle":"","parse-names":false,"suffix":""},{"dropping-particle":"","family":"Lutz","given":"Stefanie","non-dropping-particle":"","parse-names":false,"suffix":""},{"dropping-particle":"","family":"Williamson","given":"Christopher","non-dropping-particle":"","parse-names":false,"suffix":""},{"dropping-particle":"","family":"Cook","given":"Joseph M.","non-dropping-particle":"","parse-names":false,"suffix":""},{"dropping-particle":"","family":"Tedstone","given":"Andrew J.","non-dropping-particle":"","parse-names":false,"suffix":""},{"dropping-particle":"","family":"Vanderstraeten","given":"Aubry","non-dropping-particle":"","parse-names":false,"suffix":""},{"dropping-particle":"","family":"Wilson","given":"Siobhan A.","non-dropping-particle":"","parse-names":false,"suffix":""},{"dropping-particle":"","family":"Stockdale","given":"Anthony","non-dropping-particle":"","parse-names":false,"suffix":""},{"dropping-particle":"","family":"Bonneville","given":"Steeve","non-dropping-particle":"","parse-names":false,"suffix":""},{"dropping-particle":"","family":"Anesio","given":"Alexandre M.","non-dropping-particle":"","parse-names":false,"suffix":""},{"dropping-particle":"","family":"Yallop","given":"Marian L.","non-dropping-particle":"","parse-names":false,"suffix":""},{"dropping-particle":"","family":"McQuaid","given":"James B.","non-dropping-particle":"","parse-names":false,"suffix":""},{"dropping-particle":"","family":"Tranter","given":"Martyn","non-dropping-particle":"","parse-names":false,"suffix":""},{"dropping-particle":"","family":"Benning","given":"Liane G.","non-dropping-particle":"","parse-names":false,"suffix":""}],"container-title":"Nature Communications","id":"ITEM-1","issue":"1","issued":{"date-parts":[["2021"]]},"page":"1-11","publisher":"Springer US","title":"Mineral phosphorus drives glacier algal blooms on the Greenland Ice Sheet","type":"article-journal","volume":"12"},"uris":["http://www.mendeley.com/documents/?uuid=48651b01-3d31-491b-b6cf-d3e21f9151d9"]}],"mendeley":{"formattedCitation":"(McCutcheon et al., 2021)","plainTextFormattedCitation":"(McCutcheon et al., 2021)"},"properties":{"noteIndex":0},"schema":"https://github.com/citation-style-language/schema/raw/master/csl-citation.json"}</w:instrText>
+              <w:instrText>ADDIN CSL_CITATION {"citationItems":[{"id":"ITEM-1","itemData":{"DOI":"10.1038/s41467-020-20627-w","ISSN":"20411723","abstract":"Melting of the Greenland Ice Sheet is a leading cause of land-ice mass loss and cryosphere-attributed sea level rise. Blooms of pigmented glacier ice algae lower ice albedo and accelerate surface melting in the ice sheet’s southwest sector. Although glacier ice algae cause up to 13% of the surface melting in this region, the controls on bloom development remain poorly understood. Here we show a direct link between mineral phosphorus in surface ice and glacier ice algae biomass through the quantification of solid and fluid phase phosphorus reservoirs in surface habitats across the southwest ablation zone of the ice sheet. We demonstrate that nutrients from mineral dust likely drive glacier ice algal growth, and thereby identify mineral dust as a secondary control on ice sheet melting.","author":[{"dropping-particle":"","family":"McCutcheon","given":"Jenine","non-dropping-particle":"","parse-names":false,"suffix":""},{"dropping-particle":"","family":"Lutz","given":"Stefanie","non-dropping-particle":"","parse-names":false,"suffix":""},{"dropping-particle":"","family":"Williamson","given":"Christopher","non-dropping-particle":"","parse-names":false,"suffix":""},{"dropping-particle":"","family":"Cook","given":"Joseph M.","non-dropping-particle":"","parse-names":false,"suffix":""},{"dropping-particle":"","family":"Tedstone","given":"Andrew J.","non-dropping-particle":"","parse-names":false,"suffix":""},{"dropping-particle":"","family":"Vanderstraeten","given":"Aubry","non-dropping-particle":"","parse-names":false,"suffix":""},{"dropping-particle":"","family":"Wilson","given":"Siobhan A.","non-dropping-particle":"","parse-names":false,"suffix":""},{"dropping-particle":"","family":"Stockdale","given":"Anthony","non-dropping-particle":"","parse-names":false,"suffix":""},{"dropping-particle":"","family":"Bonneville","given":"Steeve","non-dropping-particle":"","parse-names":false,"suffix":""},{"dropping-particle":"","family":"Anesio","given":"Alexandre M.","non-dropping-particle":"","parse-names":false,"suffix":""},{"dropping-particle":"","family":"Yallop","given":"Marian L.","non-dropping-particle":"","parse-names":false,"suffix":""},{"dropping-particle":"","family":"McQuaid","given":"James B.","non-dropping-particle":"","parse-names":false,"suffix":""},{"dropping-particle":"","family":"Tranter","given":"Martyn","non-dropping-particle":"","parse-names":false,"suffix":""},{"dropping-particle":"","family":"Benning","given":"Liane G.","non-dropping-particle":"","parse-names":false,"suffix":""}],"container-title":"Nature Communications","id":"ITEM-1","issue":"1","issued":{"date-parts":[["2021"]]},"page":"1-11","publisher":"Springer US","title":"Mineral phosphorus drives glacier algal blooms on the Greenland Ice Sheet","type":"article-journal","volume":"12"},"uris":["http://www.mendeley.com/documents/?uuid=48651b01-3d31-491b-b6cf-d3e21f9151d9"]}],"mendeley":{"formattedCitation":"(McCutcheon et al., 2021)","plainTextFormattedCitation":"(McCutcheon et al., 2021)","previouslyFormattedCitation":"(McCutcheon et al., 2021)"},"properties":{"noteIndex":0},"schema":"https://github.com/citation-style-language/schema/raw/master/csl-citation.json"}</w:instrText>
             </w:r>
             <w:r>
               <w:rPr>
@@ -4586,11 +5855,11 @@
         </w:tc>
         <w:tc>
           <w:tcPr>
-            <w:tcW w:w="5686" w:type="dxa"/>
-          </w:tcPr>
-          <w:p>
-            <w:pPr>
-              <w:cnfStyle w:val="000000100000" w:firstRow="0" w:lastRow="0" w:firstColumn="0" w:lastColumn="0" w:oddVBand="0" w:evenVBand="0" w:oddHBand="1" w:evenHBand="0" w:firstRowFirstColumn="0" w:firstRowLastColumn="0" w:lastRowFirstColumn="0" w:lastRowLastColumn="0"/>
+            <w:tcW w:w="1359" w:type="pct"/>
+          </w:tcPr>
+          <w:p>
+            <w:pPr>
+              <w:cnfStyle w:val="000000000000" w:firstRow="0" w:lastRow="0" w:firstColumn="0" w:lastColumn="0" w:oddVBand="0" w:evenVBand="0" w:oddHBand="0" w:evenHBand="0" w:firstRowFirstColumn="0" w:firstRowLastColumn="0" w:lastRowFirstColumn="0" w:lastRowLastColumn="0"/>
             </w:pPr>
             <w:r>
               <w:t xml:space="preserve">ICP-MS LOD = 10 ppb </w:t>
@@ -4616,7 +5885,7 @@
           </w:p>
           <w:p>
             <w:pPr>
-              <w:cnfStyle w:val="000000100000" w:firstRow="0" w:lastRow="0" w:firstColumn="0" w:lastColumn="0" w:oddVBand="0" w:evenVBand="0" w:oddHBand="1" w:evenHBand="0" w:firstRowFirstColumn="0" w:firstRowLastColumn="0" w:lastRowFirstColumn="0" w:lastRowLastColumn="0"/>
+              <w:cnfStyle w:val="000000000000" w:firstRow="0" w:lastRow="0" w:firstColumn="0" w:lastColumn="0" w:oddVBand="0" w:evenVBand="0" w:oddHBand="0" w:evenHBand="0" w:firstRowFirstColumn="0" w:firstRowLastColumn="0" w:lastRowFirstColumn="0" w:lastRowLastColumn="0"/>
             </w:pPr>
             <w:r>
               <w:t>ICP-MS (outsource) (Bradley email)</w:t>
@@ -4626,26 +5895,37 @@
       </w:tr>
       <w:tr>
         <w:trPr>
-          <w:jc w:val="center"/>
+          <w:cnfStyle w:val="000000100000" w:firstRow="0" w:lastRow="0" w:firstColumn="0" w:lastColumn="0" w:oddVBand="0" w:evenVBand="0" w:oddHBand="1" w:evenHBand="0" w:firstRowFirstColumn="0" w:firstRowLastColumn="0" w:lastRowFirstColumn="0" w:lastRowLastColumn="0"/>
         </w:trPr>
         <w:tc>
           <w:tcPr>
             <w:cnfStyle w:val="001000000000" w:firstRow="0" w:lastRow="0" w:firstColumn="1" w:lastColumn="0" w:oddVBand="0" w:evenVBand="0" w:oddHBand="0" w:evenHBand="0" w:firstRowFirstColumn="0" w:firstRowLastColumn="0" w:lastRowFirstColumn="0" w:lastRowLastColumn="0"/>
-            <w:tcW w:w="0" w:type="auto"/>
-          </w:tcPr>
-          <w:p>
-            <w:r>
+            <w:tcW w:w="681" w:type="pct"/>
+          </w:tcPr>
+          <w:p>
+            <w:r>
+              <w:lastRenderedPageBreak/>
               <w:t>Magnesium (Mg2 - cation)</w:t>
             </w:r>
           </w:p>
         </w:tc>
         <w:tc>
           <w:tcPr>
-            <w:tcW w:w="5953" w:type="dxa"/>
-          </w:tcPr>
-          <w:p>
-            <w:pPr>
-              <w:cnfStyle w:val="000000000000" w:firstRow="0" w:lastRow="0" w:firstColumn="0" w:lastColumn="0" w:oddVBand="0" w:evenVBand="0" w:oddHBand="0" w:evenHBand="0" w:firstRowFirstColumn="0" w:firstRowLastColumn="0" w:lastRowFirstColumn="0" w:lastRowLastColumn="0"/>
+            <w:tcW w:w="2131" w:type="pct"/>
+          </w:tcPr>
+          <w:p>
+            <w:pPr>
+              <w:cnfStyle w:val="000000100000" w:firstRow="0" w:lastRow="0" w:firstColumn="0" w:lastColumn="0" w:oddVBand="0" w:evenVBand="0" w:oddHBand="1" w:evenHBand="0" w:firstRowFirstColumn="0" w:firstRowLastColumn="0" w:lastRowFirstColumn="0" w:lastRowLastColumn="0"/>
+            </w:pPr>
+          </w:p>
+        </w:tc>
+        <w:tc>
+          <w:tcPr>
+            <w:tcW w:w="829" w:type="pct"/>
+          </w:tcPr>
+          <w:p>
+            <w:pPr>
+              <w:cnfStyle w:val="000000100000" w:firstRow="0" w:lastRow="0" w:firstColumn="0" w:lastColumn="0" w:oddVBand="0" w:evenVBand="0" w:oddHBand="1" w:evenHBand="0" w:firstRowFirstColumn="0" w:firstRowLastColumn="0" w:lastRowFirstColumn="0" w:lastRowLastColumn="0"/>
             </w:pPr>
             <w:r>
               <w:t xml:space="preserve">Snow: 125  </w:t>
@@ -4682,7 +5962,7 @@
           </w:p>
           <w:p>
             <w:pPr>
-              <w:cnfStyle w:val="000000000000" w:firstRow="0" w:lastRow="0" w:firstColumn="0" w:lastColumn="0" w:oddVBand="0" w:evenVBand="0" w:oddHBand="0" w:evenHBand="0" w:firstRowFirstColumn="0" w:firstRowLastColumn="0" w:lastRowFirstColumn="0" w:lastRowLastColumn="0"/>
+              <w:cnfStyle w:val="000000100000" w:firstRow="0" w:lastRow="0" w:firstColumn="0" w:lastColumn="0" w:oddVBand="0" w:evenVBand="0" w:oddHBand="1" w:evenHBand="0" w:firstRowFirstColumn="0" w:firstRowLastColumn="0" w:lastRowFirstColumn="0" w:lastRowLastColumn="0"/>
             </w:pPr>
             <w:r>
               <w:t>Ice: 0.25-0.27 mg L</w:t>
@@ -4717,7 +5997,7 @@
           </w:p>
           <w:p>
             <w:pPr>
-              <w:cnfStyle w:val="000000000000" w:firstRow="0" w:lastRow="0" w:firstColumn="0" w:lastColumn="0" w:oddVBand="0" w:evenVBand="0" w:oddHBand="0" w:evenHBand="0" w:firstRowFirstColumn="0" w:firstRowLastColumn="0" w:lastRowFirstColumn="0" w:lastRowLastColumn="0"/>
+              <w:cnfStyle w:val="000000100000" w:firstRow="0" w:lastRow="0" w:firstColumn="0" w:lastColumn="0" w:oddVBand="0" w:evenVBand="0" w:oddHBand="1" w:evenHBand="0" w:firstRowFirstColumn="0" w:firstRowLastColumn="0" w:lastRowFirstColumn="0" w:lastRowLastColumn="0"/>
             </w:pPr>
             <w:r>
               <w:t xml:space="preserve">Ice: 1.0 </w:t>
@@ -4773,7 +6053,7 @@
           </w:p>
           <w:p>
             <w:pPr>
-              <w:cnfStyle w:val="000000000000" w:firstRow="0" w:lastRow="0" w:firstColumn="0" w:lastColumn="0" w:oddVBand="0" w:evenVBand="0" w:oddHBand="0" w:evenHBand="0" w:firstRowFirstColumn="0" w:firstRowLastColumn="0" w:lastRowFirstColumn="0" w:lastRowLastColumn="0"/>
+              <w:cnfStyle w:val="000000100000" w:firstRow="0" w:lastRow="0" w:firstColumn="0" w:lastColumn="0" w:oddVBand="0" w:evenVBand="0" w:oddHBand="1" w:evenHBand="0" w:firstRowFirstColumn="0" w:firstRowLastColumn="0" w:lastRowFirstColumn="0" w:lastRowLastColumn="0"/>
             </w:pPr>
             <w:r>
               <w:t>Snow: 0.06-0.22 mg L</w:t>
@@ -4808,7 +6088,7 @@
           </w:p>
           <w:p>
             <w:pPr>
-              <w:cnfStyle w:val="000000000000" w:firstRow="0" w:lastRow="0" w:firstColumn="0" w:lastColumn="0" w:oddVBand="0" w:evenVBand="0" w:oddHBand="0" w:evenHBand="0" w:firstRowFirstColumn="0" w:firstRowLastColumn="0" w:lastRowFirstColumn="0" w:lastRowLastColumn="0"/>
+              <w:cnfStyle w:val="000000100000" w:firstRow="0" w:lastRow="0" w:firstColumn="0" w:lastColumn="0" w:oddVBand="0" w:evenVBand="0" w:oddHBand="1" w:evenHBand="0" w:firstRowFirstColumn="0" w:firstRowLastColumn="0" w:lastRowFirstColumn="0" w:lastRowLastColumn="0"/>
             </w:pPr>
             <w:r>
               <w:t xml:space="preserve">Snow: </w:t>
@@ -4846,7 +6126,7 @@
           </w:p>
           <w:p>
             <w:pPr>
-              <w:cnfStyle w:val="000000000000" w:firstRow="0" w:lastRow="0" w:firstColumn="0" w:lastColumn="0" w:oddVBand="0" w:evenVBand="0" w:oddHBand="0" w:evenHBand="0" w:firstRowFirstColumn="0" w:firstRowLastColumn="0" w:lastRowFirstColumn="0" w:lastRowLastColumn="0"/>
+              <w:cnfStyle w:val="000000100000" w:firstRow="0" w:lastRow="0" w:firstColumn="0" w:lastColumn="0" w:oddVBand="0" w:evenVBand="0" w:oddHBand="1" w:evenHBand="0" w:firstRowFirstColumn="0" w:firstRowLastColumn="0" w:lastRowFirstColumn="0" w:lastRowLastColumn="0"/>
             </w:pPr>
             <w:r>
               <w:t>Ice: 0.01-0.03mg L</w:t>
@@ -4873,7 +6153,7 @@
               <w:rPr>
                 <w:vertAlign w:val="superscript"/>
               </w:rPr>
-              <w:instrText>ADDIN CSL_CITATION {"citationItems":[{"id":"ITEM-1","itemData":{"DOI":"10.1038/s41467-020-20627-w","ISSN":"20411723","abstract":"Melting of the Greenland Ice Sheet is a leading cause of land-ice mass loss and cryosphere-attributed sea level rise. Blooms of pigmented glacier ice algae lower ice albedo and accelerate surface melting in the ice sheet’s southwest sector. Although glacier ice algae cause up to 13% of the surface melting in this region, the controls on bloom development remain poorly understood. Here we show a direct link between mineral phosphorus in surface ice and glacier ice algae biomass through the quantification of solid and fluid phase phosphorus reservoirs in surface habitats across the southwest ablation zone of the ice sheet. We demonstrate that nutrients from mineral dust likely drive glacier ice algal growth, and thereby identify mineral dust as a secondary control on ice sheet melting.","author":[{"dropping-particle":"","family":"McCutcheon","given":"Jenine","non-dropping-particle":"","parse-names":false,"suffix":""},{"dropping-particle":"","family":"Lutz","given":"Stefanie","non-dropping-particle":"","parse-names":false,"suffix":""},{"dropping-particle":"","family":"Williamson","given":"Christopher","non-dropping-particle":"","parse-names":false,"suffix":""},{"dropping-particle":"","family":"Cook","given":"Joseph M.","non-dropping-particle":"","parse-names":false,"suffix":""},{"dropping-particle":"","family":"Tedstone","given":"Andrew J.","non-dropping-particle":"","parse-names":false,"suffix":""},{"dropping-particle":"","family":"Vanderstraeten","given":"Aubry","non-dropping-particle":"","parse-names":false,"suffix":""},{"dropping-particle":"","family":"Wilson","given":"Siobhan A.","non-dropping-particle":"","parse-names":false,"suffix":""},{"dropping-particle":"","family":"Stockdale","given":"Anthony","non-dropping-particle":"","parse-names":false,"suffix":""},{"dropping-particle":"","family":"Bonneville","given":"Steeve","non-dropping-particle":"","parse-names":false,"suffix":""},{"dropping-particle":"","family":"Anesio","given":"Alexandre M.","non-dropping-particle":"","parse-names":false,"suffix":""},{"dropping-particle":"","family":"Yallop","given":"Marian L.","non-dropping-particle":"","parse-names":false,"suffix":""},{"dropping-particle":"","family":"McQuaid","given":"James B.","non-dropping-particle":"","parse-names":false,"suffix":""},{"dropping-particle":"","family":"Tranter","given":"Martyn","non-dropping-particle":"","parse-names":false,"suffix":""},{"dropping-particle":"","family":"Benning","given":"Liane G.","non-dropping-particle":"","parse-names":false,"suffix":""}],"container-title":"Nature Communications","id":"ITEM-1","issue":"1","issued":{"date-parts":[["2021"]]},"page":"1-11","publisher":"Springer US","title":"Mineral phosphorus drives glacier algal blooms on the Greenland Ice Sheet","type":"article-journal","volume":"12"},"uris":["http://www.mendeley.com/documents/?uuid=48651b01-3d31-491b-b6cf-d3e21f9151d9"]}],"mendeley":{"formattedCitation":"(McCutcheon et al., 2021)","plainTextFormattedCitation":"(McCutcheon et al., 2021)"},"properties":{"noteIndex":0},"schema":"https://github.com/citation-style-language/schema/raw/master/csl-citation.json"}</w:instrText>
+              <w:instrText>ADDIN CSL_CITATION {"citationItems":[{"id":"ITEM-1","itemData":{"DOI":"10.1038/s41467-020-20627-w","ISSN":"20411723","abstract":"Melting of the Greenland Ice Sheet is a leading cause of land-ice mass loss and cryosphere-attributed sea level rise. Blooms of pigmented glacier ice algae lower ice albedo and accelerate surface melting in the ice sheet’s southwest sector. Although glacier ice algae cause up to 13% of the surface melting in this region, the controls on bloom development remain poorly understood. Here we show a direct link between mineral phosphorus in surface ice and glacier ice algae biomass through the quantification of solid and fluid phase phosphorus reservoirs in surface habitats across the southwest ablation zone of the ice sheet. We demonstrate that nutrients from mineral dust likely drive glacier ice algal growth, and thereby identify mineral dust as a secondary control on ice sheet melting.","author":[{"dropping-particle":"","family":"McCutcheon","given":"Jenine","non-dropping-particle":"","parse-names":false,"suffix":""},{"dropping-particle":"","family":"Lutz","given":"Stefanie","non-dropping-particle":"","parse-names":false,"suffix":""},{"dropping-particle":"","family":"Williamson","given":"Christopher","non-dropping-particle":"","parse-names":false,"suffix":""},{"dropping-particle":"","family":"Cook","given":"Joseph M.","non-dropping-particle":"","parse-names":false,"suffix":""},{"dropping-particle":"","family":"Tedstone","given":"Andrew J.","non-dropping-particle":"","parse-names":false,"suffix":""},{"dropping-particle":"","family":"Vanderstraeten","given":"Aubry","non-dropping-particle":"","parse-names":false,"suffix":""},{"dropping-particle":"","family":"Wilson","given":"Siobhan A.","non-dropping-particle":"","parse-names":false,"suffix":""},{"dropping-particle":"","family":"Stockdale","given":"Anthony","non-dropping-particle":"","parse-names":false,"suffix":""},{"dropping-particle":"","family":"Bonneville","given":"Steeve","non-dropping-particle":"","parse-names":false,"suffix":""},{"dropping-particle":"","family":"Anesio","given":"Alexandre M.","non-dropping-particle":"","parse-names":false,"suffix":""},{"dropping-particle":"","family":"Yallop","given":"Marian L.","non-dropping-particle":"","parse-names":false,"suffix":""},{"dropping-particle":"","family":"McQuaid","given":"James B.","non-dropping-particle":"","parse-names":false,"suffix":""},{"dropping-particle":"","family":"Tranter","given":"Martyn","non-dropping-particle":"","parse-names":false,"suffix":""},{"dropping-particle":"","family":"Benning","given":"Liane G.","non-dropping-particle":"","parse-names":false,"suffix":""}],"container-title":"Nature Communications","id":"ITEM-1","issue":"1","issued":{"date-parts":[["2021"]]},"page":"1-11","publisher":"Springer US","title":"Mineral phosphorus drives glacier algal blooms on the Greenland Ice Sheet","type":"article-journal","volume":"12"},"uris":["http://www.mendeley.com/documents/?uuid=48651b01-3d31-491b-b6cf-d3e21f9151d9"]}],"mendeley":{"formattedCitation":"(McCutcheon et al., 2021)","plainTextFormattedCitation":"(McCutcheon et al., 2021)","previouslyFormattedCitation":"(McCutcheon et al., 2021)"},"properties":{"noteIndex":0},"schema":"https://github.com/citation-style-language/schema/raw/master/csl-citation.json"}</w:instrText>
             </w:r>
             <w:r>
               <w:rPr>
@@ -4896,17 +6176,17 @@
           </w:p>
           <w:p>
             <w:pPr>
-              <w:cnfStyle w:val="000000000000" w:firstRow="0" w:lastRow="0" w:firstColumn="0" w:lastColumn="0" w:oddVBand="0" w:evenVBand="0" w:oddHBand="0" w:evenHBand="0" w:firstRowFirstColumn="0" w:firstRowLastColumn="0" w:lastRowFirstColumn="0" w:lastRowLastColumn="0"/>
-            </w:pPr>
-          </w:p>
-        </w:tc>
-        <w:tc>
-          <w:tcPr>
-            <w:tcW w:w="5686" w:type="dxa"/>
-          </w:tcPr>
-          <w:p>
-            <w:pPr>
-              <w:cnfStyle w:val="000000000000" w:firstRow="0" w:lastRow="0" w:firstColumn="0" w:lastColumn="0" w:oddVBand="0" w:evenVBand="0" w:oddHBand="0" w:evenHBand="0" w:firstRowFirstColumn="0" w:firstRowLastColumn="0" w:lastRowFirstColumn="0" w:lastRowLastColumn="0"/>
+              <w:cnfStyle w:val="000000100000" w:firstRow="0" w:lastRow="0" w:firstColumn="0" w:lastColumn="0" w:oddVBand="0" w:evenVBand="0" w:oddHBand="1" w:evenHBand="0" w:firstRowFirstColumn="0" w:firstRowLastColumn="0" w:lastRowFirstColumn="0" w:lastRowLastColumn="0"/>
+            </w:pPr>
+          </w:p>
+        </w:tc>
+        <w:tc>
+          <w:tcPr>
+            <w:tcW w:w="1359" w:type="pct"/>
+          </w:tcPr>
+          <w:p>
+            <w:pPr>
+              <w:cnfStyle w:val="000000100000" w:firstRow="0" w:lastRow="0" w:firstColumn="0" w:lastColumn="0" w:oddVBand="0" w:evenVBand="0" w:oddHBand="1" w:evenHBand="0" w:firstRowFirstColumn="0" w:firstRowLastColumn="0" w:lastRowFirstColumn="0" w:lastRowLastColumn="0"/>
             </w:pPr>
             <w:r>
               <w:t xml:space="preserve">ICP-MS LOD = 0.1 ppb </w:t>
@@ -4932,7 +6212,7 @@
           </w:p>
           <w:p>
             <w:pPr>
-              <w:cnfStyle w:val="000000000000" w:firstRow="0" w:lastRow="0" w:firstColumn="0" w:lastColumn="0" w:oddVBand="0" w:evenVBand="0" w:oddHBand="0" w:evenHBand="0" w:firstRowFirstColumn="0" w:firstRowLastColumn="0" w:lastRowFirstColumn="0" w:lastRowLastColumn="0"/>
+              <w:cnfStyle w:val="000000100000" w:firstRow="0" w:lastRow="0" w:firstColumn="0" w:lastColumn="0" w:oddVBand="0" w:evenVBand="0" w:oddHBand="1" w:evenHBand="0" w:firstRowFirstColumn="0" w:firstRowLastColumn="0" w:lastRowFirstColumn="0" w:lastRowLastColumn="0"/>
             </w:pPr>
             <w:r>
               <w:t>ICP-MS (outsource) (Bradley email)</w:t>
@@ -4941,14 +6221,10 @@
         </w:tc>
       </w:tr>
       <w:tr>
-        <w:trPr>
-          <w:cnfStyle w:val="000000100000" w:firstRow="0" w:lastRow="0" w:firstColumn="0" w:lastColumn="0" w:oddVBand="0" w:evenVBand="0" w:oddHBand="1" w:evenHBand="0" w:firstRowFirstColumn="0" w:firstRowLastColumn="0" w:lastRowFirstColumn="0" w:lastRowLastColumn="0"/>
-          <w:jc w:val="center"/>
-        </w:trPr>
         <w:tc>
           <w:tcPr>
             <w:cnfStyle w:val="001000000000" w:firstRow="0" w:lastRow="0" w:firstColumn="1" w:lastColumn="0" w:oddVBand="0" w:evenVBand="0" w:oddHBand="0" w:evenHBand="0" w:firstRowFirstColumn="0" w:firstRowLastColumn="0" w:lastRowFirstColumn="0" w:lastRowLastColumn="0"/>
-            <w:tcW w:w="0" w:type="auto"/>
+            <w:tcW w:w="681" w:type="pct"/>
           </w:tcPr>
           <w:p>
             <w:r>
@@ -4958,11 +6234,21 @@
         </w:tc>
         <w:tc>
           <w:tcPr>
-            <w:tcW w:w="5953" w:type="dxa"/>
-          </w:tcPr>
-          <w:p>
-            <w:pPr>
-              <w:cnfStyle w:val="000000100000" w:firstRow="0" w:lastRow="0" w:firstColumn="0" w:lastColumn="0" w:oddVBand="0" w:evenVBand="0" w:oddHBand="1" w:evenHBand="0" w:firstRowFirstColumn="0" w:firstRowLastColumn="0" w:lastRowFirstColumn="0" w:lastRowLastColumn="0"/>
+            <w:tcW w:w="2131" w:type="pct"/>
+          </w:tcPr>
+          <w:p>
+            <w:pPr>
+              <w:cnfStyle w:val="000000000000" w:firstRow="0" w:lastRow="0" w:firstColumn="0" w:lastColumn="0" w:oddVBand="0" w:evenVBand="0" w:oddHBand="0" w:evenHBand="0" w:firstRowFirstColumn="0" w:firstRowLastColumn="0" w:lastRowFirstColumn="0" w:lastRowLastColumn="0"/>
+            </w:pPr>
+          </w:p>
+        </w:tc>
+        <w:tc>
+          <w:tcPr>
+            <w:tcW w:w="829" w:type="pct"/>
+          </w:tcPr>
+          <w:p>
+            <w:pPr>
+              <w:cnfStyle w:val="000000000000" w:firstRow="0" w:lastRow="0" w:firstColumn="0" w:lastColumn="0" w:oddVBand="0" w:evenVBand="0" w:oddHBand="0" w:evenHBand="0" w:firstRowFirstColumn="0" w:firstRowLastColumn="0" w:lastRowFirstColumn="0" w:lastRowLastColumn="0"/>
             </w:pPr>
             <w:r>
               <w:t xml:space="preserve">Snow:  90 – 376 ppb </w:t>
@@ -4988,7 +6274,7 @@
           </w:p>
           <w:p>
             <w:pPr>
-              <w:cnfStyle w:val="000000100000" w:firstRow="0" w:lastRow="0" w:firstColumn="0" w:lastColumn="0" w:oddVBand="0" w:evenVBand="0" w:oddHBand="1" w:evenHBand="0" w:firstRowFirstColumn="0" w:firstRowLastColumn="0" w:lastRowFirstColumn="0" w:lastRowLastColumn="0"/>
+              <w:cnfStyle w:val="000000000000" w:firstRow="0" w:lastRow="0" w:firstColumn="0" w:lastColumn="0" w:oddVBand="0" w:evenVBand="0" w:oddHBand="0" w:evenHBand="0" w:firstRowFirstColumn="0" w:firstRowLastColumn="0" w:lastRowFirstColumn="0" w:lastRowLastColumn="0"/>
             </w:pPr>
             <w:r>
               <w:t xml:space="preserve">Ice: 12.4 </w:t>
@@ -5044,7 +6330,7 @@
           </w:p>
           <w:p>
             <w:pPr>
-              <w:cnfStyle w:val="000000100000" w:firstRow="0" w:lastRow="0" w:firstColumn="0" w:lastColumn="0" w:oddVBand="0" w:evenVBand="0" w:oddHBand="1" w:evenHBand="0" w:firstRowFirstColumn="0" w:firstRowLastColumn="0" w:lastRowFirstColumn="0" w:lastRowLastColumn="0"/>
+              <w:cnfStyle w:val="000000000000" w:firstRow="0" w:lastRow="0" w:firstColumn="0" w:lastColumn="0" w:oddVBand="0" w:evenVBand="0" w:oddHBand="0" w:evenHBand="0" w:firstRowFirstColumn="0" w:firstRowLastColumn="0" w:lastRowFirstColumn="0" w:lastRowLastColumn="0"/>
             </w:pPr>
             <w:r>
               <w:t>Ice: 1.22-1.40 mg L</w:t>
@@ -5079,7 +6365,7 @@
           </w:p>
           <w:p>
             <w:pPr>
-              <w:cnfStyle w:val="000000100000" w:firstRow="0" w:lastRow="0" w:firstColumn="0" w:lastColumn="0" w:oddVBand="0" w:evenVBand="0" w:oddHBand="1" w:evenHBand="0" w:firstRowFirstColumn="0" w:firstRowLastColumn="0" w:lastRowFirstColumn="0" w:lastRowLastColumn="0"/>
+              <w:cnfStyle w:val="000000000000" w:firstRow="0" w:lastRow="0" w:firstColumn="0" w:lastColumn="0" w:oddVBand="0" w:evenVBand="0" w:oddHBand="0" w:evenHBand="0" w:firstRowFirstColumn="0" w:firstRowLastColumn="0" w:lastRowFirstColumn="0" w:lastRowLastColumn="0"/>
             </w:pPr>
             <w:r>
               <w:t>Snow: 0.38-0.76 mg L</w:t>
@@ -5114,9 +6400,10 @@
           </w:p>
           <w:p>
             <w:pPr>
-              <w:cnfStyle w:val="000000100000" w:firstRow="0" w:lastRow="0" w:firstColumn="0" w:lastColumn="0" w:oddVBand="0" w:evenVBand="0" w:oddHBand="1" w:evenHBand="0" w:firstRowFirstColumn="0" w:firstRowLastColumn="0" w:lastRowFirstColumn="0" w:lastRowLastColumn="0"/>
-            </w:pPr>
-            <w:r>
+              <w:cnfStyle w:val="000000000000" w:firstRow="0" w:lastRow="0" w:firstColumn="0" w:lastColumn="0" w:oddVBand="0" w:evenVBand="0" w:oddHBand="0" w:evenHBand="0" w:firstRowFirstColumn="0" w:firstRowLastColumn="0" w:lastRowFirstColumn="0" w:lastRowLastColumn="0"/>
+            </w:pPr>
+            <w:r>
+              <w:lastRenderedPageBreak/>
               <w:t>Snow: 0.02 mg L</w:t>
             </w:r>
             <w:r>
@@ -5146,10 +6433,9 @@
           </w:p>
           <w:p>
             <w:pPr>
-              <w:cnfStyle w:val="000000100000" w:firstRow="0" w:lastRow="0" w:firstColumn="0" w:lastColumn="0" w:oddVBand="0" w:evenVBand="0" w:oddHBand="1" w:evenHBand="0" w:firstRowFirstColumn="0" w:firstRowLastColumn="0" w:lastRowFirstColumn="0" w:lastRowLastColumn="0"/>
-            </w:pPr>
-            <w:r>
-              <w:lastRenderedPageBreak/>
+              <w:cnfStyle w:val="000000000000" w:firstRow="0" w:lastRow="0" w:firstColumn="0" w:lastColumn="0" w:oddVBand="0" w:evenVBand="0" w:oddHBand="0" w:evenHBand="0" w:firstRowFirstColumn="0" w:firstRowLastColumn="0" w:lastRowFirstColumn="0" w:lastRowLastColumn="0"/>
+            </w:pPr>
+            <w:r>
               <w:t>Ice: 0.02-0.05 mg L</w:t>
             </w:r>
             <w:r>
@@ -5174,7 +6460,7 @@
               <w:rPr>
                 <w:vertAlign w:val="superscript"/>
               </w:rPr>
-              <w:instrText>ADDIN CSL_CITATION {"citationItems":[{"id":"ITEM-1","itemData":{"DOI":"10.1038/s41467-020-20627-w","ISSN":"20411723","abstract":"Melting of the Greenland Ice Sheet is a leading cause of land-ice mass loss and cryosphere-attributed sea level rise. Blooms of pigmented glacier ice algae lower ice albedo and accelerate surface melting in the ice sheet’s southwest sector. Although glacier ice algae cause up to 13% of the surface melting in this region, the controls on bloom development remain poorly understood. Here we show a direct link between mineral phosphorus in surface ice and glacier ice algae biomass through the quantification of solid and fluid phase phosphorus reservoirs in surface habitats across the southwest ablation zone of the ice sheet. We demonstrate that nutrients from mineral dust likely drive glacier ice algal growth, and thereby identify mineral dust as a secondary control on ice sheet melting.","author":[{"dropping-particle":"","family":"McCutcheon","given":"Jenine","non-dropping-particle":"","parse-names":false,"suffix":""},{"dropping-particle":"","family":"Lutz","given":"Stefanie","non-dropping-particle":"","parse-names":false,"suffix":""},{"dropping-particle":"","family":"Williamson","given":"Christopher","non-dropping-particle":"","parse-names":false,"suffix":""},{"dropping-particle":"","family":"Cook","given":"Joseph M.","non-dropping-particle":"","parse-names":false,"suffix":""},{"dropping-particle":"","family":"Tedstone","given":"Andrew J.","non-dropping-particle":"","parse-names":false,"suffix":""},{"dropping-particle":"","family":"Vanderstraeten","given":"Aubry","non-dropping-particle":"","parse-names":false,"suffix":""},{"dropping-particle":"","family":"Wilson","given":"Siobhan A.","non-dropping-particle":"","parse-names":false,"suffix":""},{"dropping-particle":"","family":"Stockdale","given":"Anthony","non-dropping-particle":"","parse-names":false,"suffix":""},{"dropping-particle":"","family":"Bonneville","given":"Steeve","non-dropping-particle":"","parse-names":false,"suffix":""},{"dropping-particle":"","family":"Anesio","given":"Alexandre M.","non-dropping-particle":"","parse-names":false,"suffix":""},{"dropping-particle":"","family":"Yallop","given":"Marian L.","non-dropping-particle":"","parse-names":false,"suffix":""},{"dropping-particle":"","family":"McQuaid","given":"James B.","non-dropping-particle":"","parse-names":false,"suffix":""},{"dropping-particle":"","family":"Tranter","given":"Martyn","non-dropping-particle":"","parse-names":false,"suffix":""},{"dropping-particle":"","family":"Benning","given":"Liane G.","non-dropping-particle":"","parse-names":false,"suffix":""}],"container-title":"Nature Communications","id":"ITEM-1","issue":"1","issued":{"date-parts":[["2021"]]},"page":"1-11","publisher":"Springer US","title":"Mineral phosphorus drives glacier algal blooms on the Greenland Ice Sheet","type":"article-journal","volume":"12"},"uris":["http://www.mendeley.com/documents/?uuid=48651b01-3d31-491b-b6cf-d3e21f9151d9"]}],"mendeley":{"formattedCitation":"(McCutcheon et al., 2021)","plainTextFormattedCitation":"(McCutcheon et al., 2021)"},"properties":{"noteIndex":0},"schema":"https://github.com/citation-style-language/schema/raw/master/csl-citation.json"}</w:instrText>
+              <w:instrText>ADDIN CSL_CITATION {"citationItems":[{"id":"ITEM-1","itemData":{"DOI":"10.1038/s41467-020-20627-w","ISSN":"20411723","abstract":"Melting of the Greenland Ice Sheet is a leading cause of land-ice mass loss and cryosphere-attributed sea level rise. Blooms of pigmented glacier ice algae lower ice albedo and accelerate surface melting in the ice sheet’s southwest sector. Although glacier ice algae cause up to 13% of the surface melting in this region, the controls on bloom development remain poorly understood. Here we show a direct link between mineral phosphorus in surface ice and glacier ice algae biomass through the quantification of solid and fluid phase phosphorus reservoirs in surface habitats across the southwest ablation zone of the ice sheet. We demonstrate that nutrients from mineral dust likely drive glacier ice algal growth, and thereby identify mineral dust as a secondary control on ice sheet melting.","author":[{"dropping-particle":"","family":"McCutcheon","given":"Jenine","non-dropping-particle":"","parse-names":false,"suffix":""},{"dropping-particle":"","family":"Lutz","given":"Stefanie","non-dropping-particle":"","parse-names":false,"suffix":""},{"dropping-particle":"","family":"Williamson","given":"Christopher","non-dropping-particle":"","parse-names":false,"suffix":""},{"dropping-particle":"","family":"Cook","given":"Joseph M.","non-dropping-particle":"","parse-names":false,"suffix":""},{"dropping-particle":"","family":"Tedstone","given":"Andrew J.","non-dropping-particle":"","parse-names":false,"suffix":""},{"dropping-particle":"","family":"Vanderstraeten","given":"Aubry","non-dropping-particle":"","parse-names":false,"suffix":""},{"dropping-particle":"","family":"Wilson","given":"Siobhan A.","non-dropping-particle":"","parse-names":false,"suffix":""},{"dropping-particle":"","family":"Stockdale","given":"Anthony","non-dropping-particle":"","parse-names":false,"suffix":""},{"dropping-particle":"","family":"Bonneville","given":"Steeve","non-dropping-particle":"","parse-names":false,"suffix":""},{"dropping-particle":"","family":"Anesio","given":"Alexandre M.","non-dropping-particle":"","parse-names":false,"suffix":""},{"dropping-particle":"","family":"Yallop","given":"Marian L.","non-dropping-particle":"","parse-names":false,"suffix":""},{"dropping-particle":"","family":"McQuaid","given":"James B.","non-dropping-particle":"","parse-names":false,"suffix":""},{"dropping-particle":"","family":"Tranter","given":"Martyn","non-dropping-particle":"","parse-names":false,"suffix":""},{"dropping-particle":"","family":"Benning","given":"Liane G.","non-dropping-particle":"","parse-names":false,"suffix":""}],"container-title":"Nature Communications","id":"ITEM-1","issue":"1","issued":{"date-parts":[["2021"]]},"page":"1-11","publisher":"Springer US","title":"Mineral phosphorus drives glacier algal blooms on the Greenland Ice Sheet","type":"article-journal","volume":"12"},"uris":["http://www.mendeley.com/documents/?uuid=48651b01-3d31-491b-b6cf-d3e21f9151d9"]}],"mendeley":{"formattedCitation":"(McCutcheon et al., 2021)","plainTextFormattedCitation":"(McCutcheon et al., 2021)","previouslyFormattedCitation":"(McCutcheon et al., 2021)"},"properties":{"noteIndex":0},"schema":"https://github.com/citation-style-language/schema/raw/master/csl-citation.json"}</w:instrText>
             </w:r>
             <w:r>
               <w:rPr>
@@ -5197,17 +6483,17 @@
           </w:p>
           <w:p>
             <w:pPr>
-              <w:cnfStyle w:val="000000100000" w:firstRow="0" w:lastRow="0" w:firstColumn="0" w:lastColumn="0" w:oddVBand="0" w:evenVBand="0" w:oddHBand="1" w:evenHBand="0" w:firstRowFirstColumn="0" w:firstRowLastColumn="0" w:lastRowFirstColumn="0" w:lastRowLastColumn="0"/>
-            </w:pPr>
-          </w:p>
-        </w:tc>
-        <w:tc>
-          <w:tcPr>
-            <w:tcW w:w="5686" w:type="dxa"/>
-          </w:tcPr>
-          <w:p>
-            <w:pPr>
-              <w:cnfStyle w:val="000000100000" w:firstRow="0" w:lastRow="0" w:firstColumn="0" w:lastColumn="0" w:oddVBand="0" w:evenVBand="0" w:oddHBand="1" w:evenHBand="0" w:firstRowFirstColumn="0" w:firstRowLastColumn="0" w:lastRowFirstColumn="0" w:lastRowLastColumn="0"/>
+              <w:cnfStyle w:val="000000000000" w:firstRow="0" w:lastRow="0" w:firstColumn="0" w:lastColumn="0" w:oddVBand="0" w:evenVBand="0" w:oddHBand="0" w:evenHBand="0" w:firstRowFirstColumn="0" w:firstRowLastColumn="0" w:lastRowFirstColumn="0" w:lastRowLastColumn="0"/>
+            </w:pPr>
+          </w:p>
+        </w:tc>
+        <w:tc>
+          <w:tcPr>
+            <w:tcW w:w="1359" w:type="pct"/>
+          </w:tcPr>
+          <w:p>
+            <w:pPr>
+              <w:cnfStyle w:val="000000000000" w:firstRow="0" w:lastRow="0" w:firstColumn="0" w:lastColumn="0" w:oddVBand="0" w:evenVBand="0" w:oddHBand="0" w:evenHBand="0" w:firstRowFirstColumn="0" w:firstRowLastColumn="0" w:lastRowFirstColumn="0" w:lastRowLastColumn="0"/>
             </w:pPr>
             <w:r>
               <w:lastRenderedPageBreak/>
@@ -5235,6 +6521,7 @@
         </w:tc>
       </w:tr>
     </w:tbl>
+    <w:p/>
     <w:p/>
     <w:p/>
     <w:p>
@@ -5285,7 +6572,7 @@
           <w:noProof/>
           <w:lang w:val="en-US"/>
         </w:rPr>
-        <w:t xml:space="preserve">Fellman, J. B., Hood, E., Raymond, P. A., Stubbins, A., and Spencer, R. G. M. (2015). Spatial Variation in the Origin of Dissolved Organic Carbon in Snow on the Juneau Icefield, Southeast Alaska. </w:t>
+        <w:t xml:space="preserve">Dominguez, D. C. (2004). Calcium signalling in bacteria. </w:t>
       </w:r>
       <w:r>
         <w:rPr>
@@ -5295,7 +6582,7 @@
           <w:noProof/>
           <w:lang w:val="en-US"/>
         </w:rPr>
-        <w:t>Environ. Sci. Technol.</w:t>
+        <w:t>Mol. Microbiol.</w:t>
       </w:r>
       <w:r>
         <w:rPr>
@@ -5303,7 +6590,7 @@
           <w:noProof/>
           <w:lang w:val="en-US"/>
         </w:rPr>
-        <w:t xml:space="preserve"> 49, 11492–11499. doi:10.1021/acs.est.5b02685.</w:t>
+        <w:t xml:space="preserve"> 54, 291–297. doi:10.1111/j.1365-2958.2004.04276.x.</w:t>
       </w:r>
     </w:p>
     <w:p>
@@ -5325,7 +6612,7 @@
           <w:noProof/>
           <w:lang w:val="en-US"/>
         </w:rPr>
-        <w:t xml:space="preserve">Gao, T., Kang, S., Zhang, Y., Sprenger, M., Wang, F., Du, W., et al. (2020). Characterization, sources and transport of dissolved organic carbon and nitrogen from a glacier in the Central Asia. </w:t>
+        <w:t xml:space="preserve">Fellman, J. B., Hood, E., Raymond, P. A., Stubbins, A., and Spencer, R. G. M. (2015). Spatial Variation in the Origin of Dissolved Organic Carbon in Snow on the Juneau Icefield, Southeast Alaska. </w:t>
       </w:r>
       <w:r>
         <w:rPr>
@@ -5335,7 +6622,7 @@
           <w:noProof/>
           <w:lang w:val="en-US"/>
         </w:rPr>
-        <w:t>Sci. Total Environ.</w:t>
+        <w:t>Environ. Sci. Technol.</w:t>
       </w:r>
       <w:r>
         <w:rPr>
@@ -5343,7 +6630,7 @@
           <w:noProof/>
           <w:lang w:val="en-US"/>
         </w:rPr>
-        <w:t xml:space="preserve"> 725, 138346. doi:10.1016/j.scitotenv.2020.138346.</w:t>
+        <w:t xml:space="preserve"> 49, 11492–11499. doi:10.1021/acs.est.5b02685.</w:t>
       </w:r>
     </w:p>
     <w:p>
@@ -5365,7 +6652,7 @@
           <w:noProof/>
           <w:lang w:val="en-US"/>
         </w:rPr>
-        <w:t xml:space="preserve">Grzesiak, J., Górniak, D., Świątecki, A., Aleksandrzak-Piekarczyk, T., Szatraj, K., and Zdanowski, M. K. (2015). Microbial community development on the surface of Hans and Werenskiold Glaciers (Svalbard, Arctic): a comparison. </w:t>
+        <w:t xml:space="preserve">Gao, T., Kang, S., Zhang, Y., Sprenger, M., Wang, F., Du, W., et al. (2020). Characterization, sources and transport of dissolved organic carbon and nitrogen from a glacier in the Central Asia. </w:t>
       </w:r>
       <w:r>
         <w:rPr>
@@ -5375,7 +6662,7 @@
           <w:noProof/>
           <w:lang w:val="en-US"/>
         </w:rPr>
-        <w:t>Extremophiles</w:t>
+        <w:t>Sci. Total Environ.</w:t>
       </w:r>
       <w:r>
         <w:rPr>
@@ -5383,7 +6670,7 @@
           <w:noProof/>
           <w:lang w:val="en-US"/>
         </w:rPr>
-        <w:t xml:space="preserve"> 19, 885–897. doi:10.1007/s00792-015-0764-z.</w:t>
+        <w:t xml:space="preserve"> 725, 138346. doi:10.1016/j.scitotenv.2020.138346.</w:t>
       </w:r>
     </w:p>
     <w:p>
@@ -5405,7 +6692,7 @@
           <w:noProof/>
           <w:lang w:val="en-US"/>
         </w:rPr>
-        <w:t xml:space="preserve">Hell, K., Edwards, A., Zarsky, J., Podmirseg, S. M., Girdwood, S., Pachebat, J. A., et al. (2013). The dynamic bacterial communities of a melting High Arctic glacier snowpack. </w:t>
+        <w:t xml:space="preserve">Grzesiak, J., Górniak, D., Świątecki, A., Aleksandrzak-Piekarczyk, T., Szatraj, K., and Zdanowski, M. K. (2015). Microbial community development on the surface of Hans and Werenskiold Glaciers (Svalbard, Arctic): a comparison. </w:t>
       </w:r>
       <w:r>
         <w:rPr>
@@ -5415,7 +6702,7 @@
           <w:noProof/>
           <w:lang w:val="en-US"/>
         </w:rPr>
-        <w:t>ISME J.</w:t>
+        <w:t>Extremophiles</w:t>
       </w:r>
       <w:r>
         <w:rPr>
@@ -5423,7 +6710,7 @@
           <w:noProof/>
           <w:lang w:val="en-US"/>
         </w:rPr>
-        <w:t xml:space="preserve"> 7, 1814–1826. doi:10.1038/ismej.2013.51.</w:t>
+        <w:t xml:space="preserve"> 19, 885–897. doi:10.1007/s00792-015-0764-z.</w:t>
       </w:r>
     </w:p>
     <w:p>
@@ -5445,7 +6732,7 @@
           <w:noProof/>
           <w:lang w:val="en-US"/>
         </w:rPr>
-        <w:t xml:space="preserve">Heppell, C., Louise Heathwaite, A., Binley, A., Byrne, P., Ullah, S., Lansdown, K., et al. (2014). Interpreting spatial patterns in redox and coupled water-nitrogen fluxes in the streambed of a gaining river reach. </w:t>
+        <w:t xml:space="preserve">Gu, Z., Liu, K., Pedersen, M. W., Wang, F., Chen, Y., Zeng, C., et al. (2020). Community assembly processes underlying the temporal dynamics of glacial stream and lake bacterial communities. </w:t>
       </w:r>
       <w:r>
         <w:rPr>
@@ -5455,7 +6742,7 @@
           <w:noProof/>
           <w:lang w:val="en-US"/>
         </w:rPr>
-        <w:t>Biogeochemistry</w:t>
+        <w:t>Sci. Total Environ.</w:t>
       </w:r>
       <w:r>
         <w:rPr>
@@ -5463,7 +6750,7 @@
           <w:noProof/>
           <w:lang w:val="en-US"/>
         </w:rPr>
-        <w:t xml:space="preserve"> 117, 491–509. doi:10.1007/s10533-013-9895-4.</w:t>
+        <w:t>, 143178. doi:10.1016/j.scitotenv.2020.143178.</w:t>
       </w:r>
     </w:p>
     <w:p>
@@ -5485,7 +6772,7 @@
           <w:noProof/>
           <w:lang w:val="en-US"/>
         </w:rPr>
-        <w:t xml:space="preserve">Hood, E., Battin, T. J., Fellman, J., O’neel, S., and Spencer, R. G. M. (2015). Storage and release of organic carbon from glaciers and ice sheets. </w:t>
+        <w:t xml:space="preserve">Hell, K., Edwards, A., Zarsky, J., Podmirseg, S. M., Girdwood, S., Pachebat, J. A., et al. (2013). The dynamic bacterial communities of a melting High Arctic glacier snowpack. </w:t>
       </w:r>
       <w:r>
         <w:rPr>
@@ -5495,7 +6782,7 @@
           <w:noProof/>
           <w:lang w:val="en-US"/>
         </w:rPr>
-        <w:t>Nat. Geosci.</w:t>
+        <w:t>ISME J.</w:t>
       </w:r>
       <w:r>
         <w:rPr>
@@ -5503,7 +6790,7 @@
           <w:noProof/>
           <w:lang w:val="en-US"/>
         </w:rPr>
-        <w:t xml:space="preserve"> 8, 91–96. doi:10.1038/ngeo2331.</w:t>
+        <w:t xml:space="preserve"> 7, 1814–1826. doi:10.1038/ismej.2013.51.</w:t>
       </w:r>
     </w:p>
     <w:p>
@@ -5525,7 +6812,7 @@
           <w:noProof/>
           <w:lang w:val="en-US"/>
         </w:rPr>
-        <w:t xml:space="preserve">Lutz, S., Anesio, A. M., Raiswell, R., Edwards, A., Newton, R. J., Gill, F., et al. (2016). The biogeography of red snow microbiomes and their role in melting arctic glaciers. </w:t>
+        <w:t xml:space="preserve">Heppell, C., Louise Heathwaite, A., Binley, A., Byrne, P., Ullah, S., Lansdown, K., et al. (2014). Interpreting spatial patterns in redox and coupled water-nitrogen fluxes in the streambed of a gaining river reach. </w:t>
       </w:r>
       <w:r>
         <w:rPr>
@@ -5535,7 +6822,7 @@
           <w:noProof/>
           <w:lang w:val="en-US"/>
         </w:rPr>
-        <w:t>Nat. Commun.</w:t>
+        <w:t>Biogeochemistry</w:t>
       </w:r>
       <w:r>
         <w:rPr>
@@ -5543,7 +6830,7 @@
           <w:noProof/>
           <w:lang w:val="en-US"/>
         </w:rPr>
-        <w:t xml:space="preserve"> 7, 1–9. doi:10.1038/ncomms11968.</w:t>
+        <w:t xml:space="preserve"> 117, 491–509. doi:10.1007/s10533-013-9895-4.</w:t>
       </w:r>
     </w:p>
     <w:p>
@@ -5565,7 +6852,7 @@
           <w:noProof/>
           <w:lang w:val="en-US"/>
         </w:rPr>
-        <w:t xml:space="preserve">McCutcheon, J., Lutz, S., Williamson, C., Cook, J. M., Tedstone, A. J., Vanderstraeten, A., et al. (2021). Mineral phosphorus drives glacier algal blooms on the Greenland Ice Sheet. </w:t>
+        <w:t xml:space="preserve">Holland, A. T., Williamson, C. J., Sgouridis, F., Tedstone, A. J., McCutcheon, J., Cook, J. M., et al. (2019). Dissolved organic nutrients dominate melting surface ice of the Dark Zone (Greenland Ice Sheet). </w:t>
       </w:r>
       <w:r>
         <w:rPr>
@@ -5575,7 +6862,7 @@
           <w:noProof/>
           <w:lang w:val="en-US"/>
         </w:rPr>
-        <w:t>Nat. Commun.</w:t>
+        <w:t>Biogeosciences</w:t>
       </w:r>
       <w:r>
         <w:rPr>
@@ -5583,7 +6870,7 @@
           <w:noProof/>
           <w:lang w:val="en-US"/>
         </w:rPr>
-        <w:t xml:space="preserve"> 12, 1–11. doi:10.1038/s41467-020-20627-w.</w:t>
+        <w:t xml:space="preserve"> 16, 3283–3296. doi:10.5194/bg-16-3283-2019.</w:t>
       </w:r>
     </w:p>
     <w:p>
@@ -5605,7 +6892,7 @@
           <w:noProof/>
           <w:lang w:val="en-US"/>
         </w:rPr>
-        <w:t xml:space="preserve">Musilova, M., Tranter, M., Wadham, J., Telling, J., Tedstone, A., and Anesio, A. M. (2017). Microbially driven export of labile organic carbon from the Greenland ice sheet. </w:t>
+        <w:t xml:space="preserve">Hood, E., Battin, T. J., Fellman, J., O’neel, S., and Spencer, R. G. M. (2015). Storage and release of organic carbon from glaciers and ice sheets. </w:t>
       </w:r>
       <w:r>
         <w:rPr>
@@ -5623,7 +6910,7 @@
           <w:noProof/>
           <w:lang w:val="en-US"/>
         </w:rPr>
-        <w:t xml:space="preserve"> 10, 360–365. doi:10.1038/ngeo2920.</w:t>
+        <w:t xml:space="preserve"> 8, 91–96. doi:10.1038/ngeo2331.</w:t>
       </w:r>
     </w:p>
     <w:p>
@@ -5645,7 +6932,8 @@
           <w:noProof/>
           <w:lang w:val="en-US"/>
         </w:rPr>
-        <w:t xml:space="preserve">Samui, G., Antony, R., and Thamban, M. (2020). Fate of Dissolved Organic Carbon in Antarctic Surface Environments During Summer. </w:t>
+        <w:lastRenderedPageBreak/>
+        <w:t xml:space="preserve">Lutz, S., Anesio, A. M., Raiswell, R., Edwards, A., Newton, R. J., Gill, F., et al. (2016). The biogeography of red snow microbiomes and their role in melting arctic glaciers. </w:t>
       </w:r>
       <w:r>
         <w:rPr>
@@ -5655,7 +6943,7 @@
           <w:noProof/>
           <w:lang w:val="en-US"/>
         </w:rPr>
-        <w:t>J. Geophys. Res. Biogeosciences</w:t>
+        <w:t>Nat. Commun.</w:t>
       </w:r>
       <w:r>
         <w:rPr>
@@ -5663,7 +6951,7 @@
           <w:noProof/>
           <w:lang w:val="en-US"/>
         </w:rPr>
-        <w:t xml:space="preserve"> 125, 1–14. doi:10.1029/2020jg005958.</w:t>
+        <w:t xml:space="preserve"> 7, 1–9. doi:10.1038/ncomms11968.</w:t>
       </w:r>
     </w:p>
     <w:p>
@@ -5676,6 +6964,7 @@
         <w:rPr>
           <w:rFonts w:ascii="Calibri" w:hAnsi="Calibri" w:cs="Calibri"/>
           <w:noProof/>
+          <w:lang w:val="en-US"/>
         </w:rPr>
       </w:pPr>
       <w:r>
@@ -5684,7 +6973,7 @@
           <w:noProof/>
           <w:lang w:val="en-US"/>
         </w:rPr>
-        <w:t xml:space="preserve">Telling, J., Anesio, A. M., Tranter, M., Fountain, A. G., Nylen, T., Hawkings, J., et al. (2014). Spring thaw ionic pulses boost nutrient availability and microbial growth in entombed Antarctic Dry Valley cryoconite holes. </w:t>
+        <w:t xml:space="preserve">McCutcheon, J., Lutz, S., Williamson, C., Cook, J. M., Tedstone, A. J., Vanderstraeten, A., et al. (2021). Mineral phosphorus drives glacier algal blooms on the Greenland Ice Sheet. </w:t>
       </w:r>
       <w:r>
         <w:rPr>
@@ -5694,7 +6983,7 @@
           <w:noProof/>
           <w:lang w:val="en-US"/>
         </w:rPr>
-        <w:t>Front. Microbiol.</w:t>
+        <w:t>Nat. Commun.</w:t>
       </w:r>
       <w:r>
         <w:rPr>
@@ -5702,7 +6991,7 @@
           <w:noProof/>
           <w:lang w:val="en-US"/>
         </w:rPr>
-        <w:t xml:space="preserve"> 5, 1–15. doi:10.3389/fmicb.2014.00694.</w:t>
+        <w:t xml:space="preserve"> 12, 1–11. doi:10.1038/s41467-020-20627-w.</w:t>
       </w:r>
     </w:p>
     <w:p>
@@ -5711,6 +7000,206 @@
         <w:autoSpaceDE w:val="0"/>
         <w:autoSpaceDN w:val="0"/>
         <w:adjustRightInd w:val="0"/>
+        <w:ind w:left="480" w:hanging="480"/>
+        <w:rPr>
+          <w:rFonts w:ascii="Calibri" w:hAnsi="Calibri" w:cs="Calibri"/>
+          <w:noProof/>
+          <w:lang w:val="en-US"/>
+        </w:rPr>
+      </w:pPr>
+      <w:r>
+        <w:rPr>
+          <w:rFonts w:ascii="Calibri" w:hAnsi="Calibri" w:cs="Calibri"/>
+          <w:noProof/>
+          <w:lang w:val="en-US"/>
+        </w:rPr>
+        <w:t xml:space="preserve">Mueller, D. R., and Pollard, W. H. (2004). Gradient analysis of cryoconite ecosystems from two polar glaciers. </w:t>
+      </w:r>
+      <w:r>
+        <w:rPr>
+          <w:rFonts w:ascii="Calibri" w:hAnsi="Calibri" w:cs="Calibri"/>
+          <w:i/>
+          <w:iCs/>
+          <w:noProof/>
+          <w:lang w:val="en-US"/>
+        </w:rPr>
+        <w:t>Polar Biol.</w:t>
+      </w:r>
+      <w:r>
+        <w:rPr>
+          <w:rFonts w:ascii="Calibri" w:hAnsi="Calibri" w:cs="Calibri"/>
+          <w:noProof/>
+          <w:lang w:val="en-US"/>
+        </w:rPr>
+        <w:t xml:space="preserve"> 27, 66–74. doi:10.1007/s00300-003-0580-2.</w:t>
+      </w:r>
+    </w:p>
+    <w:p>
+      <w:pPr>
+        <w:widowControl w:val="0"/>
+        <w:autoSpaceDE w:val="0"/>
+        <w:autoSpaceDN w:val="0"/>
+        <w:adjustRightInd w:val="0"/>
+        <w:ind w:left="480" w:hanging="480"/>
+        <w:rPr>
+          <w:rFonts w:ascii="Calibri" w:hAnsi="Calibri" w:cs="Calibri"/>
+          <w:noProof/>
+          <w:lang w:val="en-US"/>
+        </w:rPr>
+      </w:pPr>
+      <w:r>
+        <w:rPr>
+          <w:rFonts w:ascii="Calibri" w:hAnsi="Calibri" w:cs="Calibri"/>
+          <w:noProof/>
+          <w:lang w:val="en-US"/>
+        </w:rPr>
+        <w:t xml:space="preserve">Musilova, M., Tranter, M., Wadham, J., Telling, J., Tedstone, A., and Anesio, A. M. (2017). Microbially driven export of labile organic carbon from the Greenland ice sheet. </w:t>
+      </w:r>
+      <w:r>
+        <w:rPr>
+          <w:rFonts w:ascii="Calibri" w:hAnsi="Calibri" w:cs="Calibri"/>
+          <w:i/>
+          <w:iCs/>
+          <w:noProof/>
+          <w:lang w:val="en-US"/>
+        </w:rPr>
+        <w:t>Nat. Geosci.</w:t>
+      </w:r>
+      <w:r>
+        <w:rPr>
+          <w:rFonts w:ascii="Calibri" w:hAnsi="Calibri" w:cs="Calibri"/>
+          <w:noProof/>
+          <w:lang w:val="en-US"/>
+        </w:rPr>
+        <w:t xml:space="preserve"> 10, 360–365. doi:10.1038/ngeo2920.</w:t>
+      </w:r>
+    </w:p>
+    <w:p>
+      <w:pPr>
+        <w:widowControl w:val="0"/>
+        <w:autoSpaceDE w:val="0"/>
+        <w:autoSpaceDN w:val="0"/>
+        <w:adjustRightInd w:val="0"/>
+        <w:ind w:left="480" w:hanging="480"/>
+        <w:rPr>
+          <w:rFonts w:ascii="Calibri" w:hAnsi="Calibri" w:cs="Calibri"/>
+          <w:noProof/>
+          <w:lang w:val="en-US"/>
+        </w:rPr>
+      </w:pPr>
+      <w:r>
+        <w:rPr>
+          <w:rFonts w:ascii="Calibri" w:hAnsi="Calibri" w:cs="Calibri"/>
+          <w:noProof/>
+          <w:lang w:val="en-US"/>
+        </w:rPr>
+        <w:t xml:space="preserve">Muyzer, G., and Stams, A. J. M. (2008). The ecology and biotechnology of sulphate-reducing bacteria. </w:t>
+      </w:r>
+      <w:r>
+        <w:rPr>
+          <w:rFonts w:ascii="Calibri" w:hAnsi="Calibri" w:cs="Calibri"/>
+          <w:i/>
+          <w:iCs/>
+          <w:noProof/>
+          <w:lang w:val="en-US"/>
+        </w:rPr>
+        <w:t>Nat. Rev. Microbiol.</w:t>
+      </w:r>
+      <w:r>
+        <w:rPr>
+          <w:rFonts w:ascii="Calibri" w:hAnsi="Calibri" w:cs="Calibri"/>
+          <w:noProof/>
+          <w:lang w:val="en-US"/>
+        </w:rPr>
+        <w:t xml:space="preserve"> 6, 441–454. doi:10.1038/nrmicro1892.</w:t>
+      </w:r>
+    </w:p>
+    <w:p>
+      <w:pPr>
+        <w:widowControl w:val="0"/>
+        <w:autoSpaceDE w:val="0"/>
+        <w:autoSpaceDN w:val="0"/>
+        <w:adjustRightInd w:val="0"/>
+        <w:ind w:left="480" w:hanging="480"/>
+        <w:rPr>
+          <w:rFonts w:ascii="Calibri" w:hAnsi="Calibri" w:cs="Calibri"/>
+          <w:noProof/>
+          <w:lang w:val="en-US"/>
+        </w:rPr>
+      </w:pPr>
+      <w:r>
+        <w:rPr>
+          <w:rFonts w:ascii="Calibri" w:hAnsi="Calibri" w:cs="Calibri"/>
+          <w:noProof/>
+          <w:lang w:val="en-US"/>
+        </w:rPr>
+        <w:t xml:space="preserve">Samui, G., Antony, R., and Thamban, M. (2020). Fate of Dissolved Organic Carbon in Antarctic Surface Environments During Summer. </w:t>
+      </w:r>
+      <w:r>
+        <w:rPr>
+          <w:rFonts w:ascii="Calibri" w:hAnsi="Calibri" w:cs="Calibri"/>
+          <w:i/>
+          <w:iCs/>
+          <w:noProof/>
+          <w:lang w:val="en-US"/>
+        </w:rPr>
+        <w:t>J. Geophys. Res. Biogeosciences</w:t>
+      </w:r>
+      <w:r>
+        <w:rPr>
+          <w:rFonts w:ascii="Calibri" w:hAnsi="Calibri" w:cs="Calibri"/>
+          <w:noProof/>
+          <w:lang w:val="en-US"/>
+        </w:rPr>
+        <w:t xml:space="preserve"> 125, 1–14. doi:10.1029/2020jg005958.</w:t>
+      </w:r>
+    </w:p>
+    <w:p>
+      <w:pPr>
+        <w:widowControl w:val="0"/>
+        <w:autoSpaceDE w:val="0"/>
+        <w:autoSpaceDN w:val="0"/>
+        <w:adjustRightInd w:val="0"/>
+        <w:ind w:left="480" w:hanging="480"/>
+        <w:rPr>
+          <w:rFonts w:ascii="Calibri" w:hAnsi="Calibri" w:cs="Calibri"/>
+          <w:noProof/>
+        </w:rPr>
+      </w:pPr>
+      <w:r>
+        <w:rPr>
+          <w:rFonts w:ascii="Calibri" w:hAnsi="Calibri" w:cs="Calibri"/>
+          <w:noProof/>
+          <w:lang w:val="en-US"/>
+        </w:rPr>
+        <w:t xml:space="preserve">Telling, J., Anesio, A. M., Tranter, M., Fountain, A. G., Nylen, T., Hawkings, J., et al. (2014). Spring thaw ionic pulses boost nutrient availability and microbial growth in entombed Antarctic Dry Valley cryoconite holes. </w:t>
+      </w:r>
+      <w:r>
+        <w:rPr>
+          <w:rFonts w:ascii="Calibri" w:hAnsi="Calibri" w:cs="Calibri"/>
+          <w:i/>
+          <w:iCs/>
+          <w:noProof/>
+          <w:lang w:val="en-US"/>
+        </w:rPr>
+        <w:t>Front. Microbiol.</w:t>
+      </w:r>
+      <w:r>
+        <w:rPr>
+          <w:rFonts w:ascii="Calibri" w:hAnsi="Calibri" w:cs="Calibri"/>
+          <w:noProof/>
+          <w:lang w:val="en-US"/>
+        </w:rPr>
+        <w:t xml:space="preserve"> 5, 1–15. doi:10.3389/fmicb.2014.00694.</w:t>
+      </w:r>
+    </w:p>
+    <w:p>
+      <w:pPr>
+        <w:widowControl w:val="0"/>
+        <w:autoSpaceDE w:val="0"/>
+        <w:autoSpaceDN w:val="0"/>
+        <w:adjustRightInd w:val="0"/>
+        <w:ind w:left="480" w:hanging="480"/>
       </w:pPr>
       <w:r>
         <w:fldChar w:fldCharType="end"/>
@@ -6976,7 +8465,7 @@
 </file>
 
 <file path=customXml/itemProps1.xml><?xml version="1.0" encoding="utf-8"?>
-<ds:datastoreItem xmlns:ds="http://schemas.openxmlformats.org/officeDocument/2006/customXml" ds:itemID="{A8C31E5E-53C7-4C44-ACFF-9D16C22E4DC7}">
+<ds:datastoreItem xmlns:ds="http://schemas.openxmlformats.org/officeDocument/2006/customXml" ds:itemID="{376438AA-0611-2542-B056-3CB423ED9996}">
   <ds:schemaRefs>
     <ds:schemaRef ds:uri="http://schemas.openxmlformats.org/officeDocument/2006/bibliography"/>
   </ds:schemaRefs>

</xml_diff>